<commit_message>
Tema 2, ch. 3: write chapter into rad.md, add two Mermaid figures
- rad.md \u00a73: grant tables as a data model, two-stage check, OR-composition
  (live probe_wide/probe_narrow measurement), static vs dynamic privileges,
  SUPER's decomposition, partial_revokes + mandatory_roles as written outside
  the model, roles as locked mysql.user rows over mysql.role_edges, live
  SET ROLE / CURRENT_ROLE() activation semantics, RBAC0/1/2 verdict.
- figures/03-privilegije-01-provera-ili.png: OR-composition check flow (Mermaid)
- figures/03-privilegije-02-role-graf.png: doc_bar role graph (Mermaid)
- No new references.bib entries: reuses mysql84refman, sandhu1996, incits2004,
  saltzerschroeder1975.
- Ticket 16 resolved, map.md decision entry added, docx re-exported.
</commit_message>
<xml_diff>
--- a/Tema 2. - Kontrola pristupa i sigurnosni modeli u MySQL bazi podataka/rad.docx
+++ b/Tema 2. - Kontrola pristupa i sigurnosni modeli u MySQL bazi podataka/rad.docx
@@ -530,7 +530,7 @@
       </w:r>
     </w:p>
     <w:bookmarkEnd w:id="9"/>
-    <w:bookmarkStart w:id="24" w:name="klasični-modeli-kontrole-pristupa"/>
+    <w:bookmarkStart w:id="13" w:name="klasični-modeli-kontrole-pristupa"/>
     <w:p>
       <w:pPr>
         <w:pStyle w:val="Heading1"/>
@@ -1463,8 +1463,1853 @@
         <w:t xml:space="preserve">priznati kao potpuno odsutni iz same baze podataka.</w:t>
       </w:r>
     </w:p>
-    <w:bookmarkStart w:id="23" w:name="refs"/>
-    <w:bookmarkStart w:id="13" w:name="ref-ramakrishnan2003"/>
+    <w:bookmarkEnd w:id="13"/>
+    <w:bookmarkStart w:id="31" w:name="sistem-privilegija-i-uloga-u-mysql-u"/>
+    <w:p>
+      <w:pPr>
+        <w:pStyle w:val="Heading1"/>
+      </w:pPr>
+      <w:r>
+        <w:t xml:space="preserve">3. Sistem privilegija i uloga u MySQL-u</w:t>
+      </w:r>
+    </w:p>
+    <w:p>
+      <w:pPr>
+        <w:pStyle w:val="FirstParagraph"/>
+      </w:pPr>
+      <w:r>
+        <w:t xml:space="preserve">MySQL čuva svaku privilegiju kao običan red u jednoj od deset tabela dodele prava u sistemskoj bazi</w:t>
+      </w:r>
+      <w:r>
+        <w:t xml:space="preserve"> </w:t>
+      </w:r>
+      <w:r>
+        <w:rPr>
+          <w:rStyle w:val="VerbatimChar"/>
+        </w:rPr>
+        <w:t xml:space="preserve">mysql</w:t>
+      </w:r>
+      <w:r>
+        <w:t xml:space="preserve"> </w:t>
+      </w:r>
+      <w:r>
+        <w:t xml:space="preserve">[2]</w:t>
+      </w:r>
+      <w:r>
+        <w:t xml:space="preserve">. Šest od tih deset tabela kodira nivo na kome privilegija važi, i taj nivo se</w:t>
+      </w:r>
+      <w:r>
+        <w:t xml:space="preserve"> </w:t>
+      </w:r>
+      <w:r>
+        <w:t xml:space="preserve">prepoznaje direktno iz naziva kolone koja identifikuje objekat:</w:t>
+      </w:r>
+      <w:r>
+        <w:t xml:space="preserve"> </w:t>
+      </w:r>
+      <w:r>
+        <w:rPr>
+          <w:rStyle w:val="VerbatimChar"/>
+        </w:rPr>
+        <w:t xml:space="preserve">mysql.user</w:t>
+      </w:r>
+      <w:r>
+        <w:t xml:space="preserve"> </w:t>
+      </w:r>
+      <w:r>
+        <w:t xml:space="preserve">i</w:t>
+      </w:r>
+      <w:r>
+        <w:t xml:space="preserve"> </w:t>
+      </w:r>
+      <w:r>
+        <w:rPr>
+          <w:rStyle w:val="VerbatimChar"/>
+        </w:rPr>
+        <w:t xml:space="preserve">mysql.global_grants</w:t>
+      </w:r>
+      <w:r>
+        <w:t xml:space="preserve"> </w:t>
+      </w:r>
+      <w:r>
+        <w:t xml:space="preserve">ne nose nijednu kolonu objekta pa važe globalno, nad celim serverom;</w:t>
+      </w:r>
+      <w:r>
+        <w:t xml:space="preserve"> </w:t>
+      </w:r>
+      <w:r>
+        <w:rPr>
+          <w:rStyle w:val="VerbatimChar"/>
+        </w:rPr>
+        <w:t xml:space="preserve">mysql.db</w:t>
+      </w:r>
+      <w:r>
+        <w:t xml:space="preserve"> </w:t>
+      </w:r>
+      <w:r>
+        <w:t xml:space="preserve">nosi kolonu</w:t>
+      </w:r>
+      <w:r>
+        <w:t xml:space="preserve"> </w:t>
+      </w:r>
+      <w:r>
+        <w:rPr>
+          <w:rStyle w:val="VerbatimChar"/>
+        </w:rPr>
+        <w:t xml:space="preserve">Db</w:t>
+      </w:r>
+      <w:r>
+        <w:t xml:space="preserve"> </w:t>
+      </w:r>
+      <w:r>
+        <w:t xml:space="preserve">pa</w:t>
+      </w:r>
+      <w:r>
+        <w:t xml:space="preserve"> </w:t>
+      </w:r>
+      <w:r>
+        <w:t xml:space="preserve">važi nad bazom;</w:t>
+      </w:r>
+      <w:r>
+        <w:t xml:space="preserve"> </w:t>
+      </w:r>
+      <w:r>
+        <w:rPr>
+          <w:rStyle w:val="VerbatimChar"/>
+        </w:rPr>
+        <w:t xml:space="preserve">mysql.tables_priv</w:t>
+      </w:r>
+      <w:r>
+        <w:t xml:space="preserve"> </w:t>
+      </w:r>
+      <w:r>
+        <w:t xml:space="preserve">dodaje</w:t>
+      </w:r>
+      <w:r>
+        <w:t xml:space="preserve"> </w:t>
+      </w:r>
+      <w:r>
+        <w:rPr>
+          <w:rStyle w:val="VerbatimChar"/>
+        </w:rPr>
+        <w:t xml:space="preserve">Table_name</w:t>
+      </w:r>
+      <w:r>
+        <w:t xml:space="preserve"> </w:t>
+      </w:r>
+      <w:r>
+        <w:t xml:space="preserve">pa važi nad tabelom;</w:t>
+      </w:r>
+      <w:r>
+        <w:t xml:space="preserve"> </w:t>
+      </w:r>
+      <w:r>
+        <w:rPr>
+          <w:rStyle w:val="VerbatimChar"/>
+        </w:rPr>
+        <w:t xml:space="preserve">mysql.columns_priv</w:t>
+      </w:r>
+      <w:r>
+        <w:t xml:space="preserve"> </w:t>
+      </w:r>
+      <w:r>
+        <w:t xml:space="preserve">dodaje</w:t>
+      </w:r>
+      <w:r>
+        <w:t xml:space="preserve"> </w:t>
+      </w:r>
+      <w:r>
+        <w:rPr>
+          <w:rStyle w:val="VerbatimChar"/>
+        </w:rPr>
+        <w:t xml:space="preserve">Column_name</w:t>
+      </w:r>
+      <w:r>
+        <w:t xml:space="preserve"> </w:t>
+      </w:r>
+      <w:r>
+        <w:t xml:space="preserve">pa važi nad kolonom; a</w:t>
+      </w:r>
+      <w:r>
+        <w:t xml:space="preserve"> </w:t>
+      </w:r>
+      <w:r>
+        <w:rPr>
+          <w:rStyle w:val="VerbatimChar"/>
+        </w:rPr>
+        <w:t xml:space="preserve">mysql.procs_priv</w:t>
+      </w:r>
+      <w:r>
+        <w:t xml:space="preserve"> </w:t>
+      </w:r>
+      <w:r>
+        <w:t xml:space="preserve">nosi</w:t>
+      </w:r>
+      <w:r>
+        <w:t xml:space="preserve"> </w:t>
+      </w:r>
+      <w:r>
+        <w:rPr>
+          <w:rStyle w:val="VerbatimChar"/>
+        </w:rPr>
+        <w:t xml:space="preserve">Routine_name</w:t>
+      </w:r>
+      <w:r>
+        <w:t xml:space="preserve"> </w:t>
+      </w:r>
+      <w:r>
+        <w:t xml:space="preserve">pa važi nad</w:t>
+      </w:r>
+      <w:r>
+        <w:t xml:space="preserve"> </w:t>
+      </w:r>
+      <w:r>
+        <w:t xml:space="preserve">rutinom</w:t>
+      </w:r>
+      <w:r>
+        <w:t xml:space="preserve"> </w:t>
+      </w:r>
+      <w:r>
+        <w:t xml:space="preserve">[2]</w:t>
+      </w:r>
+      <w:r>
+        <w:t xml:space="preserve">. Preostale četiri tabele ne kodiraju privilegije nego pomoćne odnose:</w:t>
+      </w:r>
+      <w:r>
+        <w:t xml:space="preserve"> </w:t>
+      </w:r>
+      <w:r>
+        <w:rPr>
+          <w:rStyle w:val="VerbatimChar"/>
+        </w:rPr>
+        <w:t xml:space="preserve">mysql.role_edges</w:t>
+      </w:r>
+      <w:r>
+        <w:t xml:space="preserve"> </w:t>
+      </w:r>
+      <w:r>
+        <w:t xml:space="preserve">vezu jedne uloge sa drugom ili sa nalogom,</w:t>
+      </w:r>
+      <w:r>
+        <w:t xml:space="preserve"> </w:t>
+      </w:r>
+      <w:r>
+        <w:rPr>
+          <w:rStyle w:val="VerbatimChar"/>
+        </w:rPr>
+        <w:t xml:space="preserve">mysql.default_roles</w:t>
+      </w:r>
+      <w:r>
+        <w:t xml:space="preserve"> </w:t>
+      </w:r>
+      <w:r>
+        <w:t xml:space="preserve">ulogu aktivnu po</w:t>
+      </w:r>
+      <w:r>
+        <w:t xml:space="preserve"> </w:t>
+      </w:r>
+      <w:r>
+        <w:t xml:space="preserve">prijavljivanju,</w:t>
+      </w:r>
+      <w:r>
+        <w:t xml:space="preserve"> </w:t>
+      </w:r>
+      <w:r>
+        <w:rPr>
+          <w:rStyle w:val="VerbatimChar"/>
+        </w:rPr>
+        <w:t xml:space="preserve">mysql.proxies_priv</w:t>
+      </w:r>
+      <w:r>
+        <w:t xml:space="preserve"> </w:t>
+      </w:r>
+      <w:r>
+        <w:t xml:space="preserve">proxy naloge, a</w:t>
+      </w:r>
+      <w:r>
+        <w:t xml:space="preserve"> </w:t>
+      </w:r>
+      <w:r>
+        <w:rPr>
+          <w:rStyle w:val="VerbatimChar"/>
+        </w:rPr>
+        <w:t xml:space="preserve">mysql.password_history</w:t>
+      </w:r>
+      <w:r>
+        <w:t xml:space="preserve"> </w:t>
+      </w:r>
+      <w:r>
+        <w:t xml:space="preserve">istoriju lozinki</w:t>
+      </w:r>
+      <w:r>
+        <w:t xml:space="preserve"> </w:t>
+      </w:r>
+      <w:r>
+        <w:t xml:space="preserve">[2]</w:t>
+      </w:r>
+      <w:r>
+        <w:t xml:space="preserve">. Pet nivoa, globalni, baza, tabela, kolona i rutina, jeste, dakle, direktna</w:t>
+      </w:r>
+      <w:r>
+        <w:t xml:space="preserve"> </w:t>
+      </w:r>
+      <w:r>
+        <w:t xml:space="preserve">posledica ovog rasporeda kolona, ne proizvoljna arhitektonska odluka nametnuta odozgo.</w:t>
+      </w:r>
+    </w:p>
+    <w:p>
+      <w:pPr>
+        <w:pStyle w:val="BodyText"/>
+      </w:pPr>
+      <w:r>
+        <w:t xml:space="preserve">Provera prava u MySQL-u izvodi se u dva odvojena koraka</w:t>
+      </w:r>
+      <w:r>
+        <w:t xml:space="preserve"> </w:t>
+      </w:r>
+      <w:r>
+        <w:t xml:space="preserve">[2]</w:t>
+      </w:r>
+      <w:r>
+        <w:t xml:space="preserve">. Prvi korak, provera pri</w:t>
+      </w:r>
+      <w:r>
+        <w:t xml:space="preserve"> </w:t>
+      </w:r>
+      <w:r>
+        <w:t xml:space="preserve">povezivanju, odigrava se jednom po sesiji: server proverava akreditive naloga i, ako su ispravni,</w:t>
+      </w:r>
+      <w:r>
+        <w:t xml:space="preserve"> </w:t>
+      </w:r>
+      <w:r>
+        <w:t xml:space="preserve">učitava globalne privilegije tog naloga u memoriju sesije; ovaj korak odgovara autentifikaciji, ne</w:t>
+      </w:r>
+      <w:r>
+        <w:t xml:space="preserve"> </w:t>
+      </w:r>
+      <w:r>
+        <w:t xml:space="preserve">autorizaciji. Drugi korak, provera pri zahtevu, ponavlja se za svaku pojedinačnu naredbu tokom</w:t>
+      </w:r>
+      <w:r>
+        <w:t xml:space="preserve"> </w:t>
+      </w:r>
+      <w:r>
+        <w:t xml:space="preserve">trajanja sesije i predstavlja autorizaciju u užem smislu: server prolazi kroz nivoe utvrđene u</w:t>
+      </w:r>
+      <w:r>
+        <w:t xml:space="preserve"> </w:t>
+      </w:r>
+      <w:r>
+        <w:t xml:space="preserve">prethodnom pasusu, od globalnog ka rutinskom, i traži bilo koji nivo na kome postoji dovoljna</w:t>
+      </w:r>
+      <w:r>
+        <w:t xml:space="preserve"> </w:t>
+      </w:r>
+      <w:r>
+        <w:t xml:space="preserve">privilegija.</w:t>
+      </w:r>
+    </w:p>
+    <w:p>
+      <w:pPr>
+        <w:pStyle w:val="BodyText"/>
+      </w:pPr>
+      <w:r>
+        <w:t xml:space="preserve">Sastavljanje privilegija preko nivoa je isključivo logičko ILI, nikada presek: priručnik ovu proveru</w:t>
+      </w:r>
+      <w:r>
+        <w:t xml:space="preserve"> </w:t>
+      </w:r>
+      <w:r>
+        <w:t xml:space="preserve">formuliše kao ispitivanje globalnih privilegija umanjenih za eventualna ograničenja</w:t>
+      </w:r>
+      <w:r>
+        <w:t xml:space="preserve"> </w:t>
+      </w:r>
+      <w:r>
+        <w:t xml:space="preserve">(</w:t>
+      </w:r>
+      <w:r>
+        <w:rPr>
+          <w:rStyle w:val="VerbatimChar"/>
+        </w:rPr>
+        <w:t xml:space="preserve">partial_revokes</w:t>
+      </w:r>
+      <w:r>
+        <w:t xml:space="preserve">), zatim privilegija nad bazom, zatim nad tabelom, zatim nad kolonom, i konačno nad</w:t>
+      </w:r>
+      <w:r>
+        <w:t xml:space="preserve"> </w:t>
+      </w:r>
+      <w:r>
+        <w:t xml:space="preserve">rutinom, uz prihvatanje zahteva čim bilo koji od tih nivoa traženu privilegiju sadrži</w:t>
+      </w:r>
+      <w:r>
+        <w:t xml:space="preserve"> </w:t>
+      </w:r>
+      <w:r>
+        <w:t xml:space="preserve">[2]</w:t>
+      </w:r>
+      <w:r>
+        <w:t xml:space="preserve">.</w:t>
+      </w:r>
+      <w:r>
+        <w:t xml:space="preserve"> </w:t>
+      </w:r>
+      <w:r>
+        <w:t xml:space="preserve">Slika 3.1 prikazuje ovaj lanac kao razgranatu proveru koja se spaja u jedno ILI. Posledica je merljiva</w:t>
+      </w:r>
+      <w:r>
+        <w:t xml:space="preserve"> </w:t>
+      </w:r>
+      <w:r>
+        <w:t xml:space="preserve">i suprotna intuiciji: uža privilegija nikada ne sužava širu. Na serveru rada izmereno je (verzija</w:t>
+      </w:r>
+      <w:r>
+        <w:t xml:space="preserve"> </w:t>
+      </w:r>
+      <w:r>
+        <w:t xml:space="preserve">8.4.11) da nalog sa privilegijom</w:t>
+      </w:r>
+      <w:r>
+        <w:t xml:space="preserve"> </w:t>
+      </w:r>
+      <w:r>
+        <w:rPr>
+          <w:rStyle w:val="VerbatimChar"/>
+        </w:rPr>
+        <w:t xml:space="preserve">SELECT</w:t>
+      </w:r>
+      <w:r>
+        <w:t xml:space="preserve"> </w:t>
+      </w:r>
+      <w:r>
+        <w:t xml:space="preserve">nad celom bazom</w:t>
+      </w:r>
+      <w:r>
+        <w:t xml:space="preserve"> </w:t>
+      </w:r>
+      <w:r>
+        <w:rPr>
+          <w:rStyle w:val="VerbatimChar"/>
+        </w:rPr>
+        <w:t xml:space="preserve">poliklinika</w:t>
+      </w:r>
+      <w:r>
+        <w:t xml:space="preserve"> </w:t>
+      </w:r>
+      <w:r>
+        <w:t xml:space="preserve">i, pride, kolonskom</w:t>
+      </w:r>
+      <w:r>
+        <w:t xml:space="preserve"> </w:t>
+      </w:r>
+      <w:r>
+        <w:t xml:space="preserve">privilegijom</w:t>
+      </w:r>
+      <w:r>
+        <w:t xml:space="preserve"> </w:t>
+      </w:r>
+      <w:r>
+        <w:rPr>
+          <w:rStyle w:val="VerbatimChar"/>
+        </w:rPr>
+        <w:t xml:space="preserve">SELECT (icd_code)</w:t>
+      </w:r>
+      <w:r>
+        <w:t xml:space="preserve"> </w:t>
+      </w:r>
+      <w:r>
+        <w:t xml:space="preserve">nad tabelom</w:t>
+      </w:r>
+      <w:r>
+        <w:t xml:space="preserve"> </w:t>
+      </w:r>
+      <w:r>
+        <w:rPr>
+          <w:rStyle w:val="VerbatimChar"/>
+        </w:rPr>
+        <w:t xml:space="preserve">diagnoses</w:t>
+      </w:r>
+      <w:r>
+        <w:t xml:space="preserve">, može da pročita i kolonu</w:t>
+      </w:r>
+      <w:r>
+        <w:t xml:space="preserve"> </w:t>
+      </w:r>
+      <w:r>
+        <w:rPr>
+          <w:rStyle w:val="VerbatimChar"/>
+        </w:rPr>
+        <w:t xml:space="preserve">diagnosis_text</w:t>
+      </w:r>
+      <w:r>
+        <w:t xml:space="preserve">,</w:t>
+      </w:r>
+      <w:r>
+        <w:t xml:space="preserve"> </w:t>
+      </w:r>
+      <w:r>
+        <w:t xml:space="preserve">iako mu ona nikada nije eksplicitno dodeljena, jer je član baze u ILI-lancu sam po sebi dovoljan;</w:t>
+      </w:r>
+      <w:r>
+        <w:t xml:space="preserve"> </w:t>
+      </w:r>
+      <w:r>
+        <w:t xml:space="preserve">nalog sa identičnom kolonskom privilegijom, ali bez privilegije nad bazom, na isti upit dobija</w:t>
+      </w:r>
+      <w:r>
+        <w:t xml:space="preserve"> </w:t>
+      </w:r>
+      <w:r>
+        <w:rPr>
+          <w:rStyle w:val="VerbatimChar"/>
+        </w:rPr>
+        <w:t xml:space="preserve">ERROR 1143</w:t>
+      </w:r>
+      <w:r>
+        <w:t xml:space="preserve">, uz napomenu da server u poruci greške imenuje prvu kolonu bez privilegije na koju</w:t>
+      </w:r>
+      <w:r>
+        <w:t xml:space="preserve"> </w:t>
+      </w:r>
+      <w:r>
+        <w:t xml:space="preserve">naiđe, ne onu zbog koje je upit zapravo pisan. Princip najmanjih privilegija se u ovakvom modelu,</w:t>
+      </w:r>
+      <w:r>
+        <w:t xml:space="preserve"> </w:t>
+      </w:r>
+      <w:r>
+        <w:t xml:space="preserve">dakle, ne postiže dodavanjem uže privilegije pored šire, nego time što se šira nikada i ne dodeli</w:t>
+      </w:r>
+      <w:r>
+        <w:t xml:space="preserve"> </w:t>
+      </w:r>
+      <w:r>
+        <w:t xml:space="preserve">[7]</w:t>
+      </w:r>
+      <w:r>
+        <w:t xml:space="preserve">.</w:t>
+      </w:r>
+    </w:p>
+    <w:p>
+      <w:pPr>
+        <w:pStyle w:val="CaptionedFigure"/>
+      </w:pPr>
+      <w:r>
+        <w:drawing>
+          <wp:inline>
+            <wp:extent cx="5177790" cy="2106779"/>
+            <wp:effectExtent b="0" l="0" r="0" t="0"/>
+            <wp:docPr descr="Slika 3.1: Sastavljanje nivoa privilegija logičkim ILI" title="" id="15" name="Picture"/>
+            <a:graphic>
+              <a:graphicData uri="http://schemas.openxmlformats.org/drawingml/2006/picture">
+                <pic:pic>
+                  <pic:nvPicPr>
+                    <pic:cNvPr descr="figures/03-privilegije-01-provera-ili.png" id="16" name="Picture"/>
+                    <pic:cNvPicPr>
+                      <a:picLocks noChangeArrowheads="1" noChangeAspect="1"/>
+                    </pic:cNvPicPr>
+                  </pic:nvPicPr>
+                  <pic:blipFill>
+                    <a:blip r:embed="rId14"/>
+                    <a:stretch>
+                      <a:fillRect/>
+                    </a:stretch>
+                  </pic:blipFill>
+                  <pic:spPr bwMode="auto">
+                    <a:xfrm>
+                      <a:off x="0" y="0"/>
+                      <a:ext cx="5177790" cy="2106779"/>
+                    </a:xfrm>
+                    <a:prstGeom prst="rect">
+                      <a:avLst/>
+                    </a:prstGeom>
+                    <a:noFill/>
+                    <a:ln w="9525">
+                      <a:noFill/>
+                      <a:headEnd/>
+                      <a:tailEnd/>
+                    </a:ln>
+                  </pic:spPr>
+                </pic:pic>
+              </a:graphicData>
+            </a:graphic>
+          </wp:inline>
+        </w:drawing>
+      </w:r>
+    </w:p>
+    <w:p>
+      <w:pPr>
+        <w:pStyle w:val="ImageCaption"/>
+      </w:pPr>
+      <w:r>
+        <w:t xml:space="preserve">Slika 3.1: Sastavljanje nivoa privilegija logičkim ILI</w:t>
+      </w:r>
+    </w:p>
+    <w:p>
+      <w:pPr>
+        <w:pStyle w:val="BodyText"/>
+      </w:pPr>
+      <w:r>
+        <w:t xml:space="preserve">Privilegije se dodatno dele na statičke i dinamičke, razlika koja ne prati nivo nego poreklo. Statička</w:t>
+      </w:r>
+      <w:r>
+        <w:t xml:space="preserve"> </w:t>
+      </w:r>
+      <w:r>
+        <w:t xml:space="preserve">privilegija je ugrađena u sam server i predstavlja kolonu u tabeli</w:t>
+      </w:r>
+      <w:r>
+        <w:t xml:space="preserve"> </w:t>
+      </w:r>
+      <w:r>
+        <w:rPr>
+          <w:rStyle w:val="VerbatimChar"/>
+        </w:rPr>
+        <w:t xml:space="preserve">mysql.user</w:t>
+      </w:r>
+      <w:r>
+        <w:t xml:space="preserve"> </w:t>
+      </w:r>
+      <w:r>
+        <w:t xml:space="preserve">ili</w:t>
+      </w:r>
+      <w:r>
+        <w:t xml:space="preserve"> </w:t>
+      </w:r>
+      <w:r>
+        <w:rPr>
+          <w:rStyle w:val="VerbatimChar"/>
+        </w:rPr>
+        <w:t xml:space="preserve">mysql.db</w:t>
+      </w:r>
+      <w:r>
+        <w:t xml:space="preserve">; spisak</w:t>
+      </w:r>
+      <w:r>
+        <w:t xml:space="preserve"> </w:t>
+      </w:r>
+      <w:r>
+        <w:t xml:space="preserve">statičkih privilegija je zamrznut za datu verziju servera, a sve tabelske, kolonske i rutinske</w:t>
+      </w:r>
+      <w:r>
+        <w:t xml:space="preserve"> </w:t>
+      </w:r>
+      <w:r>
+        <w:t xml:space="preserve">privilegije su statičke</w:t>
+      </w:r>
+      <w:r>
+        <w:t xml:space="preserve"> </w:t>
+      </w:r>
+      <w:r>
+        <w:t xml:space="preserve">[2]</w:t>
+      </w:r>
+      <w:r>
+        <w:t xml:space="preserve">. Dinamička privilegija je, naprotiv, red u tabeli</w:t>
+      </w:r>
+      <w:r>
+        <w:t xml:space="preserve"> </w:t>
+      </w:r>
+      <w:r>
+        <w:rPr>
+          <w:rStyle w:val="VerbatimChar"/>
+        </w:rPr>
+        <w:t xml:space="preserve">mysql.global_grants</w:t>
+      </w:r>
+      <w:r>
+        <w:t xml:space="preserve">, postoji isključivo na globalnom nivou i registruje se pri pokretanju servera ili</w:t>
+      </w:r>
+      <w:r>
+        <w:t xml:space="preserve"> </w:t>
+      </w:r>
+      <w:r>
+        <w:t xml:space="preserve">pri prvom</w:t>
+      </w:r>
+      <w:r>
+        <w:t xml:space="preserve"> </w:t>
+      </w:r>
+      <w:r>
+        <w:rPr>
+          <w:rStyle w:val="VerbatimChar"/>
+        </w:rPr>
+        <w:t xml:space="preserve">FLUSH PRIVILEGES</w:t>
+      </w:r>
+      <w:r>
+        <w:t xml:space="preserve">; ova razlika u poreklu ima i praktičnu posledicu na već otvorene sesije,</w:t>
+      </w:r>
+      <w:r>
+        <w:t xml:space="preserve"> </w:t>
+      </w:r>
+      <w:r>
+        <w:t xml:space="preserve">jer dinamička globalna privilegija stupa na snagu odmah, dok statička globalna privilegija važi tek za</w:t>
+      </w:r>
+      <w:r>
+        <w:t xml:space="preserve"> </w:t>
+      </w:r>
+      <w:r>
+        <w:t xml:space="preserve">nove konekcije</w:t>
+      </w:r>
+      <w:r>
+        <w:t xml:space="preserve"> </w:t>
+      </w:r>
+      <w:r>
+        <w:t xml:space="preserve">[2]</w:t>
+      </w:r>
+      <w:r>
+        <w:t xml:space="preserve">. Upravo je taj mehanizam iskorišćen za rastavljanje privilegije</w:t>
+      </w:r>
+      <w:r>
+        <w:t xml:space="preserve"> </w:t>
+      </w:r>
+      <w:r>
+        <w:rPr>
+          <w:rStyle w:val="VerbatimChar"/>
+        </w:rPr>
+        <w:t xml:space="preserve">SUPER</w:t>
+      </w:r>
+      <w:r>
+        <w:t xml:space="preserve">, istorijski jedne privilegije koja je objedinjavala desetine nepovezanih administrativnih</w:t>
+      </w:r>
+      <w:r>
+        <w:t xml:space="preserve"> </w:t>
+      </w:r>
+      <w:r>
+        <w:t xml:space="preserve">ovlašćenja, od izmene sistemskih promenljivih do upravljanja binarnim logom i gašenja servera:</w:t>
+      </w:r>
+      <w:r>
+        <w:t xml:space="preserve"> </w:t>
+      </w:r>
+      <w:r>
+        <w:rPr>
+          <w:rStyle w:val="VerbatimChar"/>
+        </w:rPr>
+        <w:t xml:space="preserve">SUPER</w:t>
+      </w:r>
+      <w:r>
+        <w:t xml:space="preserve"> </w:t>
+      </w:r>
+      <w:r>
+        <w:t xml:space="preserve">je u MySQL-u 8.0 i kasnijim verzijama proglašena zastarelom u korist tridesetak imenovanih dinamičkih</w:t>
+      </w:r>
+      <w:r>
+        <w:t xml:space="preserve"> </w:t>
+      </w:r>
+      <w:r>
+        <w:t xml:space="preserve">privilegija poput</w:t>
+      </w:r>
+      <w:r>
+        <w:t xml:space="preserve"> </w:t>
+      </w:r>
+      <w:r>
+        <w:rPr>
+          <w:rStyle w:val="VerbatimChar"/>
+        </w:rPr>
+        <w:t xml:space="preserve">SYSTEM_VARIABLES_ADMIN</w:t>
+      </w:r>
+      <w:r>
+        <w:t xml:space="preserve">,</w:t>
+      </w:r>
+      <w:r>
+        <w:t xml:space="preserve"> </w:t>
+      </w:r>
+      <w:r>
+        <w:rPr>
+          <w:rStyle w:val="VerbatimChar"/>
+        </w:rPr>
+        <w:t xml:space="preserve">BINLOG_ADMIN</w:t>
+      </w:r>
+      <w:r>
+        <w:t xml:space="preserve"> </w:t>
+      </w:r>
+      <w:r>
+        <w:t xml:space="preserve">i</w:t>
+      </w:r>
+      <w:r>
+        <w:t xml:space="preserve"> </w:t>
+      </w:r>
+      <w:r>
+        <w:rPr>
+          <w:rStyle w:val="VerbatimChar"/>
+        </w:rPr>
+        <w:t xml:space="preserve">CONNECTION_ADMIN</w:t>
+      </w:r>
+      <w:r>
+        <w:t xml:space="preserve">, tako da se nalogu koji</w:t>
+      </w:r>
+      <w:r>
+        <w:t xml:space="preserve"> </w:t>
+      </w:r>
+      <w:r>
+        <w:t xml:space="preserve">administrira samo binarni log može dodeliti tačno ta privilegija, bez preostalih ovlašćenja koja</w:t>
+      </w:r>
+      <w:r>
+        <w:t xml:space="preserve"> </w:t>
+      </w:r>
+      <w:r>
+        <w:rPr>
+          <w:rStyle w:val="VerbatimChar"/>
+        </w:rPr>
+        <w:t xml:space="preserve">SUPER</w:t>
+      </w:r>
+      <w:r>
+        <w:t xml:space="preserve"> </w:t>
+      </w:r>
+      <w:r>
+        <w:t xml:space="preserve">nosi uz nju</w:t>
+      </w:r>
+      <w:r>
+        <w:t xml:space="preserve"> </w:t>
+      </w:r>
+      <w:r>
+        <w:t xml:space="preserve">[2]</w:t>
+      </w:r>
+      <w:r>
+        <w:t xml:space="preserve">. Rastavljanje</w:t>
+      </w:r>
+      <w:r>
+        <w:t xml:space="preserve"> </w:t>
+      </w:r>
+      <w:r>
+        <w:rPr>
+          <w:rStyle w:val="VerbatimChar"/>
+        </w:rPr>
+        <w:t xml:space="preserve">SUPER</w:t>
+      </w:r>
+      <w:r>
+        <w:t xml:space="preserve">-a je, drugim rečima, princip najmanjih</w:t>
+      </w:r>
+      <w:r>
+        <w:t xml:space="preserve"> </w:t>
+      </w:r>
+      <w:r>
+        <w:t xml:space="preserve">privilegija primenjen na sam projekat sistema, ne samo na to kako ga administrator koristi</w:t>
+      </w:r>
+      <w:r>
+        <w:t xml:space="preserve"> </w:t>
+      </w:r>
+      <w:r>
+        <w:t xml:space="preserve">[7]</w:t>
+      </w:r>
+      <w:r>
+        <w:t xml:space="preserve">.</w:t>
+      </w:r>
+    </w:p>
+    <w:p>
+      <w:pPr>
+        <w:pStyle w:val="BodyText"/>
+      </w:pPr>
+      <w:r>
+        <w:rPr>
+          <w:rStyle w:val="VerbatimChar"/>
+        </w:rPr>
+        <w:t xml:space="preserve">partial_revokes</w:t>
+      </w:r>
+      <w:r>
+        <w:t xml:space="preserve"> </w:t>
+      </w:r>
+      <w:r>
+        <w:t xml:space="preserve">je jedini deo MySQL-ovog sistema privilegija koji liči na eksplicitnu zabranu, i</w:t>
+      </w:r>
+      <w:r>
+        <w:t xml:space="preserve"> </w:t>
+      </w:r>
+      <w:r>
+        <w:t xml:space="preserve">upravo je zbog toga uzak po obimu. Kada je ova promenljiva uključena,</w:t>
+      </w:r>
+      <w:r>
+        <w:t xml:space="preserve"> </w:t>
+      </w:r>
+      <w:r>
+        <w:rPr>
+          <w:rStyle w:val="VerbatimChar"/>
+        </w:rPr>
+        <w:t xml:space="preserve">REVOKE</w:t>
+      </w:r>
+      <w:r>
+        <w:t xml:space="preserve"> </w:t>
+      </w:r>
+      <w:r>
+        <w:t xml:space="preserve">nad nazivom baze upisuje</w:t>
+      </w:r>
+      <w:r>
+        <w:t xml:space="preserve"> </w:t>
+      </w:r>
+      <w:r>
+        <w:t xml:space="preserve">ograničenje u JSON dokument u koloni</w:t>
+      </w:r>
+      <w:r>
+        <w:t xml:space="preserve"> </w:t>
+      </w:r>
+      <w:r>
+        <w:rPr>
+          <w:rStyle w:val="VerbatimChar"/>
+        </w:rPr>
+        <w:t xml:space="preserve">User_attributes</w:t>
+      </w:r>
+      <w:r>
+        <w:t xml:space="preserve"> </w:t>
+      </w:r>
+      <w:r>
+        <w:t xml:space="preserve">tabele</w:t>
+      </w:r>
+      <w:r>
+        <w:t xml:space="preserve"> </w:t>
+      </w:r>
+      <w:r>
+        <w:rPr>
+          <w:rStyle w:val="VerbatimChar"/>
+        </w:rPr>
+        <w:t xml:space="preserve">mysql.user</w:t>
+      </w:r>
+      <w:r>
+        <w:t xml:space="preserve">, a ne u samu tabelu</w:t>
+      </w:r>
+      <w:r>
+        <w:t xml:space="preserve"> </w:t>
+      </w:r>
+      <w:r>
+        <w:t xml:space="preserve">privilegija</w:t>
+      </w:r>
+      <w:r>
+        <w:t xml:space="preserve"> </w:t>
+      </w:r>
+      <w:r>
+        <w:t xml:space="preserve">[2]</w:t>
+      </w:r>
+      <w:r>
+        <w:t xml:space="preserve">. To ograničenje deluje isključivo na globalni član ILI-lanca opisanog</w:t>
+      </w:r>
+      <w:r>
+        <w:t xml:space="preserve"> </w:t>
+      </w:r>
+      <w:r>
+        <w:t xml:space="preserve">ranije: oduzima deo globalne privilegije unutar te jedne baze, ali privilegija dodeljena direktno na</w:t>
+      </w:r>
+      <w:r>
+        <w:t xml:space="preserve"> </w:t>
+      </w:r>
+      <w:r>
+        <w:t xml:space="preserve">nivou tabele unutar iste baze i dalje radi, jer je taj nivo poseban član lanca koji ograničenje ne</w:t>
+      </w:r>
+      <w:r>
+        <w:t xml:space="preserve"> </w:t>
+      </w:r>
+      <w:r>
+        <w:t xml:space="preserve">dotiče.</w:t>
+      </w:r>
+      <w:r>
+        <w:t xml:space="preserve"> </w:t>
+      </w:r>
+      <w:r>
+        <w:rPr>
+          <w:rStyle w:val="VerbatimChar"/>
+        </w:rPr>
+        <w:t xml:space="preserve">partial_revokes</w:t>
+      </w:r>
+      <w:r>
+        <w:t xml:space="preserve">, dakle, nije opšti mehanizam zabrane ugrađen u model, nego tačkasta zakrpa</w:t>
+      </w:r>
+      <w:r>
+        <w:t xml:space="preserve"> </w:t>
+      </w:r>
+      <w:r>
+        <w:t xml:space="preserve">nad jednim njegovim članom. Isto važi i za</w:t>
+      </w:r>
+      <w:r>
+        <w:t xml:space="preserve"> </w:t>
+      </w:r>
+      <w:r>
+        <w:rPr>
+          <w:rStyle w:val="VerbatimChar"/>
+        </w:rPr>
+        <w:t xml:space="preserve">mandatory_roles</w:t>
+      </w:r>
+      <w:r>
+        <w:t xml:space="preserve">, sistemsku promenljivu koja nameće da</w:t>
+      </w:r>
+      <w:r>
+        <w:t xml:space="preserve"> </w:t>
+      </w:r>
+      <w:r>
+        <w:t xml:space="preserve">svaki nalog na serveru poseduje navedenu ulogu bez obzira na to da li mu je ona ikada eksplicitno</w:t>
+      </w:r>
+      <w:r>
+        <w:t xml:space="preserve"> </w:t>
+      </w:r>
+      <w:r>
+        <w:t xml:space="preserve">dodeljena preko</w:t>
+      </w:r>
+      <w:r>
+        <w:t xml:space="preserve"> </w:t>
+      </w:r>
+      <w:r>
+        <w:rPr>
+          <w:rStyle w:val="VerbatimChar"/>
+        </w:rPr>
+        <w:t xml:space="preserve">GRANT</w:t>
+      </w:r>
+      <w:r>
+        <w:t xml:space="preserve">-a</w:t>
+      </w:r>
+      <w:r>
+        <w:t xml:space="preserve"> </w:t>
+      </w:r>
+      <w:r>
+        <w:t xml:space="preserve">[2]</w:t>
+      </w:r>
+      <w:r>
+        <w:t xml:space="preserve">: oba mehanizma dopisuju izuzetak van same tabele dodele</w:t>
+      </w:r>
+      <w:r>
+        <w:t xml:space="preserve"> </w:t>
+      </w:r>
+      <w:r>
+        <w:t xml:space="preserve">prava, umesto da menjaju osnovni, isključivo dodeljujući karakter modela.</w:t>
+      </w:r>
+    </w:p>
+    <w:p>
+      <w:pPr>
+        <w:pStyle w:val="BodyText"/>
+      </w:pPr>
+      <w:r>
+        <w:t xml:space="preserve">Uloga u MySQL-u nije poseban tip objekta, nego zaključan red u istoj tabeli</w:t>
+      </w:r>
+      <w:r>
+        <w:t xml:space="preserve"> </w:t>
+      </w:r>
+      <w:r>
+        <w:rPr>
+          <w:rStyle w:val="VerbatimChar"/>
+        </w:rPr>
+        <w:t xml:space="preserve">mysql.user</w:t>
+      </w:r>
+      <w:r>
+        <w:t xml:space="preserve"> </w:t>
+      </w:r>
+      <w:r>
+        <w:t xml:space="preserve">u kojoj stoje</w:t>
+      </w:r>
+      <w:r>
+        <w:t xml:space="preserve"> </w:t>
+      </w:r>
+      <w:r>
+        <w:t xml:space="preserve">i nalozi; jedina razlika je bit koji sprečava prijavljivanje pod tim imenom</w:t>
+      </w:r>
+      <w:r>
+        <w:t xml:space="preserve"> </w:t>
+      </w:r>
+      <w:r>
+        <w:t xml:space="preserve">[2]</w:t>
+      </w:r>
+      <w:r>
+        <w:t xml:space="preserve">. Dodela</w:t>
+      </w:r>
+      <w:r>
+        <w:t xml:space="preserve"> </w:t>
+      </w:r>
+      <w:r>
+        <w:t xml:space="preserve">uloge nalogu,</w:t>
+      </w:r>
+      <w:r>
+        <w:t xml:space="preserve"> </w:t>
+      </w:r>
+      <w:r>
+        <w:rPr>
+          <w:rStyle w:val="VerbatimChar"/>
+        </w:rPr>
+        <w:t xml:space="preserve">GRANT uloga TO nalog</w:t>
+      </w:r>
+      <w:r>
+        <w:t xml:space="preserve">, upisuje ivicu u tabelu</w:t>
+      </w:r>
+      <w:r>
+        <w:t xml:space="preserve"> </w:t>
+      </w:r>
+      <w:r>
+        <w:rPr>
+          <w:rStyle w:val="VerbatimChar"/>
+        </w:rPr>
+        <w:t xml:space="preserve">mysql.role_edges</w:t>
+      </w:r>
+      <w:r>
+        <w:t xml:space="preserve"> </w:t>
+      </w:r>
+      <w:r>
+        <w:t xml:space="preserve">i ne kopira nijednu</w:t>
+      </w:r>
+      <w:r>
+        <w:t xml:space="preserve"> </w:t>
+      </w:r>
+      <w:r>
+        <w:t xml:space="preserve">privilegiju: server u trenutku provere obilazi taj graf i sabira privilegije svih uloga do kojih se od</w:t>
+      </w:r>
+      <w:r>
+        <w:t xml:space="preserve"> </w:t>
+      </w:r>
+      <w:r>
+        <w:t xml:space="preserve">datog naloga može stići, umesto da privilegije unapred umnožava po nalozima</w:t>
+      </w:r>
+      <w:r>
+        <w:t xml:space="preserve"> </w:t>
+      </w:r>
+      <w:r>
+        <w:t xml:space="preserve">[2]</w:t>
+      </w:r>
+      <w:r>
+        <w:t xml:space="preserve">. Slika 3.2</w:t>
+      </w:r>
+      <w:r>
+        <w:t xml:space="preserve"> </w:t>
+      </w:r>
+      <w:r>
+        <w:t xml:space="preserve">prikazuje ovakav graf izmeren na sopstvenom sandbox okruženju rada: nalog</w:t>
+      </w:r>
+      <w:r>
+        <w:t xml:space="preserve"> </w:t>
+      </w:r>
+      <w:r>
+        <w:rPr>
+          <w:rStyle w:val="VerbatimChar"/>
+        </w:rPr>
+        <w:t xml:space="preserve">doc_bar</w:t>
+      </w:r>
+      <w:r>
+        <w:t xml:space="preserve"> </w:t>
+      </w:r>
+      <w:r>
+        <w:t xml:space="preserve">dobija samo ulogu</w:t>
+      </w:r>
+      <w:r>
+        <w:t xml:space="preserve"> </w:t>
+      </w:r>
+      <w:r>
+        <w:rPr>
+          <w:rStyle w:val="VerbatimChar"/>
+        </w:rPr>
+        <w:t xml:space="preserve">role_senior_doctor</w:t>
+      </w:r>
+      <w:r>
+        <w:t xml:space="preserve">, koja dalje nasleđuje ulogu</w:t>
+      </w:r>
+      <w:r>
+        <w:t xml:space="preserve"> </w:t>
+      </w:r>
+      <w:r>
+        <w:rPr>
+          <w:rStyle w:val="VerbatimChar"/>
+        </w:rPr>
+        <w:t xml:space="preserve">role_doctor</w:t>
+      </w:r>
+      <w:r>
+        <w:t xml:space="preserve">; nijedan red u</w:t>
+      </w:r>
+      <w:r>
+        <w:t xml:space="preserve"> </w:t>
+      </w:r>
+      <w:r>
+        <w:rPr>
+          <w:rStyle w:val="VerbatimChar"/>
+        </w:rPr>
+        <w:t xml:space="preserve">mysql.tables_priv</w:t>
+      </w:r>
+      <w:r>
+        <w:t xml:space="preserve"> </w:t>
+      </w:r>
+      <w:r>
+        <w:t xml:space="preserve">nema</w:t>
+      </w:r>
+      <w:r>
+        <w:t xml:space="preserve"> </w:t>
+      </w:r>
+      <w:r>
+        <w:rPr>
+          <w:rStyle w:val="VerbatimChar"/>
+        </w:rPr>
+        <w:t xml:space="preserve">User='doc_bar'</w:t>
+      </w:r>
+      <w:r>
+        <w:t xml:space="preserve">, jer sve privilegije koje</w:t>
+      </w:r>
+      <w:r>
+        <w:t xml:space="preserve"> </w:t>
+      </w:r>
+      <w:r>
+        <w:rPr>
+          <w:rStyle w:val="VerbatimChar"/>
+        </w:rPr>
+        <w:t xml:space="preserve">doc_bar</w:t>
+      </w:r>
+      <w:r>
+        <w:t xml:space="preserve"> </w:t>
+      </w:r>
+      <w:r>
+        <w:t xml:space="preserve">stvarno koristi pripadaju dvema ulogama iznad</w:t>
+      </w:r>
+      <w:r>
+        <w:t xml:space="preserve"> </w:t>
+      </w:r>
+      <w:r>
+        <w:t xml:space="preserve">njega u grafu, ne samom nalogu.</w:t>
+      </w:r>
+    </w:p>
+    <w:p>
+      <w:pPr>
+        <w:pStyle w:val="CaptionedFigure"/>
+      </w:pPr>
+      <w:r>
+        <w:drawing>
+          <wp:inline>
+            <wp:extent cx="3164205" cy="3394083"/>
+            <wp:effectExtent b="0" l="0" r="0" t="0"/>
+            <wp:docPr descr="Slika 3.2: Graf uloga za nalog doc_bar (mysql.role_edges)" title="" id="18" name="Picture"/>
+            <a:graphic>
+              <a:graphicData uri="http://schemas.openxmlformats.org/drawingml/2006/picture">
+                <pic:pic>
+                  <pic:nvPicPr>
+                    <pic:cNvPr descr="figures/03-privilegije-02-role-graf.png" id="19" name="Picture"/>
+                    <pic:cNvPicPr>
+                      <a:picLocks noChangeArrowheads="1" noChangeAspect="1"/>
+                    </pic:cNvPicPr>
+                  </pic:nvPicPr>
+                  <pic:blipFill>
+                    <a:blip r:embed="rId17"/>
+                    <a:stretch>
+                      <a:fillRect/>
+                    </a:stretch>
+                  </pic:blipFill>
+                  <pic:spPr bwMode="auto">
+                    <a:xfrm>
+                      <a:off x="0" y="0"/>
+                      <a:ext cx="3164205" cy="3394083"/>
+                    </a:xfrm>
+                    <a:prstGeom prst="rect">
+                      <a:avLst/>
+                    </a:prstGeom>
+                    <a:noFill/>
+                    <a:ln w="9525">
+                      <a:noFill/>
+                      <a:headEnd/>
+                      <a:tailEnd/>
+                    </a:ln>
+                  </pic:spPr>
+                </pic:pic>
+              </a:graphicData>
+            </a:graphic>
+          </wp:inline>
+        </w:drawing>
+      </w:r>
+    </w:p>
+    <w:p>
+      <w:pPr>
+        <w:pStyle w:val="ImageCaption"/>
+      </w:pPr>
+      <w:r>
+        <w:t xml:space="preserve">Slika 3.2: Graf uloga za nalog doc_bar (mysql.role_edges)</w:t>
+      </w:r>
+    </w:p>
+    <w:p>
+      <w:pPr>
+        <w:pStyle w:val="BodyText"/>
+      </w:pPr>
+      <w:r>
+        <w:t xml:space="preserve">Dodeljena uloga, međutim, nije automatski i aktivna uloga, razlika koju formalni RBAC model predviđa</w:t>
+      </w:r>
+      <w:r>
+        <w:t xml:space="preserve"> </w:t>
+      </w:r>
+      <w:r>
+        <w:t xml:space="preserve">kroz pojam sesije</w:t>
+      </w:r>
+      <w:r>
+        <w:t xml:space="preserve"> </w:t>
+      </w:r>
+      <w:r>
+        <w:t xml:space="preserve">[6]</w:t>
+      </w:r>
+      <w:r>
+        <w:t xml:space="preserve"> </w:t>
+      </w:r>
+      <w:r>
+        <w:t xml:space="preserve">a koju MySQL sprovodi doslovno. Izmereno na serveru rada (verzija</w:t>
+      </w:r>
+      <w:r>
+        <w:t xml:space="preserve"> </w:t>
+      </w:r>
+      <w:r>
+        <w:t xml:space="preserve">8.4.11, uz</w:t>
+      </w:r>
+      <w:r>
+        <w:t xml:space="preserve"> </w:t>
+      </w:r>
+      <w:r>
+        <w:rPr>
+          <w:rStyle w:val="VerbatimChar"/>
+        </w:rPr>
+        <w:t xml:space="preserve">activate_all_roles_on_login</w:t>
+      </w:r>
+      <w:r>
+        <w:t xml:space="preserve"> </w:t>
+      </w:r>
+      <w:r>
+        <w:t xml:space="preserve">isključeno): nalog</w:t>
+      </w:r>
+      <w:r>
+        <w:t xml:space="preserve"> </w:t>
+      </w:r>
+      <w:r>
+        <w:rPr>
+          <w:rStyle w:val="VerbatimChar"/>
+        </w:rPr>
+        <w:t xml:space="preserve">doc_bar</w:t>
+      </w:r>
+      <w:r>
+        <w:t xml:space="preserve"> </w:t>
+      </w:r>
+      <w:r>
+        <w:t xml:space="preserve">odmah po prijavljivanju ima</w:t>
+      </w:r>
+      <w:r>
+        <w:t xml:space="preserve"> </w:t>
+      </w:r>
+      <w:r>
+        <w:t xml:space="preserve">aktivnu samo podrazumevanu ulogu</w:t>
+      </w:r>
+      <w:r>
+        <w:t xml:space="preserve"> </w:t>
+      </w:r>
+      <w:r>
+        <w:rPr>
+          <w:rStyle w:val="VerbatimChar"/>
+        </w:rPr>
+        <w:t xml:space="preserve">role_doctor</w:t>
+      </w:r>
+      <w:r>
+        <w:t xml:space="preserve">, dok je</w:t>
+      </w:r>
+      <w:r>
+        <w:t xml:space="preserve"> </w:t>
+      </w:r>
+      <w:r>
+        <w:rPr>
+          <w:rStyle w:val="VerbatimChar"/>
+        </w:rPr>
+        <w:t xml:space="preserve">role_senior_doctor</w:t>
+      </w:r>
+      <w:r>
+        <w:t xml:space="preserve"> </w:t>
+      </w:r>
+      <w:r>
+        <w:t xml:space="preserve">dodeljena ali neaktivna,</w:t>
+      </w:r>
+      <w:r>
+        <w:t xml:space="preserve"> </w:t>
+      </w:r>
+      <w:r>
+        <w:t xml:space="preserve">pa upit nad tabelom</w:t>
+      </w:r>
+      <w:r>
+        <w:t xml:space="preserve"> </w:t>
+      </w:r>
+      <w:r>
+        <w:rPr>
+          <w:rStyle w:val="VerbatimChar"/>
+        </w:rPr>
+        <w:t xml:space="preserve">invoices</w:t>
+      </w:r>
+      <w:r>
+        <w:t xml:space="preserve">, čija privilegija pripada isključivo ulozi</w:t>
+      </w:r>
+      <w:r>
+        <w:t xml:space="preserve"> </w:t>
+      </w:r>
+      <w:r>
+        <w:rPr>
+          <w:rStyle w:val="VerbatimChar"/>
+        </w:rPr>
+        <w:t xml:space="preserve">role_senior_doctor</w:t>
+      </w:r>
+      <w:r>
+        <w:t xml:space="preserve">, pada sa</w:t>
+      </w:r>
+      <w:r>
+        <w:t xml:space="preserve"> </w:t>
+      </w:r>
+      <w:r>
+        <w:rPr>
+          <w:rStyle w:val="VerbatimChar"/>
+        </w:rPr>
+        <w:t xml:space="preserve">ERROR 1142</w:t>
+      </w:r>
+      <w:r>
+        <w:t xml:space="preserve">, iako je nalog tu privilegiju formalno već dobio. Nakon</w:t>
+      </w:r>
+      <w:r>
+        <w:t xml:space="preserve"> </w:t>
+      </w:r>
+      <w:r>
+        <w:rPr>
+          <w:rStyle w:val="VerbatimChar"/>
+        </w:rPr>
+        <w:t xml:space="preserve">SET ROLE role_senior_doctor</w:t>
+      </w:r>
+      <w:r>
+        <w:t xml:space="preserve"> </w:t>
+      </w:r>
+      <w:r>
+        <w:t xml:space="preserve">isti</w:t>
+      </w:r>
+      <w:r>
+        <w:t xml:space="preserve"> </w:t>
+      </w:r>
+      <w:r>
+        <w:t xml:space="preserve">upit prolazi, a</w:t>
+      </w:r>
+      <w:r>
+        <w:t xml:space="preserve"> </w:t>
+      </w:r>
+      <w:r>
+        <w:rPr>
+          <w:rStyle w:val="VerbatimChar"/>
+        </w:rPr>
+        <w:t xml:space="preserve">CURRENT_ROLE()</w:t>
+      </w:r>
+      <w:r>
+        <w:t xml:space="preserve"> </w:t>
+      </w:r>
+      <w:r>
+        <w:t xml:space="preserve">vraća isključivo</w:t>
+      </w:r>
+      <w:r>
+        <w:t xml:space="preserve"> </w:t>
+      </w:r>
+      <w:r>
+        <w:rPr>
+          <w:rStyle w:val="VerbatimChar"/>
+        </w:rPr>
+        <w:t xml:space="preserve">role_senior_doctor</w:t>
+      </w:r>
+      <w:r>
+        <w:t xml:space="preserve">;</w:t>
+      </w:r>
+      <w:r>
+        <w:t xml:space="preserve"> </w:t>
+      </w:r>
+      <w:r>
+        <w:rPr>
+          <w:rStyle w:val="VerbatimChar"/>
+        </w:rPr>
+        <w:t xml:space="preserve">role_doctor</w:t>
+      </w:r>
+      <w:r>
+        <w:t xml:space="preserve"> </w:t>
+      </w:r>
+      <w:r>
+        <w:t xml:space="preserve">više nije prikazan</w:t>
+      </w:r>
+      <w:r>
+        <w:t xml:space="preserve"> </w:t>
+      </w:r>
+      <w:r>
+        <w:t xml:space="preserve">kao aktivan, što znači da</w:t>
+      </w:r>
+      <w:r>
+        <w:t xml:space="preserve"> </w:t>
+      </w:r>
+      <w:r>
+        <w:rPr>
+          <w:rStyle w:val="VerbatimChar"/>
+        </w:rPr>
+        <w:t xml:space="preserve">SET ROLE</w:t>
+      </w:r>
+      <w:r>
+        <w:t xml:space="preserve"> </w:t>
+      </w:r>
+      <w:r>
+        <w:t xml:space="preserve">postavlja aktivan skup uloga, a ne da u njega dodaje. Upravo je</w:t>
+      </w:r>
+      <w:r>
+        <w:t xml:space="preserve"> </w:t>
+      </w:r>
+      <w:r>
+        <w:t xml:space="preserve">zbog toga sledeći nalaz suprotan očekivanju: upit nad tabelom</w:t>
+      </w:r>
+      <w:r>
+        <w:t xml:space="preserve"> </w:t>
+      </w:r>
+      <w:r>
+        <w:rPr>
+          <w:rStyle w:val="VerbatimChar"/>
+        </w:rPr>
+        <w:t xml:space="preserve">diagnoses</w:t>
+      </w:r>
+      <w:r>
+        <w:t xml:space="preserve">, čija privilegija pripada</w:t>
+      </w:r>
+      <w:r>
+        <w:t xml:space="preserve"> </w:t>
+      </w:r>
+      <w:r>
+        <w:t xml:space="preserve">ulozi</w:t>
+      </w:r>
+      <w:r>
+        <w:t xml:space="preserve"> </w:t>
+      </w:r>
+      <w:r>
+        <w:rPr>
+          <w:rStyle w:val="VerbatimChar"/>
+        </w:rPr>
+        <w:t xml:space="preserve">role_doctor</w:t>
+      </w:r>
+      <w:r>
+        <w:t xml:space="preserve">, u tom istom trenutku i dalje prolazi, jer se do te privilegije stiže obilaskom</w:t>
+      </w:r>
+      <w:r>
+        <w:t xml:space="preserve"> </w:t>
+      </w:r>
+      <w:r>
+        <w:t xml:space="preserve">grafa preko uloge</w:t>
+      </w:r>
+      <w:r>
+        <w:t xml:space="preserve"> </w:t>
+      </w:r>
+      <w:r>
+        <w:rPr>
+          <w:rStyle w:val="VerbatimChar"/>
+        </w:rPr>
+        <w:t xml:space="preserve">role_senior_doctor</w:t>
+      </w:r>
+      <w:r>
+        <w:t xml:space="preserve">, iako</w:t>
+      </w:r>
+      <w:r>
+        <w:t xml:space="preserve"> </w:t>
+      </w:r>
+      <w:r>
+        <w:rPr>
+          <w:rStyle w:val="VerbatimChar"/>
+        </w:rPr>
+        <w:t xml:space="preserve">role_doctor</w:t>
+      </w:r>
+      <w:r>
+        <w:t xml:space="preserve"> </w:t>
+      </w:r>
+      <w:r>
+        <w:t xml:space="preserve">formalno više ne stoji među aktivnim</w:t>
+      </w:r>
+      <w:r>
+        <w:t xml:space="preserve"> </w:t>
+      </w:r>
+      <w:r>
+        <w:t xml:space="preserve">ulogama.</w:t>
+      </w:r>
+      <w:r>
+        <w:t xml:space="preserve"> </w:t>
+      </w:r>
+      <w:r>
+        <w:rPr>
+          <w:rStyle w:val="VerbatimChar"/>
+        </w:rPr>
+        <w:t xml:space="preserve">CURRENT_ROLE()</w:t>
+      </w:r>
+      <w:r>
+        <w:t xml:space="preserve"> </w:t>
+      </w:r>
+      <w:r>
+        <w:t xml:space="preserve">prikazuje, drugim rečima, samo aktivan skup, ne i njegovo tranzitivno</w:t>
+      </w:r>
+      <w:r>
+        <w:t xml:space="preserve"> </w:t>
+      </w:r>
+      <w:r>
+        <w:t xml:space="preserve">zatvorenje: nasleđene uloge su na snazi, ali nevidljive, pa administrator koji doseg sesije</w:t>
+      </w:r>
+      <w:r>
+        <w:t xml:space="preserve"> </w:t>
+      </w:r>
+      <w:r>
+        <w:t xml:space="preserve">procenjuje isključivo na osnovu</w:t>
+      </w:r>
+      <w:r>
+        <w:t xml:space="preserve"> </w:t>
+      </w:r>
+      <w:r>
+        <w:rPr>
+          <w:rStyle w:val="VerbatimChar"/>
+        </w:rPr>
+        <w:t xml:space="preserve">CURRENT_ROLE()</w:t>
+      </w:r>
+      <w:r>
+        <w:t xml:space="preserve"> </w:t>
+      </w:r>
+      <w:r>
+        <w:t xml:space="preserve">taj doseg sistematski potcenjuje.</w:t>
+      </w:r>
+    </w:p>
+    <w:p>
+      <w:pPr>
+        <w:pStyle w:val="BodyText"/>
+      </w:pPr>
+      <w:r>
+        <w:t xml:space="preserve">Ovi nalazi omogućavaju da se MySQL-ove uloge ocene direktno prema tri od četiri formalna nivoa RBAC</w:t>
+      </w:r>
+      <w:r>
+        <w:t xml:space="preserve"> </w:t>
+      </w:r>
+      <w:r>
+        <w:t xml:space="preserve">modela postavljenog u drugom poglavlju</w:t>
+      </w:r>
+      <w:r>
+        <w:t xml:space="preserve"> </w:t>
+      </w:r>
+      <w:r>
+        <w:t xml:space="preserve">[3], [6]</w:t>
+      </w:r>
+      <w:r>
+        <w:t xml:space="preserve">. RBAC0, osnovna dodela uloga</w:t>
+      </w:r>
+      <w:r>
+        <w:t xml:space="preserve"> </w:t>
+      </w:r>
+      <w:r>
+        <w:t xml:space="preserve">praćena stvarnom sesijom u kojoj je na snazi samo aktivan podskup dodeljenih uloga, ostvaren je u</w:t>
+      </w:r>
+      <w:r>
+        <w:t xml:space="preserve"> </w:t>
+      </w:r>
+      <w:r>
+        <w:t xml:space="preserve">potpunosti:</w:t>
+      </w:r>
+      <w:r>
+        <w:t xml:space="preserve"> </w:t>
+      </w:r>
+      <w:r>
+        <w:rPr>
+          <w:rStyle w:val="VerbatimChar"/>
+        </w:rPr>
+        <w:t xml:space="preserve">SET ROLE</w:t>
+      </w:r>
+      <w:r>
+        <w:t xml:space="preserve"> </w:t>
+      </w:r>
+      <w:r>
+        <w:t xml:space="preserve">i</w:t>
+      </w:r>
+      <w:r>
+        <w:t xml:space="preserve"> </w:t>
+      </w:r>
+      <w:r>
+        <w:rPr>
+          <w:rStyle w:val="VerbatimChar"/>
+        </w:rPr>
+        <w:t xml:space="preserve">CURRENT_ROLE()</w:t>
+      </w:r>
+      <w:r>
+        <w:t xml:space="preserve"> </w:t>
+      </w:r>
+      <w:r>
+        <w:t xml:space="preserve">sprovode razliku između dodeljenog i aktivnog tačno onako</w:t>
+      </w:r>
+      <w:r>
+        <w:t xml:space="preserve"> </w:t>
+      </w:r>
+      <w:r>
+        <w:t xml:space="preserve">kako standard zahteva. RBAC1, hijerarhija uloga, ostvaren je samo delimično: ivice u</w:t>
+      </w:r>
+      <w:r>
+        <w:t xml:space="preserve"> </w:t>
+      </w:r>
+      <w:r>
+        <w:rPr>
+          <w:rStyle w:val="VerbatimChar"/>
+        </w:rPr>
+        <w:t xml:space="preserve">mysql.role_edges</w:t>
+      </w:r>
+      <w:r>
+        <w:t xml:space="preserve"> </w:t>
+      </w:r>
+      <w:r>
+        <w:t xml:space="preserve">nasleđivanje stvarno sprovode, izmereno kroz dva skoka u grafu (</w:t>
+      </w:r>
+      <w:r>
+        <w:rPr>
+          <w:rStyle w:val="VerbatimChar"/>
+        </w:rPr>
+        <w:t xml:space="preserve">doc_bar</w:t>
+      </w:r>
+      <w:r>
+        <w:t xml:space="preserve"> </w:t>
+      </w:r>
+      <w:r>
+        <w:t xml:space="preserve">→</w:t>
+      </w:r>
+      <w:r>
+        <w:t xml:space="preserve"> </w:t>
+      </w:r>
+      <w:r>
+        <w:rPr>
+          <w:rStyle w:val="VerbatimChar"/>
+        </w:rPr>
+        <w:t xml:space="preserve">role_senior_doctor</w:t>
+      </w:r>
+      <w:r>
+        <w:t xml:space="preserve"> </w:t>
+      </w:r>
+      <w:r>
+        <w:t xml:space="preserve">→</w:t>
+      </w:r>
+      <w:r>
+        <w:t xml:space="preserve"> </w:t>
+      </w:r>
+      <w:r>
+        <w:rPr>
+          <w:rStyle w:val="VerbatimChar"/>
+        </w:rPr>
+        <w:t xml:space="preserve">role_doctor</w:t>
+      </w:r>
+      <w:r>
+        <w:t xml:space="preserve">), ali priručnik nigde ne zabranjuje ciklus u tom grafu</w:t>
+      </w:r>
+      <w:r>
+        <w:t xml:space="preserve"> </w:t>
+      </w:r>
+      <w:r>
+        <w:t xml:space="preserve">[2]</w:t>
+      </w:r>
+      <w:r>
+        <w:t xml:space="preserve">, dok RBAC1 zahteva da hijerarhija bude parcijalno uređenje, odnosno aciklički odnos;</w:t>
+      </w:r>
+      <w:r>
+        <w:t xml:space="preserve"> </w:t>
+      </w:r>
+      <w:r>
+        <w:rPr>
+          <w:rStyle w:val="VerbatimChar"/>
+        </w:rPr>
+        <w:t xml:space="preserve">mysql.role_edges</w:t>
+      </w:r>
+      <w:r>
+        <w:t xml:space="preserve"> </w:t>
+      </w:r>
+      <w:r>
+        <w:t xml:space="preserve">je, dakle, običan usmeren graf, ne formalno parcijalno uređenje, pa je tačnije reći</w:t>
+      </w:r>
+      <w:r>
+        <w:t xml:space="preserve"> </w:t>
+      </w:r>
+      <w:r>
+        <w:t xml:space="preserve">da je RBAC1 ostvaren delimično zbog odsustva te garancije, ne da MySQL nema hijerarhiju uloga uopšte,</w:t>
+      </w:r>
+      <w:r>
+        <w:t xml:space="preserve"> </w:t>
+      </w:r>
+      <w:r>
+        <w:t xml:space="preserve">jer nasleđivanje demonstrativno postoji i radi. RBAC2, ograničenja poput razdvajanja dužnosti, nije</w:t>
+      </w:r>
+      <w:r>
+        <w:t xml:space="preserve"> </w:t>
+      </w:r>
+      <w:r>
+        <w:t xml:space="preserve">ostvaren: MySQL nema mehanizam koji bi sprečio da isti nalog istovremeno drži dve međusobno sukobljene</w:t>
+      </w:r>
+      <w:r>
+        <w:t xml:space="preserve"> </w:t>
+      </w:r>
+      <w:r>
+        <w:t xml:space="preserve">uloge, i to odsustvo je strukturno, ne slučajno, jer uloga i nalog dele isti tip objekta u</w:t>
+      </w:r>
+      <w:r>
+        <w:t xml:space="preserve"> </w:t>
+      </w:r>
+      <w:r>
+        <w:rPr>
+          <w:rStyle w:val="VerbatimChar"/>
+        </w:rPr>
+        <w:t xml:space="preserve">mysql.user</w:t>
+      </w:r>
+      <w:r>
+        <w:t xml:space="preserve">, pa ne postoji zasebno mesto u modelu na koje bi se takvo ograničenje uopšte moglo</w:t>
+      </w:r>
+      <w:r>
+        <w:t xml:space="preserve"> </w:t>
+      </w:r>
+      <w:r>
+        <w:t xml:space="preserve">zakačiti.</w:t>
+      </w:r>
+    </w:p>
+    <w:p>
+      <w:pPr>
+        <w:pStyle w:val="BodyText"/>
+      </w:pPr>
+      <w:r>
+        <w:t xml:space="preserve">Ovo poglavlje potvrđuje jednu stranu teze postavljene u uvodu na sopstvenom terenu: MySQL-ov sistem</w:t>
+      </w:r>
+      <w:r>
+        <w:t xml:space="preserve"> </w:t>
+      </w:r>
+      <w:r>
+        <w:t xml:space="preserve">privilegija ostaje diskrecion u osnovi, svaka privilegija je i dalje red u tabeli koji vlasnik ili</w:t>
+      </w:r>
+      <w:r>
+        <w:t xml:space="preserve"> </w:t>
+      </w:r>
+      <w:r>
+        <w:t xml:space="preserve">neko sa</w:t>
+      </w:r>
+      <w:r>
+        <w:t xml:space="preserve"> </w:t>
+      </w:r>
+      <w:r>
+        <w:rPr>
+          <w:rStyle w:val="VerbatimChar"/>
+        </w:rPr>
+        <w:t xml:space="preserve">GRANT OPTION</w:t>
+      </w:r>
+      <w:r>
+        <w:t xml:space="preserve"> </w:t>
+      </w:r>
+      <w:r>
+        <w:t xml:space="preserve">dodeljuje, a uloge ne uvode novi mehanizam kontrole pristupa, nego graf nad</w:t>
+      </w:r>
+      <w:r>
+        <w:t xml:space="preserve"> </w:t>
+      </w:r>
+      <w:r>
+        <w:t xml:space="preserve">istim, diskrecionim redovima. RBAC0 se time sastavlja u potpunosti, RBAC1 delimično, dok RBAC2 ostaje</w:t>
+      </w:r>
+      <w:r>
+        <w:t xml:space="preserve"> </w:t>
+      </w:r>
+      <w:r>
+        <w:t xml:space="preserve">van dometa samog sistema privilegija i mora se, ako je organizaciji potreban, sprovesti izvan same</w:t>
+      </w:r>
+      <w:r>
+        <w:t xml:space="preserve"> </w:t>
+      </w:r>
+      <w:r>
+        <w:t xml:space="preserve">baze podataka, na primer procesom koji pre svakog</w:t>
+      </w:r>
+      <w:r>
+        <w:t xml:space="preserve"> </w:t>
+      </w:r>
+      <w:r>
+        <w:rPr>
+          <w:rStyle w:val="VerbatimChar"/>
+        </w:rPr>
+        <w:t xml:space="preserve">GRANT</w:t>
+      </w:r>
+      <w:r>
+        <w:t xml:space="preserve">-a proverava da li nalogu već pripada</w:t>
+      </w:r>
+      <w:r>
+        <w:t xml:space="preserve"> </w:t>
+      </w:r>
+      <w:r>
+        <w:t xml:space="preserve">sukobljena uloga.</w:t>
+      </w:r>
+    </w:p>
+    <w:bookmarkStart w:id="30" w:name="refs"/>
+    <w:bookmarkStart w:id="20" w:name="ref-ramakrishnan2003"/>
     <w:p>
       <w:pPr>
         <w:pStyle w:val="Bibliography"/>
@@ -1495,8 +3340,8 @@
         <w:t xml:space="preserve">, 3rd ed. New York, NY, USA: McGraw-Hill, 2003.</w:t>
       </w:r>
     </w:p>
-    <w:bookmarkEnd w:id="13"/>
-    <w:bookmarkStart w:id="15" w:name="ref-mysql84refman"/>
+    <w:bookmarkEnd w:id="20"/>
+    <w:bookmarkStart w:id="22" w:name="ref-mysql84refman"/>
     <w:p>
       <w:pPr>
         <w:pStyle w:val="Bibliography"/>
@@ -1531,7 +3376,7 @@
       <w:r>
         <w:t xml:space="preserve"> </w:t>
       </w:r>
-      <w:hyperlink r:id="rId14">
+      <w:hyperlink r:id="rId21">
         <w:r>
           <w:rPr>
             <w:rStyle w:val="Hyperlink"/>
@@ -1543,8 +3388,8 @@
         <w:t xml:space="preserve">, 2024.</w:t>
       </w:r>
     </w:p>
-    <w:bookmarkEnd w:id="15"/>
-    <w:bookmarkStart w:id="17" w:name="ref-sandhu1996"/>
+    <w:bookmarkEnd w:id="22"/>
+    <w:bookmarkStart w:id="24" w:name="ref-sandhu1996"/>
     <w:p>
       <w:pPr>
         <w:pStyle w:val="Bibliography"/>
@@ -1583,7 +3428,7 @@
       <w:r>
         <w:t xml:space="preserve"> </w:t>
       </w:r>
-      <w:hyperlink r:id="rId16">
+      <w:hyperlink r:id="rId23">
         <w:r>
           <w:rPr>
             <w:rStyle w:val="Hyperlink"/>
@@ -1595,8 +3440,8 @@
         <w:t xml:space="preserve">.</w:t>
       </w:r>
     </w:p>
-    <w:bookmarkEnd w:id="17"/>
-    <w:bookmarkStart w:id="18" w:name="ref-bell1973"/>
+    <w:bookmarkEnd w:id="24"/>
+    <w:bookmarkStart w:id="25" w:name="ref-bell1973"/>
     <w:p>
       <w:pPr>
         <w:pStyle w:val="Bibliography"/>
@@ -1626,8 +3471,8 @@
         <w:t xml:space="preserve">The MITRE Corporation, Bedford, MA, USA, MTR-2547, Vol. I, 1973.</w:t>
       </w:r>
     </w:p>
-    <w:bookmarkEnd w:id="18"/>
-    <w:bookmarkStart w:id="19" w:name="ref-ferraiolokuhn1992"/>
+    <w:bookmarkEnd w:id="25"/>
+    <w:bookmarkStart w:id="26" w:name="ref-ferraiolokuhn1992"/>
     <w:p>
       <w:pPr>
         <w:pStyle w:val="Bibliography"/>
@@ -1670,8 +3515,8 @@
         <w:t xml:space="preserve">, Baltimore, MD, USA, 1992, pp. 554–563.</w:t>
       </w:r>
     </w:p>
-    <w:bookmarkEnd w:id="19"/>
-    <w:bookmarkStart w:id="20" w:name="ref-incits2004"/>
+    <w:bookmarkEnd w:id="26"/>
+    <w:bookmarkStart w:id="27" w:name="ref-incits2004"/>
     <w:p>
       <w:pPr>
         <w:pStyle w:val="Bibliography"/>
@@ -1710,8 +3555,8 @@
         <w:t xml:space="preserve">ANSI/INCITS Standard, 2004.</w:t>
       </w:r>
     </w:p>
-    <w:bookmarkEnd w:id="20"/>
-    <w:bookmarkStart w:id="22" w:name="ref-saltzerschroeder1975"/>
+    <w:bookmarkEnd w:id="27"/>
+    <w:bookmarkStart w:id="29" w:name="ref-saltzerschroeder1975"/>
     <w:p>
       <w:pPr>
         <w:pStyle w:val="Bibliography"/>
@@ -1750,7 +3595,7 @@
       <w:r>
         <w:t xml:space="preserve"> </w:t>
       </w:r>
-      <w:hyperlink r:id="rId21">
+      <w:hyperlink r:id="rId28">
         <w:r>
           <w:rPr>
             <w:rStyle w:val="Hyperlink"/>
@@ -1762,9 +3607,9 @@
         <w:t xml:space="preserve">.</w:t>
       </w:r>
     </w:p>
-    <w:bookmarkEnd w:id="22"/>
-    <w:bookmarkEnd w:id="23"/>
-    <w:bookmarkEnd w:id="24"/>
+    <w:bookmarkEnd w:id="29"/>
+    <w:bookmarkEnd w:id="30"/>
+    <w:bookmarkEnd w:id="31"/>
     <w:sectPr>
       <w:pgSz w:h="16838" w:w="11906"/>
       <w:pgMar w:bottom="1417" w:footer="708" w:gutter="0" w:header="708" w:left="1417" w:right="1417" w:top="1417"/>

</xml_diff>

<commit_message>
Ch. 4 FGAC i RLS: write chapter, two figures, make-pair-figure.ps1
- rad.md \u00a74: column privileges as the granularity ceiling, the 1142/1143
  message-content distinction (corrected against the manual, not the memo's
  claim), the live-verified SELECT * non-bypass with a version caveat, views
  as the FGAC mechanism (DEFINER/INVOKER, USER()/CURRENT_USER() split,
  orphan-DEFINER behaviour, WITH CHECK OPTION), three RLS emulation patterns
  closing on "filtering is not authorization", PostgreSQL/Oracle contrast.
- tools/make-pair-figure.ps1: new shared result/error-pair figure script
  (asserts both sides live against the server), first used for Figure 4.1.
- figures/04-fgac-02-rls-obrasci.png: Mermaid diagram of the three RLS
  emulation patterns and their failure modes (visualize skill).
- references.bib: postgresrls2024, oraclevpd2024, mysqlbug41354.
- learning-records/0005 closed out; figures/README.md's script table filled in.

Ticket 17 (Chapter 4. FGAC i RLS).
</commit_message>
<xml_diff>
--- a/Tema 2. - Kontrola pristupa i sigurnosni modeli u MySQL bazi podataka/rad.docx
+++ b/Tema 2. - Kontrola pristupa i sigurnosni modeli u MySQL bazi podataka/rad.docx
@@ -1464,7 +1464,7 @@
       </w:r>
     </w:p>
     <w:bookmarkEnd w:id="13"/>
-    <w:bookmarkStart w:id="31" w:name="sistem-privilegija-i-uloga-u-mysql-u"/>
+    <w:bookmarkStart w:id="20" w:name="sistem-privilegija-i-uloga-u-mysql-u"/>
     <w:p>
       <w:pPr>
         <w:pStyle w:val="Heading1"/>
@@ -3308,8 +3308,1919 @@
         <w:t xml:space="preserve">sukobljena uloga.</w:t>
       </w:r>
     </w:p>
-    <w:bookmarkStart w:id="30" w:name="refs"/>
-    <w:bookmarkStart w:id="20" w:name="ref-ramakrishnan2003"/>
+    <w:bookmarkEnd w:id="20"/>
+    <w:bookmarkStart w:id="46" w:name="Xbacea6b3d9068ea7a0d4d1d0689f519780bd501"/>
+    <w:p>
+      <w:pPr>
+        <w:pStyle w:val="Heading1"/>
+      </w:pPr>
+      <w:r>
+        <w:t xml:space="preserve">4. Fino-granularna kontrola pristupa i red-level security</w:t>
+      </w:r>
+    </w:p>
+    <w:p>
+      <w:pPr>
+        <w:pStyle w:val="FirstParagraph"/>
+      </w:pPr>
+      <w:r>
+        <w:t xml:space="preserve">Privilegija u MySQL-u može imenovati najviše kolonu; ništa iznad tog nivoa arnosti u šemi tabela</w:t>
+      </w:r>
+      <w:r>
+        <w:t xml:space="preserve"> </w:t>
+      </w:r>
+      <w:r>
+        <w:t xml:space="preserve">dodele prava ne postoji</w:t>
+      </w:r>
+      <w:r>
+        <w:t xml:space="preserve"> </w:t>
+      </w:r>
+      <w:r>
+        <w:t xml:space="preserve">[2]</w:t>
+      </w:r>
+      <w:r>
+        <w:t xml:space="preserve">.</w:t>
+      </w:r>
+      <w:r>
+        <w:t xml:space="preserve"> </w:t>
+      </w:r>
+      <w:r>
+        <w:rPr>
+          <w:rStyle w:val="VerbatimChar"/>
+        </w:rPr>
+        <w:t xml:space="preserve">mysql.columns_priv</w:t>
+      </w:r>
+      <w:r>
+        <w:t xml:space="preserve"> </w:t>
+      </w:r>
+      <w:r>
+        <w:t xml:space="preserve">dodaje koloni</w:t>
+      </w:r>
+      <w:r>
+        <w:t xml:space="preserve"> </w:t>
+      </w:r>
+      <w:r>
+        <w:rPr>
+          <w:rStyle w:val="VerbatimChar"/>
+        </w:rPr>
+        <w:t xml:space="preserve">Column_name</w:t>
+      </w:r>
+      <w:r>
+        <w:t xml:space="preserve"> </w:t>
+      </w:r>
+      <w:r>
+        <w:t xml:space="preserve">uz</w:t>
+      </w:r>
+      <w:r>
+        <w:t xml:space="preserve"> </w:t>
+      </w:r>
+      <w:r>
+        <w:rPr>
+          <w:rStyle w:val="VerbatimChar"/>
+        </w:rPr>
+        <w:t xml:space="preserve">Table_name</w:t>
+      </w:r>
+      <w:r>
+        <w:t xml:space="preserve">, pa dozvoljava dodelu tačno određenih tipova prava,</w:t>
+      </w:r>
+      <w:r>
+        <w:t xml:space="preserve"> </w:t>
+      </w:r>
+      <w:r>
+        <w:rPr>
+          <w:rStyle w:val="VerbatimChar"/>
+        </w:rPr>
+        <w:t xml:space="preserve">SELECT</w:t>
+      </w:r>
+      <w:r>
+        <w:t xml:space="preserve">,</w:t>
+      </w:r>
+      <w:r>
+        <w:t xml:space="preserve"> </w:t>
+      </w:r>
+      <w:r>
+        <w:rPr>
+          <w:rStyle w:val="VerbatimChar"/>
+        </w:rPr>
+        <w:t xml:space="preserve">INSERT</w:t>
+      </w:r>
+      <w:r>
+        <w:t xml:space="preserve">,</w:t>
+      </w:r>
+      <w:r>
+        <w:t xml:space="preserve"> </w:t>
+      </w:r>
+      <w:r>
+        <w:rPr>
+          <w:rStyle w:val="VerbatimChar"/>
+        </w:rPr>
+        <w:t xml:space="preserve">UPDATE</w:t>
+      </w:r>
+      <w:r>
+        <w:t xml:space="preserve"> </w:t>
+      </w:r>
+      <w:r>
+        <w:t xml:space="preserve">i</w:t>
+      </w:r>
+      <w:r>
+        <w:t xml:space="preserve"> </w:t>
+      </w:r>
+      <w:r>
+        <w:rPr>
+          <w:rStyle w:val="VerbatimChar"/>
+        </w:rPr>
+        <w:t xml:space="preserve">REFERENCES</w:t>
+      </w:r>
+      <w:r>
+        <w:t xml:space="preserve">, nad pojedinačnom kolonom</w:t>
+      </w:r>
+      <w:r>
+        <w:t xml:space="preserve"> </w:t>
+      </w:r>
+      <w:r>
+        <w:t xml:space="preserve">[2]</w:t>
+      </w:r>
+      <w:r>
+        <w:t xml:space="preserve">. To je, kao što je prethodno poglavlje</w:t>
+      </w:r>
+      <w:r>
+        <w:t xml:space="preserve"> </w:t>
+      </w:r>
+      <w:r>
+        <w:t xml:space="preserve">pokazalo za nivo tabele, direktna posledica raspoloživih kolona identifikacije u grant tabelama, ne</w:t>
+      </w:r>
+      <w:r>
+        <w:t xml:space="preserve"> </w:t>
+      </w:r>
+      <w:r>
+        <w:t xml:space="preserve">proizvoljno ograničenje: sistem privilegija nema nijedno mesto na kome bi upisao predikat, vremenski</w:t>
+      </w:r>
+      <w:r>
+        <w:t xml:space="preserve"> </w:t>
+      </w:r>
+      <w:r>
+        <w:t xml:space="preserve">prozor ili izračunati izraz, pa granularnost staje tačno na koloni. Kolona je, drugim rečima, plafon</w:t>
+      </w:r>
+      <w:r>
+        <w:t xml:space="preserve"> </w:t>
+      </w:r>
+      <w:r>
+        <w:t xml:space="preserve">fino-granularne kontrole pristupa koju MySQL sprovodi izvorno, ne jedan nivo među više njih.</w:t>
+      </w:r>
+    </w:p>
+    <w:p>
+      <w:pPr>
+        <w:pStyle w:val="BodyText"/>
+      </w:pPr>
+      <w:r>
+        <w:t xml:space="preserve">Server pri odbijanju kolonske privilegije baca grešku</w:t>
+      </w:r>
+      <w:r>
+        <w:t xml:space="preserve"> </w:t>
+      </w:r>
+      <w:r>
+        <w:rPr>
+          <w:rStyle w:val="VerbatimChar"/>
+        </w:rPr>
+        <w:t xml:space="preserve">ERROR 1143</w:t>
+      </w:r>
+      <w:r>
+        <w:t xml:space="preserve">, koja se razlikuje od</w:t>
+      </w:r>
+      <w:r>
+        <w:t xml:space="preserve"> </w:t>
+      </w:r>
+      <w:r>
+        <w:rPr>
+          <w:rStyle w:val="VerbatimChar"/>
+        </w:rPr>
+        <w:t xml:space="preserve">ERROR 1142</w:t>
+      </w:r>
+      <w:r>
+        <w:t xml:space="preserve"> </w:t>
+      </w:r>
+      <w:r>
+        <w:t xml:space="preserve">za odbijenu tabelsku privilegiju ne samo brojem nego i sadržajem poruke: obe greške imenuju tabelu nad</w:t>
+      </w:r>
+      <w:r>
+        <w:t xml:space="preserve"> </w:t>
+      </w:r>
+      <w:r>
+        <w:t xml:space="preserve">kojom je zahtev odbijen, ali</w:t>
+      </w:r>
+      <w:r>
+        <w:t xml:space="preserve"> </w:t>
+      </w:r>
+      <w:r>
+        <w:rPr>
+          <w:rStyle w:val="VerbatimChar"/>
+        </w:rPr>
+        <w:t xml:space="preserve">1143</w:t>
+      </w:r>
+      <w:r>
+        <w:t xml:space="preserve"> </w:t>
+      </w:r>
+      <w:r>
+        <w:t xml:space="preserve">uz to imenuje i tačan naziv kolone</w:t>
+      </w:r>
+      <w:r>
+        <w:t xml:space="preserve"> </w:t>
+      </w:r>
+      <w:r>
+        <w:t xml:space="preserve">[2]</w:t>
+      </w:r>
+      <w:r>
+        <w:t xml:space="preserve">. Ta razlika</w:t>
+      </w:r>
+      <w:r>
+        <w:t xml:space="preserve"> </w:t>
+      </w:r>
+      <w:r>
+        <w:t xml:space="preserve">nosi bezbednosnu posledicu, jer poruka greške sama po sebi otkriva da tražena kolona postoji u šemi,</w:t>
+      </w:r>
+      <w:r>
+        <w:t xml:space="preserve"> </w:t>
+      </w:r>
+      <w:r>
+        <w:t xml:space="preserve">čak i nalogu koji na nju nema pravo. Na serveru rada (verzija 8.4.11) ovo je izmereno na nalogu</w:t>
+      </w:r>
+      <w:r>
+        <w:t xml:space="preserve"> </w:t>
+      </w:r>
+      <w:r>
+        <w:rPr>
+          <w:rStyle w:val="VerbatimChar"/>
+        </w:rPr>
+        <w:t xml:space="preserve">nurse_podgorica</w:t>
+      </w:r>
+      <w:r>
+        <w:t xml:space="preserve"> </w:t>
+      </w:r>
+      <w:r>
+        <w:t xml:space="preserve">iz sandbox okruženja</w:t>
+      </w:r>
+      <w:r>
+        <w:t xml:space="preserve"> </w:t>
+      </w:r>
+      <w:r>
+        <w:t xml:space="preserve">rada, kome je dodeljeno</w:t>
+      </w:r>
+      <w:r>
+        <w:t xml:space="preserve"> </w:t>
+      </w:r>
+      <w:r>
+        <w:rPr>
+          <w:rStyle w:val="VerbatimChar"/>
+        </w:rPr>
+        <w:t xml:space="preserve">SELECT</w:t>
+      </w:r>
+      <w:r>
+        <w:t xml:space="preserve"> </w:t>
+      </w:r>
+      <w:r>
+        <w:t xml:space="preserve">nad kolonama</w:t>
+      </w:r>
+      <w:r>
+        <w:t xml:space="preserve"> </w:t>
+      </w:r>
+      <w:r>
+        <w:rPr>
+          <w:rStyle w:val="VerbatimChar"/>
+        </w:rPr>
+        <w:t xml:space="preserve">diagnosis_id</w:t>
+      </w:r>
+      <w:r>
+        <w:t xml:space="preserve">,</w:t>
+      </w:r>
+      <w:r>
+        <w:t xml:space="preserve"> </w:t>
+      </w:r>
+      <w:r>
+        <w:rPr>
+          <w:rStyle w:val="VerbatimChar"/>
+        </w:rPr>
+        <w:t xml:space="preserve">visit_id</w:t>
+      </w:r>
+      <w:r>
+        <w:t xml:space="preserve">,</w:t>
+      </w:r>
+      <w:r>
+        <w:t xml:space="preserve"> </w:t>
+      </w:r>
+      <w:r>
+        <w:rPr>
+          <w:rStyle w:val="VerbatimChar"/>
+        </w:rPr>
+        <w:t xml:space="preserve">tenant_id</w:t>
+      </w:r>
+      <w:r>
+        <w:t xml:space="preserve"> </w:t>
+      </w:r>
+      <w:r>
+        <w:t xml:space="preserve">i</w:t>
+      </w:r>
+      <w:r>
+        <w:t xml:space="preserve"> </w:t>
+      </w:r>
+      <w:r>
+        <w:rPr>
+          <w:rStyle w:val="VerbatimChar"/>
+        </w:rPr>
+        <w:t xml:space="preserve">icd_code</w:t>
+      </w:r>
+      <w:r>
+        <w:t xml:space="preserve"> </w:t>
+      </w:r>
+      <w:r>
+        <w:t xml:space="preserve">tabele</w:t>
+      </w:r>
+      <w:r>
+        <w:t xml:space="preserve"> </w:t>
+      </w:r>
+      <w:r>
+        <w:rPr>
+          <w:rStyle w:val="VerbatimChar"/>
+        </w:rPr>
+        <w:t xml:space="preserve">diagnoses</w:t>
+      </w:r>
+      <w:r>
+        <w:t xml:space="preserve">, ali ne i nad kolonom</w:t>
+      </w:r>
+      <w:r>
+        <w:t xml:space="preserve"> </w:t>
+      </w:r>
+      <w:r>
+        <w:rPr>
+          <w:rStyle w:val="VerbatimChar"/>
+        </w:rPr>
+        <w:t xml:space="preserve">diagnosis_text</w:t>
+      </w:r>
+      <w:r>
+        <w:t xml:space="preserve">. Upit koji čita samo dodeljene</w:t>
+      </w:r>
+      <w:r>
+        <w:t xml:space="preserve"> </w:t>
+      </w:r>
+      <w:r>
+        <w:t xml:space="preserve">kolone prolazi bez greške; upit koji čita</w:t>
+      </w:r>
+      <w:r>
+        <w:t xml:space="preserve"> </w:t>
+      </w:r>
+      <w:r>
+        <w:rPr>
+          <w:rStyle w:val="VerbatimChar"/>
+        </w:rPr>
+        <w:t xml:space="preserve">diagnosis_text</w:t>
+      </w:r>
+      <w:r>
+        <w:t xml:space="preserve"> </w:t>
+      </w:r>
+      <w:r>
+        <w:t xml:space="preserve">pada sa</w:t>
+      </w:r>
+      <w:r>
+        <w:t xml:space="preserve"> </w:t>
+      </w:r>
+      <w:r>
+        <w:rPr>
+          <w:rStyle w:val="VerbatimChar"/>
+        </w:rPr>
+        <w:t xml:space="preserve">ERROR 1143</w:t>
+      </w:r>
+      <w:r>
+        <w:t xml:space="preserve">, uz tačan naziv kolone</w:t>
+      </w:r>
+      <w:r>
+        <w:t xml:space="preserve"> </w:t>
+      </w:r>
+      <w:r>
+        <w:t xml:space="preserve">u tekstu poruke. Slika 4.1 prikazuje oba ishoda iz iste sesije, kao dokaz sprovođenja, ne kao</w:t>
+      </w:r>
+      <w:r>
+        <w:t xml:space="preserve"> </w:t>
+      </w:r>
+      <w:r>
+        <w:t xml:space="preserve">konfiguraciju.</w:t>
+      </w:r>
+    </w:p>
+    <w:p>
+      <w:pPr>
+        <w:pStyle w:val="CaptionedFigure"/>
+      </w:pPr>
+      <w:r>
+        <w:drawing>
+          <wp:inline>
+            <wp:extent cx="4890135" cy="1210890"/>
+            <wp:effectExtent b="0" l="0" r="0" t="0"/>
+            <wp:docPr descr="Slika 4.1: Kolonska privilegija naloga nurse_podgorica, dozvoljena i odbijena kolona" title="" id="22" name="Picture"/>
+            <a:graphic>
+              <a:graphicData uri="http://schemas.openxmlformats.org/drawingml/2006/picture">
+                <pic:pic>
+                  <pic:nvPicPr>
+                    <pic:cNvPr descr="figures/04-fgac-01-kolonska-privilegija.png" id="23" name="Picture"/>
+                    <pic:cNvPicPr>
+                      <a:picLocks noChangeArrowheads="1" noChangeAspect="1"/>
+                    </pic:cNvPicPr>
+                  </pic:nvPicPr>
+                  <pic:blipFill>
+                    <a:blip r:embed="rId21"/>
+                    <a:stretch>
+                      <a:fillRect/>
+                    </a:stretch>
+                  </pic:blipFill>
+                  <pic:spPr bwMode="auto">
+                    <a:xfrm>
+                      <a:off x="0" y="0"/>
+                      <a:ext cx="4890135" cy="1210890"/>
+                    </a:xfrm>
+                    <a:prstGeom prst="rect">
+                      <a:avLst/>
+                    </a:prstGeom>
+                    <a:noFill/>
+                    <a:ln w="9525">
+                      <a:noFill/>
+                      <a:headEnd/>
+                      <a:tailEnd/>
+                    </a:ln>
+                  </pic:spPr>
+                </pic:pic>
+              </a:graphicData>
+            </a:graphic>
+          </wp:inline>
+        </w:drawing>
+      </w:r>
+    </w:p>
+    <w:p>
+      <w:pPr>
+        <w:pStyle w:val="ImageCaption"/>
+      </w:pPr>
+      <w:r>
+        <w:t xml:space="preserve">Slika 4.1: Kolonska privilegija naloga nurse_podgorica, dozvoljena i odbijena kolona</w:t>
+      </w:r>
+    </w:p>
+    <w:p>
+      <w:pPr>
+        <w:pStyle w:val="BodyText"/>
+      </w:pPr>
+      <w:r>
+        <w:t xml:space="preserve">Ranija prijava greške iz 2009. godine tvrdila je da</w:t>
+      </w:r>
+      <w:r>
+        <w:t xml:space="preserve"> </w:t>
+      </w:r>
+      <w:r>
+        <w:rPr>
+          <w:rStyle w:val="VerbatimChar"/>
+        </w:rPr>
+        <w:t xml:space="preserve">SELECT *</w:t>
+      </w:r>
+      <w:r>
+        <w:t xml:space="preserve"> </w:t>
+      </w:r>
+      <w:r>
+        <w:t xml:space="preserve">zaobilazi kolonsku privilegiju i vraća</w:t>
+      </w:r>
+      <w:r>
+        <w:t xml:space="preserve"> </w:t>
+      </w:r>
+      <w:r>
+        <w:t xml:space="preserve">sve kolone tabele, uključujući one koje nalogu nikada nisu dodeljene</w:t>
+      </w:r>
+      <w:r>
+        <w:t xml:space="preserve"> </w:t>
+      </w:r>
+      <w:r>
+        <w:t xml:space="preserve">[8]</w:t>
+      </w:r>
+      <w:r>
+        <w:t xml:space="preserve">. Na serveru rada</w:t>
+      </w:r>
+      <w:r>
+        <w:t xml:space="preserve"> </w:t>
+      </w:r>
+      <w:r>
+        <w:t xml:space="preserve">ovo nije reprodukovano:</w:t>
+      </w:r>
+      <w:r>
+        <w:t xml:space="preserve"> </w:t>
+      </w:r>
+      <w:r>
+        <w:rPr>
+          <w:rStyle w:val="VerbatimChar"/>
+        </w:rPr>
+        <w:t xml:space="preserve">SELECT *</w:t>
+      </w:r>
+      <w:r>
+        <w:t xml:space="preserve"> </w:t>
+      </w:r>
+      <w:r>
+        <w:t xml:space="preserve">nad tabelom</w:t>
+      </w:r>
+      <w:r>
+        <w:t xml:space="preserve"> </w:t>
+      </w:r>
+      <w:r>
+        <w:rPr>
+          <w:rStyle w:val="VerbatimChar"/>
+        </w:rPr>
+        <w:t xml:space="preserve">diagnoses</w:t>
+      </w:r>
+      <w:r>
+        <w:t xml:space="preserve"> </w:t>
+      </w:r>
+      <w:r>
+        <w:t xml:space="preserve">kao</w:t>
+      </w:r>
+      <w:r>
+        <w:t xml:space="preserve"> </w:t>
+      </w:r>
+      <w:r>
+        <w:rPr>
+          <w:rStyle w:val="VerbatimChar"/>
+        </w:rPr>
+        <w:t xml:space="preserve">nurse_podgorica</w:t>
+      </w:r>
+      <w:r>
+        <w:t xml:space="preserve"> </w:t>
+      </w:r>
+      <w:r>
+        <w:t xml:space="preserve">ne vraća nedodeljene</w:t>
+      </w:r>
+      <w:r>
+        <w:t xml:space="preserve"> </w:t>
+      </w:r>
+      <w:r>
+        <w:t xml:space="preserve">kolone, nego pada sa</w:t>
+      </w:r>
+      <w:r>
+        <w:t xml:space="preserve"> </w:t>
+      </w:r>
+      <w:r>
+        <w:rPr>
+          <w:rStyle w:val="VerbatimChar"/>
+        </w:rPr>
+        <w:t xml:space="preserve">ERROR 1142</w:t>
+      </w:r>
+      <w:r>
+        <w:t xml:space="preserve">, jer nalog nema privilegiju nad tabelom kao celinom, samo nad</w:t>
+      </w:r>
+      <w:r>
+        <w:t xml:space="preserve"> </w:t>
+      </w:r>
+      <w:r>
+        <w:t xml:space="preserve">navedenim podskupom njenih kolona. Ovo tvrđenje se, dakle, ne prenosi u ovaj rad bez ograde na verziju:</w:t>
+      </w:r>
+      <w:r>
+        <w:t xml:space="preserve"> </w:t>
+      </w:r>
+      <w:r>
+        <w:t xml:space="preserve">ono što je 2009. godine bilo tiho curenje podataka, na MySQL-u 8.4 je otvoreno odbijanje pristupa,</w:t>
+      </w:r>
+      <w:r>
+        <w:t xml:space="preserve"> </w:t>
+      </w:r>
+      <w:r>
+        <w:t xml:space="preserve">verovatno posledica prepravke provere pristupa po zahtevu opisane u prethodnom poglavlju.</w:t>
+      </w:r>
+    </w:p>
+    <w:bookmarkStart w:id="24" w:name="Xacfde3bf36328dac0435cd757ccec22c47aa97d"/>
+    <w:p>
+      <w:pPr>
+        <w:pStyle w:val="Heading2"/>
+      </w:pPr>
+      <w:r>
+        <w:t xml:space="preserve">Pogledi kao mehanizam fino-granularne kontrole</w:t>
+      </w:r>
+    </w:p>
+    <w:p>
+      <w:pPr>
+        <w:pStyle w:val="FirstParagraph"/>
+      </w:pPr>
+      <w:r>
+        <w:t xml:space="preserve">Pošto privilegija ne može imenovati predikat, jedini objekat u MySQL-u koji predikat uopšte može da</w:t>
+      </w:r>
+      <w:r>
+        <w:t xml:space="preserve"> </w:t>
+      </w:r>
+      <w:r>
+        <w:t xml:space="preserve">nosi jeste pogled:</w:t>
+      </w:r>
+      <w:r>
+        <w:t xml:space="preserve"> </w:t>
+      </w:r>
+      <w:r>
+        <w:rPr>
+          <w:rStyle w:val="VerbatimChar"/>
+        </w:rPr>
+        <w:t xml:space="preserve">WHERE</w:t>
+      </w:r>
+      <w:r>
+        <w:t xml:space="preserve"> </w:t>
+      </w:r>
+      <w:r>
+        <w:t xml:space="preserve">klauzula u definiciji pogleda je predikat kome je dat naziv, i taj naziv se</w:t>
+      </w:r>
+      <w:r>
+        <w:t xml:space="preserve"> </w:t>
+      </w:r>
+      <w:r>
+        <w:t xml:space="preserve">potom može dodeliti kao objekat na koji se privilegija odnosi</w:t>
+      </w:r>
+      <w:r>
+        <w:t xml:space="preserve"> </w:t>
+      </w:r>
+      <w:r>
+        <w:t xml:space="preserve">[2]</w:t>
+      </w:r>
+      <w:r>
+        <w:t xml:space="preserve">. Ova osobina čini</w:t>
+      </w:r>
+      <w:r>
+        <w:t xml:space="preserve"> </w:t>
+      </w:r>
+      <w:r>
+        <w:t xml:space="preserve">pogled jedinim mostom između sistema privilegija, koji radi isključivo sa imenovanim objektima, i</w:t>
+      </w:r>
+      <w:r>
+        <w:t xml:space="preserve"> </w:t>
+      </w:r>
+      <w:r>
+        <w:t xml:space="preserve">bilo kakvog filtriranja po vrednosti reda.</w:t>
+      </w:r>
+    </w:p>
+    <w:p>
+      <w:pPr>
+        <w:pStyle w:val="BodyText"/>
+      </w:pPr>
+      <w:r>
+        <w:t xml:space="preserve">Karakteristika</w:t>
+      </w:r>
+      <w:r>
+        <w:t xml:space="preserve"> </w:t>
+      </w:r>
+      <w:r>
+        <w:rPr>
+          <w:rStyle w:val="VerbatimChar"/>
+        </w:rPr>
+        <w:t xml:space="preserve">SQL SECURITY</w:t>
+      </w:r>
+      <w:r>
+        <w:t xml:space="preserve">, podrazumevano</w:t>
+      </w:r>
+      <w:r>
+        <w:t xml:space="preserve"> </w:t>
+      </w:r>
+      <w:r>
+        <w:rPr>
+          <w:rStyle w:val="VerbatimChar"/>
+        </w:rPr>
+        <w:t xml:space="preserve">DEFINER</w:t>
+      </w:r>
+      <w:r>
+        <w:t xml:space="preserve">, određuje čije se privilegije proveravaju kada</w:t>
+      </w:r>
+      <w:r>
+        <w:t xml:space="preserve"> </w:t>
+      </w:r>
+      <w:r>
+        <w:t xml:space="preserve">se pogled izvrši, ne kada je definisan</w:t>
+      </w:r>
+      <w:r>
+        <w:t xml:space="preserve"> </w:t>
+      </w:r>
+      <w:r>
+        <w:t xml:space="preserve">[2]</w:t>
+      </w:r>
+      <w:r>
+        <w:t xml:space="preserve">. Pod</w:t>
+      </w:r>
+      <w:r>
+        <w:t xml:space="preserve"> </w:t>
+      </w:r>
+      <w:r>
+        <w:rPr>
+          <w:rStyle w:val="VerbatimChar"/>
+        </w:rPr>
+        <w:t xml:space="preserve">SQL SECURITY DEFINER</w:t>
+      </w:r>
+      <w:r>
+        <w:t xml:space="preserve">, korisniku koji</w:t>
+      </w:r>
+      <w:r>
+        <w:t xml:space="preserve"> </w:t>
+      </w:r>
+      <w:r>
+        <w:t xml:space="preserve">poziva pogled potrebna je samo privilegija da referencira sam pogled,</w:t>
+      </w:r>
+      <w:r>
+        <w:t xml:space="preserve"> </w:t>
+      </w:r>
+      <w:r>
+        <w:rPr>
+          <w:rStyle w:val="VerbatimChar"/>
+        </w:rPr>
+        <w:t xml:space="preserve">SELECT</w:t>
+      </w:r>
+      <w:r>
+        <w:t xml:space="preserve"> </w:t>
+      </w:r>
+      <w:r>
+        <w:t xml:space="preserve">nad njim; osnovne</w:t>
+      </w:r>
+      <w:r>
+        <w:t xml:space="preserve"> </w:t>
+      </w:r>
+      <w:r>
+        <w:t xml:space="preserve">tabele proverava se isključivo protiv privilegija naloga navedenog u atributu</w:t>
+      </w:r>
+      <w:r>
+        <w:t xml:space="preserve"> </w:t>
+      </w:r>
+      <w:r>
+        <w:rPr>
+          <w:rStyle w:val="VerbatimChar"/>
+        </w:rPr>
+        <w:t xml:space="preserve">DEFINER</w:t>
+      </w:r>
+      <w:r>
+        <w:t xml:space="preserve">, pa nalog</w:t>
+      </w:r>
+      <w:r>
+        <w:t xml:space="preserve"> </w:t>
+      </w:r>
+      <w:r>
+        <w:t xml:space="preserve">kome je pogled dodeljen nikada ne mora imati direktan pristup osnovnim tabelama. Pod</w:t>
+      </w:r>
+      <w:r>
+        <w:t xml:space="preserve"> </w:t>
+      </w:r>
+      <w:r>
+        <w:rPr>
+          <w:rStyle w:val="VerbatimChar"/>
+        </w:rPr>
+        <w:t xml:space="preserve">SQL SECURITY INVOKER</w:t>
+      </w:r>
+      <w:r>
+        <w:t xml:space="preserve">, naprotiv, izvršava se sa privilegijama pozivaoca, pa pozivalac mora sam imati</w:t>
+      </w:r>
+      <w:r>
+        <w:t xml:space="preserve"> </w:t>
+      </w:r>
+      <w:r>
+        <w:t xml:space="preserve">sve privilegije koje telo pogleda zahteva, uključujući i tabele koje pogled koristi samo za sopstvenu</w:t>
+      </w:r>
+      <w:r>
+        <w:t xml:space="preserve"> </w:t>
+      </w:r>
+      <w:r>
+        <w:t xml:space="preserve">filtrsku logiku, ne samo one koje se vraćaju u rezultatu</w:t>
+      </w:r>
+      <w:r>
+        <w:t xml:space="preserve"> </w:t>
+      </w:r>
+      <w:r>
+        <w:t xml:space="preserve">[2]</w:t>
+      </w:r>
+      <w:r>
+        <w:t xml:space="preserve">. Upravo je ova druga</w:t>
+      </w:r>
+      <w:r>
+        <w:t xml:space="preserve"> </w:t>
+      </w:r>
+      <w:r>
+        <w:t xml:space="preserve">osobina izmerena pri izgradnji sandbox pogleda</w:t>
+      </w:r>
+      <w:r>
+        <w:t xml:space="preserve"> </w:t>
+      </w:r>
+      <w:r>
+        <w:rPr>
+          <w:rStyle w:val="VerbatimChar"/>
+        </w:rPr>
+        <w:t xml:space="preserve">v_my_branch_diagnoses</w:t>
+      </w:r>
+      <w:r>
+        <w:t xml:space="preserve">: pogled je definisan sa</w:t>
+      </w:r>
+      <w:r>
+        <w:t xml:space="preserve"> </w:t>
+      </w:r>
+      <w:r>
+        <w:rPr>
+          <w:rStyle w:val="VerbatimChar"/>
+        </w:rPr>
+        <w:t xml:space="preserve">SQL SECURITY INVOKER</w:t>
+      </w:r>
+      <w:r>
+        <w:t xml:space="preserve"> </w:t>
+      </w:r>
+      <w:r>
+        <w:t xml:space="preserve">i u svojoj filtrskoj logici spaja tabelu</w:t>
+      </w:r>
+      <w:r>
+        <w:t xml:space="preserve"> </w:t>
+      </w:r>
+      <w:r>
+        <w:rPr>
+          <w:rStyle w:val="VerbatimChar"/>
+        </w:rPr>
+        <w:t xml:space="preserve">staff</w:t>
+      </w:r>
+      <w:r>
+        <w:t xml:space="preserve"> </w:t>
+      </w:r>
+      <w:r>
+        <w:t xml:space="preserve">da bi razrešio podružnicu</w:t>
+      </w:r>
+      <w:r>
+        <w:t xml:space="preserve"> </w:t>
+      </w:r>
+      <w:r>
+        <w:t xml:space="preserve">kojoj pozivalac pripada, pa je uloga</w:t>
+      </w:r>
+      <w:r>
+        <w:t xml:space="preserve"> </w:t>
+      </w:r>
+      <w:r>
+        <w:rPr>
+          <w:rStyle w:val="VerbatimChar"/>
+        </w:rPr>
+        <w:t xml:space="preserve">role_doctor</w:t>
+      </w:r>
+      <w:r>
+        <w:t xml:space="preserve">, iako nikada direktno ne čita</w:t>
+      </w:r>
+      <w:r>
+        <w:t xml:space="preserve"> </w:t>
+      </w:r>
+      <w:r>
+        <w:rPr>
+          <w:rStyle w:val="VerbatimChar"/>
+        </w:rPr>
+        <w:t xml:space="preserve">staff</w:t>
+      </w:r>
+      <w:r>
+        <w:t xml:space="preserve"> </w:t>
+      </w:r>
+      <w:r>
+        <w:t xml:space="preserve">u svom rezultatu,</w:t>
+      </w:r>
+      <w:r>
+        <w:t xml:space="preserve"> </w:t>
+      </w:r>
+      <w:r>
+        <w:t xml:space="preserve">morala dobiti kolonsku privilegiju nad tri kolone te tabele da bi pogled uopšte proradio.</w:t>
+      </w:r>
+      <w:r>
+        <w:t xml:space="preserve"> </w:t>
+      </w:r>
+      <w:r>
+        <w:rPr>
+          <w:rStyle w:val="VerbatimChar"/>
+        </w:rPr>
+        <w:t xml:space="preserve">INVOKER</w:t>
+      </w:r>
+      <w:r>
+        <w:t xml:space="preserve"> </w:t>
+      </w:r>
+      <w:r>
+        <w:t xml:space="preserve">bezbednost, drugim rečima, nije besplatna: ona premešta zahtev za privilegijom na svaki nalog koji</w:t>
+      </w:r>
+      <w:r>
+        <w:t xml:space="preserve"> </w:t>
+      </w:r>
+      <w:r>
+        <w:t xml:space="preserve">pogled koristi, ne samo na njegovog kreatora.</w:t>
+      </w:r>
+    </w:p>
+    <w:p>
+      <w:pPr>
+        <w:pStyle w:val="BodyText"/>
+      </w:pPr>
+      <w:r>
+        <w:t xml:space="preserve">Funkcija</w:t>
+      </w:r>
+      <w:r>
+        <w:t xml:space="preserve"> </w:t>
+      </w:r>
+      <w:r>
+        <w:rPr>
+          <w:rStyle w:val="VerbatimChar"/>
+        </w:rPr>
+        <w:t xml:space="preserve">CURRENT_USER()</w:t>
+      </w:r>
+      <w:r>
+        <w:t xml:space="preserve"> </w:t>
+      </w:r>
+      <w:r>
+        <w:t xml:space="preserve">prati ovu istu razliku i menja vrednost prema kontekstu izvršavanja: unutar</w:t>
+      </w:r>
+      <w:r>
+        <w:t xml:space="preserve"> </w:t>
+      </w:r>
+      <w:r>
+        <w:t xml:space="preserve">pogleda pod</w:t>
+      </w:r>
+      <w:r>
+        <w:t xml:space="preserve"> </w:t>
+      </w:r>
+      <w:r>
+        <w:rPr>
+          <w:rStyle w:val="VerbatimChar"/>
+        </w:rPr>
+        <w:t xml:space="preserve">SQL SECURITY DEFINER</w:t>
+      </w:r>
+      <w:r>
+        <w:t xml:space="preserve">,</w:t>
+      </w:r>
+      <w:r>
+        <w:t xml:space="preserve"> </w:t>
+      </w:r>
+      <w:r>
+        <w:rPr>
+          <w:rStyle w:val="VerbatimChar"/>
+        </w:rPr>
+        <w:t xml:space="preserve">CURRENT_USER()</w:t>
+      </w:r>
+      <w:r>
+        <w:t xml:space="preserve"> </w:t>
+      </w:r>
+      <w:r>
+        <w:t xml:space="preserve">vraća nalog naveden kao</w:t>
+      </w:r>
+      <w:r>
+        <w:t xml:space="preserve"> </w:t>
+      </w:r>
+      <w:r>
+        <w:rPr>
+          <w:rStyle w:val="VerbatimChar"/>
+        </w:rPr>
+        <w:t xml:space="preserve">DEFINER</w:t>
+      </w:r>
+      <w:r>
+        <w:t xml:space="preserve">, dok</w:t>
+      </w:r>
+      <w:r>
+        <w:t xml:space="preserve"> </w:t>
+      </w:r>
+      <w:r>
+        <w:rPr>
+          <w:rStyle w:val="VerbatimChar"/>
+        </w:rPr>
+        <w:t xml:space="preserve">USER()</w:t>
+      </w:r>
+      <w:r>
+        <w:t xml:space="preserve"> </w:t>
+      </w:r>
+      <w:r>
+        <w:t xml:space="preserve">uvek vraća nalog kojim se klijent stvarno povezao, zamrznut u trenutku prijavljivanja</w:t>
+      </w:r>
+      <w:r>
+        <w:t xml:space="preserve"> </w:t>
+      </w:r>
+      <w:r>
+        <w:t xml:space="preserve">[2]</w:t>
+      </w:r>
+      <w:r>
+        <w:t xml:space="preserve">. Na serveru rada ovo je izmereno pogledom čiji rezultat u jednom redu nosi obe</w:t>
+      </w:r>
+      <w:r>
+        <w:t xml:space="preserve"> </w:t>
+      </w:r>
+      <w:r>
+        <w:t xml:space="preserve">vrednosti: nalog</w:t>
+      </w:r>
+      <w:r>
+        <w:t xml:space="preserve"> </w:t>
+      </w:r>
+      <w:r>
+        <w:rPr>
+          <w:rStyle w:val="VerbatimChar"/>
+        </w:rPr>
+        <w:t xml:space="preserve">doc_podgorica</w:t>
+      </w:r>
+      <w:r>
+        <w:t xml:space="preserve">, povezan kao</w:t>
+      </w:r>
+      <w:r>
+        <w:t xml:space="preserve"> </w:t>
+      </w:r>
+      <w:r>
+        <w:rPr>
+          <w:rStyle w:val="VerbatimChar"/>
+        </w:rPr>
+        <w:t xml:space="preserve">role_doctor</w:t>
+      </w:r>
+      <w:r>
+        <w:t xml:space="preserve">, vidi</w:t>
+      </w:r>
+      <w:r>
+        <w:t xml:space="preserve"> </w:t>
+      </w:r>
+      <w:r>
+        <w:rPr>
+          <w:rStyle w:val="VerbatimChar"/>
+        </w:rPr>
+        <w:t xml:space="preserve">USER() = 'doc_podgorica@localhost'</w:t>
+      </w:r>
+      <w:r>
+        <w:t xml:space="preserve"> </w:t>
+      </w:r>
+      <w:r>
+        <w:t xml:space="preserve">naspram</w:t>
+      </w:r>
+      <w:r>
+        <w:t xml:space="preserve"> </w:t>
+      </w:r>
+      <w:r>
+        <w:rPr>
+          <w:rStyle w:val="VerbatimChar"/>
+        </w:rPr>
+        <w:t xml:space="preserve">CURRENT_USER() = 'dbadmin@localhost'</w:t>
+      </w:r>
+      <w:r>
+        <w:t xml:space="preserve">, iako se nikada nije prijavio pod nalogom</w:t>
+      </w:r>
+      <w:r>
+        <w:t xml:space="preserve"> </w:t>
+      </w:r>
+      <w:r>
+        <w:rPr>
+          <w:rStyle w:val="VerbatimChar"/>
+        </w:rPr>
+        <w:t xml:space="preserve">dbadmin</w:t>
+      </w:r>
+      <w:r>
+        <w:t xml:space="preserve">.</w:t>
+      </w:r>
+      <w:r>
+        <w:t xml:space="preserve"> </w:t>
+      </w:r>
+      <w:r>
+        <w:t xml:space="preserve">Posledica je precizna i lako se previdi: filter oblika</w:t>
+      </w:r>
+      <w:r>
+        <w:t xml:space="preserve"> </w:t>
+      </w:r>
+      <w:r>
+        <w:rPr>
+          <w:rStyle w:val="VerbatimChar"/>
+        </w:rPr>
+        <w:t xml:space="preserve">WHERE tenant_id = f(CURRENT_USER())</w:t>
+      </w:r>
+      <w:r>
+        <w:t xml:space="preserve"> </w:t>
+      </w:r>
+      <w:r>
+        <w:t xml:space="preserve">upisan u</w:t>
+      </w:r>
+      <w:r>
+        <w:t xml:space="preserve"> </w:t>
+      </w:r>
+      <w:r>
+        <w:rPr>
+          <w:rStyle w:val="VerbatimChar"/>
+        </w:rPr>
+        <w:t xml:space="preserve">DEFINER</w:t>
+      </w:r>
+      <w:r>
+        <w:t xml:space="preserve"> </w:t>
+      </w:r>
+      <w:r>
+        <w:t xml:space="preserve">pogled ne filtrira po nalogu koji je upit zaista poslao, nego po samom definer nalogu, isto</w:t>
+      </w:r>
+      <w:r>
+        <w:t xml:space="preserve"> </w:t>
+      </w:r>
+      <w:r>
+        <w:t xml:space="preserve">za svakog pozivaoca, pa izolacija po pozivaocu tim putem tiho nestaje.</w:t>
+      </w:r>
+    </w:p>
+    <w:p>
+      <w:pPr>
+        <w:pStyle w:val="BodyText"/>
+      </w:pPr>
+      <w:r>
+        <w:t xml:space="preserve">Ako se nalog naveden kao</w:t>
+      </w:r>
+      <w:r>
+        <w:t xml:space="preserve"> </w:t>
+      </w:r>
+      <w:r>
+        <w:rPr>
+          <w:rStyle w:val="VerbatimChar"/>
+        </w:rPr>
+        <w:t xml:space="preserve">DEFINER</w:t>
+      </w:r>
+      <w:r>
+        <w:t xml:space="preserve"> </w:t>
+      </w:r>
+      <w:r>
+        <w:t xml:space="preserve">obriše,</w:t>
+      </w:r>
+      <w:r>
+        <w:t xml:space="preserve"> </w:t>
+      </w:r>
+      <w:r>
+        <w:rPr>
+          <w:rStyle w:val="VerbatimChar"/>
+        </w:rPr>
+        <w:t xml:space="preserve">DROP USER</w:t>
+      </w:r>
+      <w:r>
+        <w:t xml:space="preserve"> </w:t>
+      </w:r>
+      <w:r>
+        <w:t xml:space="preserve">po podrazumevanom ponašanju odbija zahtev</w:t>
+      </w:r>
+      <w:r>
+        <w:t xml:space="preserve"> </w:t>
+      </w:r>
+      <w:r>
+        <w:t xml:space="preserve">greškom, upravo da spreči da pogled ili rutina ostanu bez definer naloga</w:t>
+      </w:r>
+      <w:r>
+        <w:t xml:space="preserve"> </w:t>
+      </w:r>
+      <w:r>
+        <w:t xml:space="preserve">[2]</w:t>
+      </w:r>
+      <w:r>
+        <w:t xml:space="preserve">; ako do</w:t>
+      </w:r>
+      <w:r>
+        <w:t xml:space="preserve"> </w:t>
+      </w:r>
+      <w:r>
+        <w:t xml:space="preserve">takvog stanja ipak dođe, pogled pod</w:t>
+      </w:r>
+      <w:r>
+        <w:t xml:space="preserve"> </w:t>
+      </w:r>
+      <w:r>
+        <w:rPr>
+          <w:rStyle w:val="VerbatimChar"/>
+        </w:rPr>
+        <w:t xml:space="preserve">SQL SECURITY DEFINER</w:t>
+      </w:r>
+      <w:r>
+        <w:t xml:space="preserve"> </w:t>
+      </w:r>
+      <w:r>
+        <w:t xml:space="preserve">pri sledećem pozivu baca grešku umesto da</w:t>
+      </w:r>
+      <w:r>
+        <w:t xml:space="preserve"> </w:t>
+      </w:r>
+      <w:r>
+        <w:t xml:space="preserve">vrati rezultat. MySQL, dakle, tretira definer identitet kao deo integriteta samog objekta, ne kao</w:t>
+      </w:r>
+      <w:r>
+        <w:t xml:space="preserve"> </w:t>
+      </w:r>
+      <w:r>
+        <w:t xml:space="preserve">puku metapodatku.</w:t>
+      </w:r>
+    </w:p>
+    <w:p>
+      <w:pPr>
+        <w:pStyle w:val="BodyText"/>
+      </w:pPr>
+      <w:r>
+        <w:t xml:space="preserve">Poslednji deo ove slike jeste putanja upisa.</w:t>
+      </w:r>
+      <w:r>
+        <w:t xml:space="preserve"> </w:t>
+      </w:r>
+      <w:r>
+        <w:rPr>
+          <w:rStyle w:val="VerbatimChar"/>
+        </w:rPr>
+        <w:t xml:space="preserve">WHERE</w:t>
+      </w:r>
+      <w:r>
+        <w:t xml:space="preserve"> </w:t>
+      </w:r>
+      <w:r>
+        <w:t xml:space="preserve">klauzula pogleda sama po sebi ne ograničava</w:t>
+      </w:r>
+      <w:r>
+        <w:t xml:space="preserve"> </w:t>
+      </w:r>
+      <w:r>
+        <w:rPr>
+          <w:rStyle w:val="VerbatimChar"/>
+        </w:rPr>
+        <w:t xml:space="preserve">INSERT</w:t>
+      </w:r>
+      <w:r>
+        <w:t xml:space="preserve"> </w:t>
+      </w:r>
+      <w:r>
+        <w:t xml:space="preserve">ni</w:t>
+      </w:r>
+      <w:r>
+        <w:t xml:space="preserve"> </w:t>
+      </w:r>
+      <w:r>
+        <w:rPr>
+          <w:rStyle w:val="VerbatimChar"/>
+        </w:rPr>
+        <w:t xml:space="preserve">UPDATE</w:t>
+      </w:r>
+      <w:r>
+        <w:t xml:space="preserve">: bez klauzule</w:t>
+      </w:r>
+      <w:r>
+        <w:t xml:space="preserve"> </w:t>
+      </w:r>
+      <w:r>
+        <w:rPr>
+          <w:rStyle w:val="VerbatimChar"/>
+        </w:rPr>
+        <w:t xml:space="preserve">WITH CHECK OPTION</w:t>
+      </w:r>
+      <w:r>
+        <w:t xml:space="preserve">, red koji upis kroz pogled unese, a koji ne</w:t>
+      </w:r>
+      <w:r>
+        <w:t xml:space="preserve"> </w:t>
+      </w:r>
+      <w:r>
+        <w:t xml:space="preserve">zadovoljava uslov pogleda, jednostavno postane nevidljiv kroz taj isti pogled posle upisa, ne odbijen</w:t>
+      </w:r>
+      <w:r>
+        <w:t xml:space="preserve"> </w:t>
+      </w:r>
+      <w:r>
+        <w:t xml:space="preserve">pri upisu</w:t>
+      </w:r>
+      <w:r>
+        <w:t xml:space="preserve"> </w:t>
+      </w:r>
+      <w:r>
+        <w:t xml:space="preserve">[2]</w:t>
+      </w:r>
+      <w:r>
+        <w:t xml:space="preserve">. Ovo je izmereno na probnoj tabeli: upis vrednosti koja pripada drugoj</w:t>
+      </w:r>
+      <w:r>
+        <w:t xml:space="preserve"> </w:t>
+      </w:r>
+      <w:r>
+        <w:t xml:space="preserve">podružnici kroz pogled bez klauzule prijavljuje uspeh,</w:t>
+      </w:r>
+      <w:r>
+        <w:t xml:space="preserve"> </w:t>
+      </w:r>
+      <w:r>
+        <w:rPr>
+          <w:rStyle w:val="VerbatimChar"/>
+        </w:rPr>
+        <w:t xml:space="preserve">1 row(s) affected</w:t>
+      </w:r>
+      <w:r>
+        <w:t xml:space="preserve">, dok isti upit nad bazom</w:t>
+      </w:r>
+      <w:r>
+        <w:t xml:space="preserve"> </w:t>
+      </w:r>
+      <w:r>
+        <w:t xml:space="preserve">pokazuje da je red zaista upisan, a pogled ga posle upisa uopšte ne prikazuje.</w:t>
+      </w:r>
+      <w:r>
+        <w:t xml:space="preserve"> </w:t>
+      </w:r>
+      <w:r>
+        <w:rPr>
+          <w:rStyle w:val="VerbatimChar"/>
+        </w:rPr>
+        <w:t xml:space="preserve">WITH CHECK OPTION</w:t>
+      </w:r>
+      <w:r>
+        <w:t xml:space="preserve">,</w:t>
+      </w:r>
+      <w:r>
+        <w:t xml:space="preserve"> </w:t>
+      </w:r>
+      <w:r>
+        <w:t xml:space="preserve">podrazumevano</w:t>
+      </w:r>
+      <w:r>
+        <w:t xml:space="preserve"> </w:t>
+      </w:r>
+      <w:r>
+        <w:rPr>
+          <w:rStyle w:val="VerbatimChar"/>
+        </w:rPr>
+        <w:t xml:space="preserve">CASCADED</w:t>
+      </w:r>
+      <w:r>
+        <w:t xml:space="preserve"> </w:t>
+      </w:r>
+      <w:r>
+        <w:t xml:space="preserve">kada je klauzula prisutna, menja ovo ponašanje tako što proverava uslov</w:t>
+      </w:r>
+      <w:r>
+        <w:t xml:space="preserve"> </w:t>
+      </w:r>
+      <w:r>
+        <w:t xml:space="preserve">pogleda i pri samom upisu, a</w:t>
+      </w:r>
+      <w:r>
+        <w:t xml:space="preserve"> </w:t>
+      </w:r>
+      <w:r>
+        <w:rPr>
+          <w:rStyle w:val="VerbatimChar"/>
+        </w:rPr>
+        <w:t xml:space="preserve">CASCADED</w:t>
+      </w:r>
+      <w:r>
+        <w:t xml:space="preserve"> </w:t>
+      </w:r>
+      <w:r>
+        <w:t xml:space="preserve">tu proveru dodatno prenosi i na svaki pogled ispod njega</w:t>
+      </w:r>
+      <w:r>
+        <w:t xml:space="preserve"> </w:t>
+      </w:r>
+      <w:r>
+        <w:t xml:space="preserve">[2]</w:t>
+      </w:r>
+      <w:r>
+        <w:t xml:space="preserve">; isti upis kroz pogled sa ovom klauzulom pada sa</w:t>
+      </w:r>
+      <w:r>
+        <w:t xml:space="preserve"> </w:t>
+      </w:r>
+      <w:r>
+        <w:rPr>
+          <w:rStyle w:val="VerbatimChar"/>
+        </w:rPr>
+        <w:t xml:space="preserve">ERROR 1369</w:t>
+      </w:r>
+      <w:r>
+        <w:t xml:space="preserve">. Razlika nije u tome</w:t>
+      </w:r>
+      <w:r>
+        <w:t xml:space="preserve"> </w:t>
+      </w:r>
+      <w:r>
+        <w:t xml:space="preserve">da li je uslov moguće proveriti pre upisa, buduće vrednosti reda server već drži u trenutku upisa,</w:t>
+      </w:r>
+      <w:r>
+        <w:t xml:space="preserve"> </w:t>
+      </w:r>
+      <w:r>
+        <w:t xml:space="preserve">nego u tome da li se ta provera podrazumevano sprovodi; klauzula postoji upravo zato što se ne</w:t>
+      </w:r>
+      <w:r>
+        <w:t xml:space="preserve"> </w:t>
+      </w:r>
+      <w:r>
+        <w:t xml:space="preserve">sprovodi automatski.</w:t>
+      </w:r>
+    </w:p>
+    <w:bookmarkEnd w:id="24"/>
+    <w:bookmarkStart w:id="45" w:name="emulacija-bezbednosti-na-nivou-reda"/>
+    <w:p>
+      <w:pPr>
+        <w:pStyle w:val="Heading2"/>
+      </w:pPr>
+      <w:r>
+        <w:t xml:space="preserve">Emulacija bezbednosti na nivou reda</w:t>
+      </w:r>
+    </w:p>
+    <w:p>
+      <w:pPr>
+        <w:pStyle w:val="FirstParagraph"/>
+      </w:pPr>
+      <w:r>
+        <w:t xml:space="preserve">MySQL nema mehanizam koji bi na nivou samog mehanizma za obradu upita filtrirao redove prema</w:t>
+      </w:r>
+      <w:r>
+        <w:t xml:space="preserve"> </w:t>
+      </w:r>
+      <w:r>
+        <w:t xml:space="preserve">identitetu naloga; nijedna naredba oblika koji bi dodelio predikat direktno tabeli ne postoji</w:t>
+      </w:r>
+      <w:r>
+        <w:t xml:space="preserve"> </w:t>
+      </w:r>
+      <w:r>
+        <w:t xml:space="preserve">[2]</w:t>
+      </w:r>
+      <w:r>
+        <w:t xml:space="preserve">. Sve što je opisano u prethodnom odeljku, dakle, ne uvodi bezbednost na nivou reda</w:t>
+      </w:r>
+      <w:r>
+        <w:t xml:space="preserve"> </w:t>
+      </w:r>
+      <w:r>
+        <w:t xml:space="preserve">(RLS) kao novi mehanizam, nego to čini emulacija: pogled sa</w:t>
+      </w:r>
+      <w:r>
+        <w:t xml:space="preserve"> </w:t>
+      </w:r>
+      <w:r>
+        <w:rPr>
+          <w:rStyle w:val="VerbatimChar"/>
+        </w:rPr>
+        <w:t xml:space="preserve">WHERE</w:t>
+      </w:r>
+      <w:r>
+        <w:t xml:space="preserve"> </w:t>
+      </w:r>
+      <w:r>
+        <w:t xml:space="preserve">klauzulom, imenovan i dodeljen kao</w:t>
+      </w:r>
+      <w:r>
+        <w:t xml:space="preserve"> </w:t>
+      </w:r>
+      <w:r>
+        <w:t xml:space="preserve">objekat sistemu privilegija koji inače radi isključivo sa imenima. Iz ove osnove proizlaze tri obrasca</w:t>
+      </w:r>
+      <w:r>
+        <w:t xml:space="preserve"> </w:t>
+      </w:r>
+      <w:r>
+        <w:t xml:space="preserve">emulacije, prikazana na Slici 4.2, koji se razlikuju po tome odakle filter uzima identitet pozivaoca,</w:t>
+      </w:r>
+      <w:r>
+        <w:t xml:space="preserve"> </w:t>
+      </w:r>
+      <w:r>
+        <w:t xml:space="preserve">i upravo tu tačku svaki od njih na svoj način gubi.</w:t>
+      </w:r>
+    </w:p>
+    <w:p>
+      <w:pPr>
+        <w:pStyle w:val="CaptionedFigure"/>
+      </w:pPr>
+      <w:r>
+        <w:drawing>
+          <wp:inline>
+            <wp:extent cx="5465445" cy="2202908"/>
+            <wp:effectExtent b="0" l="0" r="0" t="0"/>
+            <wp:docPr descr="Slika 4.2: Tri obrasca emulacije RLS-a i njihova tačka otkaza" title="" id="26" name="Picture"/>
+            <a:graphic>
+              <a:graphicData uri="http://schemas.openxmlformats.org/drawingml/2006/picture">
+                <pic:pic>
+                  <pic:nvPicPr>
+                    <pic:cNvPr descr="figures/04-fgac-02-rls-obrasci.png" id="27" name="Picture"/>
+                    <pic:cNvPicPr>
+                      <a:picLocks noChangeArrowheads="1" noChangeAspect="1"/>
+                    </pic:cNvPicPr>
+                  </pic:nvPicPr>
+                  <pic:blipFill>
+                    <a:blip r:embed="rId25"/>
+                    <a:stretch>
+                      <a:fillRect/>
+                    </a:stretch>
+                  </pic:blipFill>
+                  <pic:spPr bwMode="auto">
+                    <a:xfrm>
+                      <a:off x="0" y="0"/>
+                      <a:ext cx="5465445" cy="2202908"/>
+                    </a:xfrm>
+                    <a:prstGeom prst="rect">
+                      <a:avLst/>
+                    </a:prstGeom>
+                    <a:noFill/>
+                    <a:ln w="9525">
+                      <a:noFill/>
+                      <a:headEnd/>
+                      <a:tailEnd/>
+                    </a:ln>
+                  </pic:spPr>
+                </pic:pic>
+              </a:graphicData>
+            </a:graphic>
+          </wp:inline>
+        </w:drawing>
+      </w:r>
+    </w:p>
+    <w:p>
+      <w:pPr>
+        <w:pStyle w:val="ImageCaption"/>
+      </w:pPr>
+      <w:r>
+        <w:t xml:space="preserve">Slika 4.2: Tri obrasca emulacije RLS-a i njihova tačka otkaza</w:t>
+      </w:r>
+    </w:p>
+    <w:p>
+      <w:pPr>
+        <w:pStyle w:val="BodyText"/>
+      </w:pPr>
+      <w:r>
+        <w:t xml:space="preserve">Prvi obrazac filtrira preko</w:t>
+      </w:r>
+      <w:r>
+        <w:t xml:space="preserve"> </w:t>
+      </w:r>
+      <w:r>
+        <w:rPr>
+          <w:rStyle w:val="VerbatimChar"/>
+        </w:rPr>
+        <w:t xml:space="preserve">CURRENT_USER()</w:t>
+      </w:r>
+      <w:r>
+        <w:t xml:space="preserve"> </w:t>
+      </w:r>
+      <w:r>
+        <w:t xml:space="preserve">unutar</w:t>
+      </w:r>
+      <w:r>
+        <w:t xml:space="preserve"> </w:t>
+      </w:r>
+      <w:r>
+        <w:rPr>
+          <w:rStyle w:val="VerbatimChar"/>
+        </w:rPr>
+        <w:t xml:space="preserve">DEFINER</w:t>
+      </w:r>
+      <w:r>
+        <w:t xml:space="preserve"> </w:t>
+      </w:r>
+      <w:r>
+        <w:t xml:space="preserve">pogleda, isti mehanizam demonstriran</w:t>
+      </w:r>
+      <w:r>
+        <w:t xml:space="preserve"> </w:t>
+      </w:r>
+      <w:r>
+        <w:t xml:space="preserve">gore za razrešavanje podružnice u</w:t>
+      </w:r>
+      <w:r>
+        <w:t xml:space="preserve"> </w:t>
+      </w:r>
+      <w:r>
+        <w:rPr>
+          <w:rStyle w:val="VerbatimChar"/>
+        </w:rPr>
+        <w:t xml:space="preserve">v_my_branch_diagnoses</w:t>
+      </w:r>
+      <w:r>
+        <w:t xml:space="preserve">. On je jedini od tri obrasca čiji identitet</w:t>
+      </w:r>
+      <w:r>
+        <w:t xml:space="preserve"> </w:t>
+      </w:r>
+      <w:r>
+        <w:t xml:space="preserve">sprovodi sam server, jer</w:t>
+      </w:r>
+      <w:r>
+        <w:t xml:space="preserve"> </w:t>
+      </w:r>
+      <w:r>
+        <w:rPr>
+          <w:rStyle w:val="VerbatimChar"/>
+        </w:rPr>
+        <w:t xml:space="preserve">CURRENT_USER()</w:t>
+      </w:r>
+      <w:r>
+        <w:t xml:space="preserve"> </w:t>
+      </w:r>
+      <w:r>
+        <w:t xml:space="preserve">ne može biti falsifikovan sa strane klijenta, ali upravo</w:t>
+      </w:r>
+      <w:r>
+        <w:t xml:space="preserve"> </w:t>
+      </w:r>
+      <w:r>
+        <w:t xml:space="preserve">zbog toga zahteva poseban MySQL nalog po zakupcu, engl. tenant, jedinici izolacije kojoj u ovom radu</w:t>
+      </w:r>
+      <w:r>
+        <w:t xml:space="preserve"> </w:t>
+      </w:r>
+      <w:r>
+        <w:t xml:space="preserve">konkretno odgovara podružnica klinike, ne po korisničkoj sesiji aplikacije; u okruženju sa zajedničkim</w:t>
+      </w:r>
+      <w:r>
+        <w:t xml:space="preserve"> </w:t>
+      </w:r>
+      <w:r>
+        <w:t xml:space="preserve">skupom konekcija (connection pooling), gde više krajnjih korisnika deli manji broj serverskih naloga,</w:t>
+      </w:r>
+      <w:r>
+        <w:t xml:space="preserve"> </w:t>
+      </w:r>
+      <w:r>
+        <w:t xml:space="preserve">ovaj obrazac se jednostavno ne primenjuje. Drugi obrazac filtrira preko</w:t>
+      </w:r>
+      <w:r>
+        <w:t xml:space="preserve"> </w:t>
+      </w:r>
+      <w:r>
+        <w:t xml:space="preserve">sesijske promenljive koju aplikacija postavlja pri povezivanju, na primer</w:t>
+      </w:r>
+      <w:r>
+        <w:t xml:space="preserve"> </w:t>
+      </w:r>
+      <w:r>
+        <w:rPr>
+          <w:rStyle w:val="VerbatimChar"/>
+        </w:rPr>
+        <w:t xml:space="preserve">SET @tenant_id = ...</w:t>
+      </w:r>
+      <w:r>
+        <w:t xml:space="preserve">; on</w:t>
+      </w:r>
+      <w:r>
+        <w:t xml:space="preserve"> </w:t>
+      </w:r>
+      <w:r>
+        <w:t xml:space="preserve">skalira se bolje, jer ne zahteva poseban nalog po zakupcu, ali njegovu vrednost može promeniti bilo</w:t>
+      </w:r>
+      <w:r>
+        <w:t xml:space="preserve"> </w:t>
+      </w:r>
+      <w:r>
+        <w:t xml:space="preserve">koji nalog kome je dozvoljeno da izvrši</w:t>
+      </w:r>
+      <w:r>
+        <w:t xml:space="preserve"> </w:t>
+      </w:r>
+      <w:r>
+        <w:rPr>
+          <w:rStyle w:val="VerbatimChar"/>
+        </w:rPr>
+        <w:t xml:space="preserve">SET</w:t>
+      </w:r>
+      <w:r>
+        <w:t xml:space="preserve">, pa je sprovođenje u potpunosti preneto na aplikaciju,</w:t>
+      </w:r>
+      <w:r>
+        <w:t xml:space="preserve"> </w:t>
+      </w:r>
+      <w:r>
+        <w:t xml:space="preserve">ne na server. Treći obrazac izlaže pristup isključivo kroz uskladištenu proceduru sa</w:t>
+      </w:r>
+      <w:r>
+        <w:t xml:space="preserve"> </w:t>
+      </w:r>
+      <w:r>
+        <w:rPr>
+          <w:rStyle w:val="VerbatimChar"/>
+        </w:rPr>
+        <w:t xml:space="preserve">EXECUTE</w:t>
+      </w:r>
+      <w:r>
+        <w:t xml:space="preserve"> </w:t>
+      </w:r>
+      <w:r>
+        <w:t xml:space="preserve">privilegijom, bez ijedne direktne privilegije nad osnovnim tabelama; on sprečava zaobilaženje</w:t>
+      </w:r>
+      <w:r>
+        <w:t xml:space="preserve"> </w:t>
+      </w:r>
+      <w:r>
+        <w:t xml:space="preserve">direktnim upitom, ali pomera tačku otkaza na ispravnost validacije parametra unutar tela procedure i</w:t>
+      </w:r>
+      <w:r>
+        <w:t xml:space="preserve"> </w:t>
+      </w:r>
+      <w:r>
+        <w:t xml:space="preserve">na integritet samog definer naloga procedure.</w:t>
+      </w:r>
+    </w:p>
+    <w:p>
+      <w:pPr>
+        <w:pStyle w:val="BodyText"/>
+      </w:pPr>
+      <w:r>
+        <w:t xml:space="preserve">Sva tri obrasca dele jedan zajednički uslov: filtriranje nije autorizacija. Provera privilegije i</w:t>
+      </w:r>
+      <w:r>
+        <w:t xml:space="preserve"> </w:t>
+      </w:r>
+      <w:r>
+        <w:rPr>
+          <w:rStyle w:val="VerbatimChar"/>
+        </w:rPr>
+        <w:t xml:space="preserve">WHERE</w:t>
+      </w:r>
+      <w:r>
+        <w:t xml:space="preserve"> </w:t>
+      </w:r>
+      <w:r>
+        <w:t xml:space="preserve">klauzula pogleda žive u dva odvojena podsistema servera i otkazuju na različite načine, prva</w:t>
+      </w:r>
+      <w:r>
+        <w:t xml:space="preserve"> </w:t>
+      </w:r>
+      <w:r>
+        <w:t xml:space="preserve">odbijanjem sa jasnom greškom, druga tihim izostankom reda iz rezultata</w:t>
+      </w:r>
+      <w:r>
+        <w:t xml:space="preserve"> </w:t>
+      </w:r>
+      <w:r>
+        <w:t xml:space="preserve">[2]</w:t>
+      </w:r>
+      <w:r>
+        <w:t xml:space="preserve">. Ono što se u</w:t>
+      </w:r>
+      <w:r>
+        <w:t xml:space="preserve"> </w:t>
+      </w:r>
+      <w:r>
+        <w:t xml:space="preserve">ovom poglavlju naziva bezbednošću na nivou reda jeste, dakle, svojstvo putanje pristupa, konkretnog</w:t>
+      </w:r>
+      <w:r>
+        <w:t xml:space="preserve"> </w:t>
+      </w:r>
+      <w:r>
+        <w:t xml:space="preserve">pogleda ili procedure kroz koju se do podataka dolazi, a ne svojstvo same tabele; direktan upit nad</w:t>
+      </w:r>
+      <w:r>
+        <w:t xml:space="preserve"> </w:t>
+      </w:r>
+      <w:r>
+        <w:t xml:space="preserve">osnovnom tabelom, ako nalog ima privilegiju da ga izvrši, zaobilazi svaki od tri opisana obrasca u</w:t>
+      </w:r>
+      <w:r>
+        <w:t xml:space="preserve"> </w:t>
+      </w:r>
+      <w:r>
+        <w:t xml:space="preserve">potpunosti.</w:t>
+      </w:r>
+    </w:p>
+    <w:p>
+      <w:pPr>
+        <w:pStyle w:val="BodyText"/>
+      </w:pPr>
+      <w:r>
+        <w:t xml:space="preserve">PostgreSQL i Oracle ovu razliku rešavaju na nivou samog mehanizma za obradu upita, ne kroz imenovan</w:t>
+      </w:r>
+      <w:r>
+        <w:t xml:space="preserve"> </w:t>
+      </w:r>
+      <w:r>
+        <w:t xml:space="preserve">objekat sistema privilegija. PostgreSQL naredbom</w:t>
+      </w:r>
+      <w:r>
+        <w:t xml:space="preserve"> </w:t>
+      </w:r>
+      <w:r>
+        <w:rPr>
+          <w:rStyle w:val="VerbatimChar"/>
+        </w:rPr>
+        <w:t xml:space="preserve">CREATE POLICY</w:t>
+      </w:r>
+      <w:r>
+        <w:t xml:space="preserve">, uz</w:t>
+      </w:r>
+      <w:r>
+        <w:t xml:space="preserve"> </w:t>
+      </w:r>
+      <w:r>
+        <w:rPr>
+          <w:rStyle w:val="VerbatimChar"/>
+        </w:rPr>
+        <w:t xml:space="preserve">ALTER TABLE ... ENABLE ROW LEVEL SECURITY</w:t>
+      </w:r>
+      <w:r>
+        <w:t xml:space="preserve">, vezuje predikat direktno za tabelu; server taj predikat sam dodaje u svaki upit nad njom,</w:t>
+      </w:r>
+      <w:r>
+        <w:t xml:space="preserve"> </w:t>
+      </w:r>
+      <w:r>
+        <w:t xml:space="preserve">bez obzira na to da li upit dolazi kroz pogled ili direktno, i bez posebne privilegije</w:t>
+      </w:r>
+      <w:r>
+        <w:t xml:space="preserve"> </w:t>
+      </w:r>
+      <w:r>
+        <w:rPr>
+          <w:rStyle w:val="VerbatimChar"/>
+        </w:rPr>
+        <w:t xml:space="preserve">BYPASSRLS</w:t>
+      </w:r>
+      <w:r>
+        <w:t xml:space="preserve"> </w:t>
+      </w:r>
+      <w:r>
+        <w:t xml:space="preserve">nijedan nalog tu proveru ne može zaobići</w:t>
+      </w:r>
+      <w:r>
+        <w:t xml:space="preserve"> </w:t>
+      </w:r>
+      <w:r>
+        <w:t xml:space="preserve">[9]</w:t>
+      </w:r>
+      <w:r>
+        <w:t xml:space="preserve">. Oracle-ova Virtual Private Database (VPD)</w:t>
+      </w:r>
+      <w:r>
+        <w:t xml:space="preserve"> </w:t>
+      </w:r>
+      <w:r>
+        <w:t xml:space="preserve">postiže isto dinamičkim ubacivanjem</w:t>
+      </w:r>
+      <w:r>
+        <w:t xml:space="preserve"> </w:t>
+      </w:r>
+      <w:r>
+        <w:rPr>
+          <w:rStyle w:val="VerbatimChar"/>
+        </w:rPr>
+        <w:t xml:space="preserve">WHERE</w:t>
+      </w:r>
+      <w:r>
+        <w:t xml:space="preserve"> </w:t>
+      </w:r>
+      <w:r>
+        <w:t xml:space="preserve">predikata koji vraća funkcija na jeziku PL/SQL, vezana za</w:t>
+      </w:r>
+      <w:r>
+        <w:t xml:space="preserve"> </w:t>
+      </w:r>
+      <w:r>
+        <w:t xml:space="preserve">tabelu preko bezbednosne politike, tako da se predikat izračunava u trenutku izvršavanja i primenjuje</w:t>
+      </w:r>
+      <w:r>
+        <w:t xml:space="preserve"> </w:t>
+      </w:r>
+      <w:r>
+        <w:t xml:space="preserve">nad svakim pristupom toj tabeli</w:t>
+      </w:r>
+      <w:r>
+        <w:t xml:space="preserve"> </w:t>
+      </w:r>
+      <w:r>
+        <w:t xml:space="preserve">[10]</w:t>
+      </w:r>
+      <w:r>
+        <w:t xml:space="preserve">. Ono što oba sistema imaju, a MySQL nema, jeste tačka</w:t>
+      </w:r>
+      <w:r>
+        <w:t xml:space="preserve"> </w:t>
+      </w:r>
+      <w:r>
+        <w:t xml:space="preserve">sprovođenja unutar samog mehanizma za obradu upita, koja se ne može zaobići izborom putanje pristupa;</w:t>
+      </w:r>
+      <w:r>
+        <w:t xml:space="preserve"> </w:t>
+      </w:r>
+      <w:r>
+        <w:t xml:space="preserve">sva tri MySQL-ova obrasca su, u različitom stepenu, sprovođenje van tog mehanizma, oslonjeno na</w:t>
+      </w:r>
+      <w:r>
+        <w:t xml:space="preserve"> </w:t>
+      </w:r>
+      <w:r>
+        <w:t xml:space="preserve">disciplinu kojom su pogled, aplikacija ili procedura napisani.</w:t>
+      </w:r>
+    </w:p>
+    <w:p>
+      <w:pPr>
+        <w:pStyle w:val="BodyText"/>
+      </w:pPr>
+      <w:r>
+        <w:t xml:space="preserve">Ovo poglavlje na sopstvenom terenu ponavlja obrazac koji je treće poglavlje već ustanovilo za uloge:</w:t>
+      </w:r>
+      <w:r>
+        <w:t xml:space="preserve"> </w:t>
+      </w:r>
+      <w:r>
+        <w:t xml:space="preserve">kada model sistema privilegija ne može da izrazi neko pravilo, MySQL ga ne uvodi kao novi mehanizam,</w:t>
+      </w:r>
+      <w:r>
+        <w:t xml:space="preserve"> </w:t>
+      </w:r>
+      <w:r>
+        <w:t xml:space="preserve">nego ga dopisuje van osnovne šeme, ovde kao imenovan objekat u samoj bazi, pogled ili proceduru, čije</w:t>
+      </w:r>
+      <w:r>
+        <w:t xml:space="preserve"> </w:t>
+      </w:r>
+      <w:r>
+        <w:t xml:space="preserve">telo nosi ono što tabela dodele prava ne ume da zapiše. Fino-granularna kontrola pristupa ostaje,</w:t>
+      </w:r>
+      <w:r>
+        <w:t xml:space="preserve"> </w:t>
+      </w:r>
+      <w:r>
+        <w:t xml:space="preserve">dakle, sastavljena isključivo iz diskrecionih elemenata opisanih u drugom poglavlju, dodela nazvanog</w:t>
+      </w:r>
+      <w:r>
+        <w:t xml:space="preserve"> </w:t>
+      </w:r>
+      <w:r>
+        <w:t xml:space="preserve">objekta, dok red-level security, u smislu u kome ga sprovode PostgreSQL i Oracle, u MySQL-u</w:t>
+      </w:r>
+      <w:r>
+        <w:t xml:space="preserve"> </w:t>
+      </w:r>
+      <w:r>
+        <w:t xml:space="preserve">strukturno odsustvuje i mora se, kao takva, izgraditi izvan same baze podataka.</w:t>
+      </w:r>
+    </w:p>
+    <w:bookmarkStart w:id="44" w:name="refs"/>
+    <w:bookmarkStart w:id="28" w:name="ref-ramakrishnan2003"/>
     <w:p>
       <w:pPr>
         <w:pStyle w:val="Bibliography"/>
@@ -3340,8 +5251,8 @@
         <w:t xml:space="preserve">, 3rd ed. New York, NY, USA: McGraw-Hill, 2003.</w:t>
       </w:r>
     </w:p>
-    <w:bookmarkEnd w:id="20"/>
-    <w:bookmarkStart w:id="22" w:name="ref-mysql84refman"/>
+    <w:bookmarkEnd w:id="28"/>
+    <w:bookmarkStart w:id="30" w:name="ref-mysql84refman"/>
     <w:p>
       <w:pPr>
         <w:pStyle w:val="Bibliography"/>
@@ -3376,7 +5287,7 @@
       <w:r>
         <w:t xml:space="preserve"> </w:t>
       </w:r>
-      <w:hyperlink r:id="rId21">
+      <w:hyperlink r:id="rId29">
         <w:r>
           <w:rPr>
             <w:rStyle w:val="Hyperlink"/>
@@ -3388,8 +5299,8 @@
         <w:t xml:space="preserve">, 2024.</w:t>
       </w:r>
     </w:p>
-    <w:bookmarkEnd w:id="22"/>
-    <w:bookmarkStart w:id="24" w:name="ref-sandhu1996"/>
+    <w:bookmarkEnd w:id="30"/>
+    <w:bookmarkStart w:id="32" w:name="ref-sandhu1996"/>
     <w:p>
       <w:pPr>
         <w:pStyle w:val="Bibliography"/>
@@ -3428,7 +5339,7 @@
       <w:r>
         <w:t xml:space="preserve"> </w:t>
       </w:r>
-      <w:hyperlink r:id="rId23">
+      <w:hyperlink r:id="rId31">
         <w:r>
           <w:rPr>
             <w:rStyle w:val="Hyperlink"/>
@@ -3440,8 +5351,8 @@
         <w:t xml:space="preserve">.</w:t>
       </w:r>
     </w:p>
-    <w:bookmarkEnd w:id="24"/>
-    <w:bookmarkStart w:id="25" w:name="ref-bell1973"/>
+    <w:bookmarkEnd w:id="32"/>
+    <w:bookmarkStart w:id="33" w:name="ref-bell1973"/>
     <w:p>
       <w:pPr>
         <w:pStyle w:val="Bibliography"/>
@@ -3471,8 +5382,8 @@
         <w:t xml:space="preserve">The MITRE Corporation, Bedford, MA, USA, MTR-2547, Vol. I, 1973.</w:t>
       </w:r>
     </w:p>
-    <w:bookmarkEnd w:id="25"/>
-    <w:bookmarkStart w:id="26" w:name="ref-ferraiolokuhn1992"/>
+    <w:bookmarkEnd w:id="33"/>
+    <w:bookmarkStart w:id="34" w:name="ref-ferraiolokuhn1992"/>
     <w:p>
       <w:pPr>
         <w:pStyle w:val="Bibliography"/>
@@ -3515,8 +5426,8 @@
         <w:t xml:space="preserve">, Baltimore, MD, USA, 1992, pp. 554–563.</w:t>
       </w:r>
     </w:p>
-    <w:bookmarkEnd w:id="26"/>
-    <w:bookmarkStart w:id="27" w:name="ref-incits2004"/>
+    <w:bookmarkEnd w:id="34"/>
+    <w:bookmarkStart w:id="35" w:name="ref-incits2004"/>
     <w:p>
       <w:pPr>
         <w:pStyle w:val="Bibliography"/>
@@ -3555,8 +5466,8 @@
         <w:t xml:space="preserve">ANSI/INCITS Standard, 2004.</w:t>
       </w:r>
     </w:p>
-    <w:bookmarkEnd w:id="27"/>
-    <w:bookmarkStart w:id="29" w:name="ref-saltzerschroeder1975"/>
+    <w:bookmarkEnd w:id="35"/>
+    <w:bookmarkStart w:id="37" w:name="ref-saltzerschroeder1975"/>
     <w:p>
       <w:pPr>
         <w:pStyle w:val="Bibliography"/>
@@ -3595,7 +5506,7 @@
       <w:r>
         <w:t xml:space="preserve"> </w:t>
       </w:r>
-      <w:hyperlink r:id="rId28">
+      <w:hyperlink r:id="rId36">
         <w:r>
           <w:rPr>
             <w:rStyle w:val="Hyperlink"/>
@@ -3607,9 +5518,184 @@
         <w:t xml:space="preserve">.</w:t>
       </w:r>
     </w:p>
-    <w:bookmarkEnd w:id="29"/>
-    <w:bookmarkEnd w:id="30"/>
-    <w:bookmarkEnd w:id="31"/>
+    <w:bookmarkEnd w:id="37"/>
+    <w:bookmarkStart w:id="39" w:name="ref-mysqlbug41354"/>
+    <w:p>
+      <w:pPr>
+        <w:pStyle w:val="Bibliography"/>
+      </w:pPr>
+      <w:r>
+        <w:t xml:space="preserve">[8]</w:t>
+      </w:r>
+      <w:r>
+        <w:t xml:space="preserve"> </w:t>
+      </w:r>
+      <w:r>
+        <w:t xml:space="preserve">	</w:t>
+      </w:r>
+      <w:r>
+        <w:t xml:space="preserve">Oracle Corporation,</w:t>
+      </w:r>
+      <w:r>
+        <w:t xml:space="preserve"> </w:t>
+      </w:r>
+      <w:r>
+        <w:t xml:space="preserve">“</w:t>
+      </w:r>
+      <w:r>
+        <w:t xml:space="preserve">MySQL Bug</w:t>
+      </w:r>
+      <w:r>
+        <w:t xml:space="preserve"> </w:t>
+      </w:r>
+      <w:r>
+        <w:t xml:space="preserve">#41354: Column privileges not honored for</w:t>
+      </w:r>
+      <w:r>
+        <w:t xml:space="preserve"> </w:t>
+      </w:r>
+      <w:r>
+        <w:t xml:space="preserve">SELECT</w:t>
+      </w:r>
+      <w:r>
+        <w:t xml:space="preserve"> </w:t>
+      </w:r>
+      <w:r>
+        <w:t xml:space="preserve">*.”</w:t>
+      </w:r>
+      <w:r>
+        <w:t xml:space="preserve"> </w:t>
+      </w:r>
+      <w:hyperlink r:id="rId38">
+        <w:r>
+          <w:rPr>
+            <w:rStyle w:val="Hyperlink"/>
+          </w:rPr>
+          <w:t xml:space="preserve">https://bugs.mysql.com/bug.php?id=41354</w:t>
+        </w:r>
+      </w:hyperlink>
+      <w:r>
+        <w:t xml:space="preserve">, 2009.</w:t>
+      </w:r>
+    </w:p>
+    <w:bookmarkEnd w:id="39"/>
+    <w:bookmarkStart w:id="41" w:name="ref-postgresrls2024"/>
+    <w:p>
+      <w:pPr>
+        <w:pStyle w:val="Bibliography"/>
+      </w:pPr>
+      <w:r>
+        <w:t xml:space="preserve">[9]</w:t>
+      </w:r>
+      <w:r>
+        <w:t xml:space="preserve"> </w:t>
+      </w:r>
+      <w:r>
+        <w:t xml:space="preserve">	</w:t>
+      </w:r>
+      <w:r>
+        <w:t xml:space="preserve">The PostgreSQL Global Development Group,</w:t>
+      </w:r>
+      <w:r>
+        <w:t xml:space="preserve"> </w:t>
+      </w:r>
+      <w:r>
+        <w:t xml:space="preserve">“</w:t>
+      </w:r>
+      <w:r>
+        <w:t xml:space="preserve">PostgreSQL</w:t>
+      </w:r>
+      <w:r>
+        <w:t xml:space="preserve"> </w:t>
+      </w:r>
+      <w:r>
+        <w:t xml:space="preserve">17 documentation: Row security policies.”</w:t>
+      </w:r>
+      <w:r>
+        <w:t xml:space="preserve"> </w:t>
+      </w:r>
+      <w:hyperlink r:id="rId40">
+        <w:r>
+          <w:rPr>
+            <w:rStyle w:val="Hyperlink"/>
+          </w:rPr>
+          <w:t xml:space="preserve">https://www.postgresql.org/docs/current/ddl-rowsecurity.html</w:t>
+        </w:r>
+      </w:hyperlink>
+      <w:r>
+        <w:t xml:space="preserve">, 2024.</w:t>
+      </w:r>
+    </w:p>
+    <w:bookmarkEnd w:id="41"/>
+    <w:bookmarkStart w:id="43" w:name="ref-oraclevpd2024"/>
+    <w:p>
+      <w:pPr>
+        <w:pStyle w:val="Bibliography"/>
+      </w:pPr>
+      <w:r>
+        <w:t xml:space="preserve">[10]</w:t>
+      </w:r>
+      <w:r>
+        <w:t xml:space="preserve"> </w:t>
+      </w:r>
+      <w:r>
+        <w:t xml:space="preserve">	</w:t>
+      </w:r>
+      <w:r>
+        <w:t xml:space="preserve">Oracle Corporation,</w:t>
+      </w:r>
+      <w:r>
+        <w:t xml:space="preserve"> </w:t>
+      </w:r>
+      <w:r>
+        <w:t xml:space="preserve">“</w:t>
+      </w:r>
+      <w:r>
+        <w:t xml:space="preserve">Oracle Database</w:t>
+      </w:r>
+      <w:r>
+        <w:t xml:space="preserve"> </w:t>
+      </w:r>
+      <w:r>
+        <w:t xml:space="preserve">security guide: Using</w:t>
+      </w:r>
+      <w:r>
+        <w:t xml:space="preserve"> </w:t>
+      </w:r>
+      <w:r>
+        <w:t xml:space="preserve">Oracle</w:t>
+      </w:r>
+      <w:r>
+        <w:t xml:space="preserve"> </w:t>
+      </w:r>
+      <w:r>
+        <w:t xml:space="preserve">VPD</w:t>
+      </w:r>
+      <w:r>
+        <w:t xml:space="preserve"> </w:t>
+      </w:r>
+      <w:r>
+        <w:t xml:space="preserve">to control data access.”</w:t>
+      </w:r>
+      <w:r>
+        <w:t xml:space="preserve"> </w:t>
+      </w:r>
+      <w:hyperlink r:id="rId42">
+        <w:r>
+          <w:rPr>
+            <w:rStyle w:val="Hyperlink"/>
+          </w:rPr>
+          <w:t xml:space="preserve">https://docs.oracle.com/en/database/oracle/oracle-database/21/dbseg/using-oracle-vpd-to-control-data-access.html</w:t>
+        </w:r>
+      </w:hyperlink>
+      <w:r>
+        <w:t xml:space="preserve">, 2024.</w:t>
+      </w:r>
+    </w:p>
+    <w:bookmarkEnd w:id="43"/>
+    <w:bookmarkEnd w:id="44"/>
+    <w:bookmarkEnd w:id="45"/>
+    <w:bookmarkEnd w:id="46"/>
     <w:sectPr>
       <w:pgSz w:h="16838" w:w="11906"/>
       <w:pgMar w:bottom="1417" w:footer="708" w:gutter="0" w:header="708" w:left="1417" w:right="1417" w:top="1417"/>

</xml_diff>

<commit_message>
Tema 2: doradi pisanje petog poglavlja i ponovo izvezi rad.docx
- uklonjene sve crtice (em dash) iz petog poglavlja, po pravilu iz WRITING.md
- ispravljen padez: "Istom porodicom ... pripadaju" -> "Istoj porodici"
- razresena protivrecnost: trinaest od cetrnaest mehanizama radi na Community
  izdanju, cetrnaesti je Enterprise Firewall
- jezicke i terminoloske popravke: "Politika jacine lozinke", "podrazumevano
  iskljucenog", "Promenljiva validate_password.policy", uklonjen "poglavljev"
- REQUIRE opisan potvrdno, bez nepotkrepljene tvrdnje o tome kako se "cesto
  opisuje"
- dodata citat za MySQL Enterprise Firewall i ispravljena referenca na
  sistem privilegija (trece poglavlje)
- prelomljeni redovi u izvoru i ponovo izvezen rad.docx
</commit_message>
<xml_diff>
--- a/Tema 2. - Kontrola pristupa i sigurnosni modeli u MySQL bazi podataka/rad.docx
+++ b/Tema 2. - Kontrola pristupa i sigurnosni modeli u MySQL bazi podataka/rad.docx
@@ -5301,13 +5301,7 @@
         <w:t xml:space="preserve">[2]</w:t>
       </w:r>
       <w:r>
-        <w:t xml:space="preserve">. Taj izabrani red</w:t>
-      </w:r>
-      <w:r>
-        <w:t xml:space="preserve"> </w:t>
-      </w:r>
-      <w:r>
-        <w:t xml:space="preserve">imenuje, u sopstvenoj koloni</w:t>
+        <w:t xml:space="preserve">. Taj izabrani red imenuje, u sopstvenoj koloni</w:t>
       </w:r>
       <w:r>
         <w:t xml:space="preserve"> </w:t>
@@ -5331,7 +5325,13 @@
         <w:t xml:space="preserve">caching_sha2_password</w:t>
       </w:r>
       <w:r>
-        <w:t xml:space="preserve">, naslednik ranijeg</w:t>
+        <w:t xml:space="preserve">,</w:t>
+      </w:r>
+      <w:r>
+        <w:t xml:space="preserve"> </w:t>
+      </w:r>
+      <w:r>
+        <w:t xml:space="preserve">naslednik ranijeg</w:t>
       </w:r>
       <w:r>
         <w:t xml:space="preserve"> </w:t>
@@ -5343,13 +5343,13 @@
         <w:t xml:space="preserve">mysql_native_password</w:t>
       </w:r>
       <w:r>
-        <w:t xml:space="preserve">, obeleženog kao zastarelog od</w:t>
-      </w:r>
-      <w:r>
-        <w:t xml:space="preserve"> </w:t>
-      </w:r>
-      <w:r>
-        <w:t xml:space="preserve">verzije 8.0.34 i isključenog po podrazumevanoj vrednosti od verzije 8.4</w:t>
+        <w:t xml:space="preserve">, obeleženog kao zastarelog od verzije 8.0.34 i</w:t>
+      </w:r>
+      <w:r>
+        <w:t xml:space="preserve"> </w:t>
+      </w:r>
+      <w:r>
+        <w:t xml:space="preserve">podrazumevano isključenog od verzije 8.4</w:t>
       </w:r>
       <w:r>
         <w:t xml:space="preserve"> </w:t>
@@ -5358,19 +5358,19 @@
         <w:t xml:space="preserve">[2]</w:t>
       </w:r>
       <w:r>
-        <w:t xml:space="preserve">. Plugin je,</w:t>
-      </w:r>
-      <w:r>
-        <w:t xml:space="preserve"> </w:t>
-      </w:r>
-      <w:r>
-        <w:t xml:space="preserve">dakle, zamenljiv modul vezan za pojedinačan nalog, ne za server u celini, a njegov posao je uzak: prima</w:t>
-      </w:r>
-      <w:r>
-        <w:t xml:space="preserve"> </w:t>
-      </w:r>
-      <w:r>
-        <w:t xml:space="preserve">akreditiv i sadržaj kolone</w:t>
+        <w:t xml:space="preserve">. Plugin je, dakle, zamenljiv modul vezan</w:t>
+      </w:r>
+      <w:r>
+        <w:t xml:space="preserve"> </w:t>
+      </w:r>
+      <w:r>
+        <w:t xml:space="preserve">za pojedinačan nalog, ne za server u celini, a njegov posao je uzak: prima akreditiv i sadržaj</w:t>
+      </w:r>
+      <w:r>
+        <w:t xml:space="preserve"> </w:t>
+      </w:r>
+      <w:r>
+        <w:t xml:space="preserve">kolone</w:t>
       </w:r>
       <w:r>
         <w:t xml:space="preserve"> </w:t>
@@ -5447,7 +5447,7 @@
         <w:pStyle w:val="BodyText"/>
       </w:pPr>
       <w:r>
-        <w:t xml:space="preserve">Politika o jačini lozinke ne stiže u ovaj obrazac na očekivan način. Plugin je pri prijavi nemoćan da</w:t>
+        <w:t xml:space="preserve">Politika jačine lozinke ne stiže u ovaj obrazac na očekivan način. Plugin je pri prijavi nemoćan da</w:t>
       </w:r>
       <w:r>
         <w:t xml:space="preserve"> </w:t>
@@ -5582,7 +5582,7 @@
         <w:t xml:space="preserve">[2]</w:t>
       </w:r>
       <w:r>
-        <w:t xml:space="preserve">. Prekidač</w:t>
+        <w:t xml:space="preserve">. Promenljiva</w:t>
       </w:r>
       <w:r>
         <w:t xml:space="preserve"> </w:t>
@@ -5597,7 +5597,13 @@
         <w:t xml:space="preserve"> </w:t>
       </w:r>
       <w:r>
-        <w:t xml:space="preserve">određuje koliko se od toga uopšte primenjuje:</w:t>
+        <w:t xml:space="preserve">određuje koliko se od toga uopšte</w:t>
+      </w:r>
+      <w:r>
+        <w:t xml:space="preserve"> </w:t>
+      </w:r>
+      <w:r>
+        <w:t xml:space="preserve">primenjuje:</w:t>
       </w:r>
       <w:r>
         <w:t xml:space="preserve"> </w:t>
@@ -5839,16 +5845,13 @@
         <w:t xml:space="preserve">[2]</w:t>
       </w:r>
       <w:r>
-        <w:t xml:space="preserve"> </w:t>
-      </w:r>
-      <w:r>
-        <w:t xml:space="preserve">— četvrti primer u ovom radu istog obrasca: kada oblik grant tabela ne ume da izrazi</w:t>
-      </w:r>
-      <w:r>
-        <w:t xml:space="preserve"> </w:t>
-      </w:r>
-      <w:r>
-        <w:t xml:space="preserve">pravilo, MySQL ga ne uvodi kao novi mehanizam, nego ga dopisuje van te šeme (</w:t>
+        <w:t xml:space="preserve">. To je četvrti primer istog obrasca u ovom radu: kada oblik grant tabela ne ume da</w:t>
+      </w:r>
+      <w:r>
+        <w:t xml:space="preserve"> </w:t>
+      </w:r>
+      <w:r>
+        <w:t xml:space="preserve">izrazi pravilo, MySQL ga ne uvodi kao novi mehanizam, nego ga dopisuje van te šeme (</w:t>
       </w:r>
       <w:r>
         <w:rPr>
@@ -5860,13 +5863,7 @@
         <w:t xml:space="preserve"> </w:t>
       </w:r>
       <w:r>
-        <w:t xml:space="preserve">iz</w:t>
-      </w:r>
-      <w:r>
-        <w:t xml:space="preserve"> </w:t>
-      </w:r>
-      <w:r>
-        <w:t xml:space="preserve">trećeg poglavlja i pogled kao imenovan predikat iz četvrtog poglavlja su ranija dva primera istog</w:t>
+        <w:t xml:space="preserve">iz trećeg poglavlja i pogled kao imenovan predikat iz četvrtog poglavlja su ranija dva primera istog</w:t>
       </w:r>
       <w:r>
         <w:t xml:space="preserve"> </w:t>
@@ -5948,13 +5945,13 @@
         <w:t xml:space="preserve">[2]</w:t>
       </w:r>
       <w:r>
-        <w:t xml:space="preserve">. Levo je, radi</w:t>
-      </w:r>
-      <w:r>
-        <w:t xml:space="preserve"> </w:t>
-      </w:r>
-      <w:r>
-        <w:t xml:space="preserve">kontrasta, ista vrsta upita kroz običan, nezaključan nalog. Poruka na serveru rada glasi</w:t>
+        <w:t xml:space="preserve">. Levo je,</w:t>
+      </w:r>
+      <w:r>
+        <w:t xml:space="preserve"> </w:t>
+      </w:r>
+      <w:r>
+        <w:t xml:space="preserve">radi kontrasta, ista vrsta upita kroz običan, nezaključan nalog. Poruka na serveru rada glasi</w:t>
       </w:r>
       <w:r>
         <w:t xml:space="preserve"> </w:t>
@@ -5966,13 +5963,19 @@
         <w:t xml:space="preserve">3955</w:t>
       </w:r>
       <w:r>
-        <w:t xml:space="preserve">; primer</w:t>
-      </w:r>
-      <w:r>
-        <w:t xml:space="preserve"> </w:t>
-      </w:r>
-      <w:r>
-        <w:t xml:space="preserve">u samom priručniku, uveden rečima „greška nalik ovoj“, ilustracija a ne specifikacija, prikazuje broj</w:t>
+        <w:t xml:space="preserve">;</w:t>
+      </w:r>
+      <w:r>
+        <w:t xml:space="preserve"> </w:t>
+      </w:r>
+      <w:r>
+        <w:t xml:space="preserve">primer u samom priručniku, uveden rečima „greška nalik ovoj“, ilustracija a ne specifikacija,</w:t>
+      </w:r>
+      <w:r>
+        <w:t xml:space="preserve"> </w:t>
+      </w:r>
+      <w:r>
+        <w:t xml:space="preserve">prikazuje broj</w:t>
       </w:r>
       <w:r>
         <w:t xml:space="preserve"> </w:t>
@@ -5990,16 +5993,13 @@
         <w:t xml:space="preserve">[2]</w:t>
       </w:r>
       <w:r>
-        <w:t xml:space="preserve"> </w:t>
-      </w:r>
-      <w:r>
-        <w:t xml:space="preserve">— razlika je zabeležena ovde upravo zato što se u rad prenosi izmerena vrednost,</w:t>
-      </w:r>
-      <w:r>
-        <w:t xml:space="preserve"> </w:t>
-      </w:r>
-      <w:r>
-        <w:t xml:space="preserve">ne primer iz priručnika. Ova greška je, uz to, različita od</w:t>
+        <w:t xml:space="preserve">. Razlika je zabeležena ovde upravo zato što se u rad prenosi</w:t>
+      </w:r>
+      <w:r>
+        <w:t xml:space="preserve"> </w:t>
+      </w:r>
+      <w:r>
+        <w:t xml:space="preserve">izmerena vrednost, ne primer iz priručnika. Ova greška je, uz to, različita od</w:t>
       </w:r>
       <w:r>
         <w:t xml:space="preserve"> </w:t>
@@ -6011,13 +6011,7 @@
         <w:t xml:space="preserve">ER_ACCOUNT_HAS_BEEN_LOCKED</w:t>
       </w:r>
       <w:r>
-        <w:t xml:space="preserve">, koja se</w:t>
-      </w:r>
-      <w:r>
-        <w:t xml:space="preserve"> </w:t>
-      </w:r>
-      <w:r>
-        <w:t xml:space="preserve">vraća za ručno zaključan nalog (</w:t>
+        <w:t xml:space="preserve">, koja se vraća za ručno zaključan nalog (</w:t>
       </w:r>
       <w:r>
         <w:rPr>
@@ -6026,7 +6020,13 @@
         <w:t xml:space="preserve">ACCOUNT LOCK</w:t>
       </w:r>
       <w:r>
-        <w:t xml:space="preserve">) i glasi samo „Account is locked.“</w:t>
+        <w:t xml:space="preserve">) i glasi samo</w:t>
+      </w:r>
+      <w:r>
+        <w:t xml:space="preserve"> </w:t>
+      </w:r>
+      <w:r>
+        <w:t xml:space="preserve">„Account is locked.“</w:t>
       </w:r>
       <w:r>
         <w:t xml:space="preserve"> </w:t>
@@ -6035,22 +6035,13 @@
         <w:t xml:space="preserve">[2]</w:t>
       </w:r>
       <w:r>
-        <w:t xml:space="preserve"> </w:t>
-      </w:r>
-      <w:r>
-        <w:t xml:space="preserve">—</w:t>
-      </w:r>
-      <w:r>
-        <w:t xml:space="preserve"> </w:t>
-      </w:r>
-      <w:r>
-        <w:t xml:space="preserve">dva odvojena puta do istog ishoda, zaključan nalog, zaslužuju dve različite poruke jer jezgro pamti i</w:t>
-      </w:r>
-      <w:r>
-        <w:t xml:space="preserve"> </w:t>
-      </w:r>
-      <w:r>
-        <w:t xml:space="preserve">zašto je nalog zaključan.</w:t>
+        <w:t xml:space="preserve">: dva odvojena puta do istog ishoda, zaključan nalog, zaslužuju</w:t>
+      </w:r>
+      <w:r>
+        <w:t xml:space="preserve"> </w:t>
+      </w:r>
+      <w:r>
+        <w:t xml:space="preserve">dve različite poruke jer jezgro pamti i zašto je nalog zaključan.</w:t>
       </w:r>
     </w:p>
     <w:p>
@@ -6113,7 +6104,7 @@
         <w:pStyle w:val="BodyText"/>
       </w:pPr>
       <w:r>
-        <w:t xml:space="preserve">Ovo je poglavljev najjasniji primer sopstvene teze: plugin je, u četvrtom pokušaju, akreditiv proverio</w:t>
+        <w:t xml:space="preserve">Ovo je najjasniji primer teze ovog poglavlja: plugin je, u četvrtom pokušaju, akreditiv proverio</w:t>
       </w:r>
       <w:r>
         <w:t xml:space="preserve"> </w:t>
@@ -6166,7 +6157,13 @@
         <w:t xml:space="preserve">0</w:t>
       </w:r>
       <w:r>
-        <w:t xml:space="preserve">, isticanje je globalno isključeno, a po nalogu se uključuje klauzulama</w:t>
+        <w:t xml:space="preserve">, isticanje je globalno isključeno, a po nalogu se</w:t>
+      </w:r>
+      <w:r>
+        <w:t xml:space="preserve"> </w:t>
+      </w:r>
+      <w:r>
+        <w:t xml:space="preserve">uključuje klauzulama</w:t>
       </w:r>
       <w:r>
         <w:t xml:space="preserve"> </w:t>
@@ -6199,19 +6196,19 @@
         <w:t xml:space="preserve">[2]</w:t>
       </w:r>
       <w:r>
-        <w:t xml:space="preserve">. Kada lozinka istekne,</w:t>
-      </w:r>
-      <w:r>
-        <w:t xml:space="preserve"> </w:t>
-      </w:r>
-      <w:r>
-        <w:t xml:space="preserve">veza se ne odbija, nego se prijava završava u ograničenom režimu u kome svaka naredba osim same promene</w:t>
-      </w:r>
-      <w:r>
-        <w:t xml:space="preserve"> </w:t>
-      </w:r>
-      <w:r>
-        <w:t xml:space="preserve">lozinke pada sa</w:t>
+        <w:t xml:space="preserve">.</w:t>
+      </w:r>
+      <w:r>
+        <w:t xml:space="preserve"> </w:t>
+      </w:r>
+      <w:r>
+        <w:t xml:space="preserve">Kada lozinka istekne, veza se ne odbija, nego se prijava završava u ograničenom režimu u kome svaka</w:t>
+      </w:r>
+      <w:r>
+        <w:t xml:space="preserve"> </w:t>
+      </w:r>
+      <w:r>
+        <w:t xml:space="preserve">naredba osim same promene lozinke pada sa</w:t>
       </w:r>
       <w:r>
         <w:t xml:space="preserve"> </w:t>
@@ -6241,22 +6238,19 @@
         <w:t xml:space="preserve">[2]</w:t>
       </w:r>
       <w:r>
-        <w:t xml:space="preserve"> </w:t>
-      </w:r>
-      <w:r>
-        <w:t xml:space="preserve">— jezgro, dakle, ne bira uvek</w:t>
-      </w:r>
-      <w:r>
-        <w:t xml:space="preserve"> </w:t>
-      </w:r>
-      <w:r>
-        <w:t xml:space="preserve">između odbijanja i dozvole, nego ume i da nalog primi u sopstvenu, suženu sesiju. Istom porodicom</w:t>
-      </w:r>
-      <w:r>
-        <w:t xml:space="preserve"> </w:t>
-      </w:r>
-      <w:r>
-        <w:t xml:space="preserve">odluka jezgra pripadaju i istorija lozinki,</w:t>
+        <w:t xml:space="preserve">:</w:t>
+      </w:r>
+      <w:r>
+        <w:t xml:space="preserve"> </w:t>
+      </w:r>
+      <w:r>
+        <w:t xml:space="preserve">jezgro, dakle, ne bira uvek između odbijanja i dozvole, nego ume i da nalog primi u sopstvenu, suženu</w:t>
+      </w:r>
+      <w:r>
+        <w:t xml:space="preserve"> </w:t>
+      </w:r>
+      <w:r>
+        <w:t xml:space="preserve">sesiju. Istoj porodici odluka jezgra pripadaju i istorija lozinki,</w:t>
       </w:r>
       <w:r>
         <w:t xml:space="preserve"> </w:t>
@@ -6271,7 +6265,13 @@
         <w:t xml:space="preserve"> </w:t>
       </w:r>
       <w:r>
-        <w:t xml:space="preserve">uz proveru prema</w:t>
+        <w:t xml:space="preserve">uz proveru</w:t>
+      </w:r>
+      <w:r>
+        <w:t xml:space="preserve"> </w:t>
+      </w:r>
+      <w:r>
+        <w:t xml:space="preserve">prema</w:t>
       </w:r>
       <w:r>
         <w:t xml:space="preserve"> </w:t>
@@ -6301,13 +6301,13 @@
         <w:t xml:space="preserve"> </w:t>
       </w:r>
       <w:r>
-        <w:t xml:space="preserve">koje čuvaju staru uz novu radi bezbedne rotacije akreditiva u sistemima sa više povezanih servisa, i</w:t>
-      </w:r>
-      <w:r>
-        <w:t xml:space="preserve"> </w:t>
-      </w:r>
-      <w:r>
-        <w:t xml:space="preserve">ograničenje resursa po nalogu,</w:t>
+        <w:t xml:space="preserve">koje čuvaju staru uz novu radi bezbedne rotacije akreditiva u sistemima sa više povezanih</w:t>
+      </w:r>
+      <w:r>
+        <w:t xml:space="preserve"> </w:t>
+      </w:r>
+      <w:r>
+        <w:t xml:space="preserve">servisa, i ograničenje resursa po nalogu,</w:t>
       </w:r>
       <w:r>
         <w:t xml:space="preserve"> </w:t>
@@ -6322,13 +6322,13 @@
         <w:t xml:space="preserve"> </w:t>
       </w:r>
       <w:r>
-        <w:t xml:space="preserve">i srodne klauzule, posle čijeg prekoračenja</w:t>
-      </w:r>
-      <w:r>
-        <w:t xml:space="preserve"> </w:t>
-      </w:r>
-      <w:r>
-        <w:t xml:space="preserve">sledeći upit u istom satu pada sa</w:t>
+        <w:t xml:space="preserve">i srodne klauzule, posle čijeg</w:t>
+      </w:r>
+      <w:r>
+        <w:t xml:space="preserve"> </w:t>
+      </w:r>
+      <w:r>
+        <w:t xml:space="preserve">prekoračenja sledeći upit u istom satu pada sa</w:t>
       </w:r>
       <w:r>
         <w:t xml:space="preserve"> </w:t>
@@ -6346,7 +6346,13 @@
         <w:t xml:space="preserve">[2]</w:t>
       </w:r>
       <w:r>
-        <w:t xml:space="preserve">. Nijedna od ovih odluka ne prolazi kroz plugin niti kroz</w:t>
+        <w:t xml:space="preserve">. Nijedna od ovih odluka</w:t>
+      </w:r>
+      <w:r>
+        <w:t xml:space="preserve"> </w:t>
+      </w:r>
+      <w:r>
+        <w:t xml:space="preserve">ne prolazi kroz plugin niti kroz</w:t>
       </w:r>
       <w:r>
         <w:t xml:space="preserve"> </w:t>
@@ -6358,7 +6364,13 @@
         <w:t xml:space="preserve">validate_password</w:t>
       </w:r>
       <w:r>
-        <w:t xml:space="preserve">; sve čita ili upisuje jezgro, nad kolonama ili brojačima vezanim za sam nalog.</w:t>
+        <w:t xml:space="preserve">; sve čita ili upisuje jezgro, nad kolonama ili</w:t>
+      </w:r>
+      <w:r>
+        <w:t xml:space="preserve"> </w:t>
+      </w:r>
+      <w:r>
+        <w:t xml:space="preserve">brojačima vezanim za sam nalog.</w:t>
       </w:r>
     </w:p>
     <w:p>
@@ -6432,55 +6444,25 @@
         <w:t xml:space="preserve"> </w:t>
       </w:r>
       <w:r>
-        <w:t xml:space="preserve">često se opisuje kao provera koja prethodi samom izboru naloga, tokom TLS razmene pre nego što je</w:t>
-      </w:r>
-      <w:r>
-        <w:t xml:space="preserve"> </w:t>
-      </w:r>
-      <w:r>
-        <w:t xml:space="preserve">red</w:t>
-      </w:r>
-      <w:r>
-        <w:t xml:space="preserve"> </w:t>
-      </w:r>
-      <w:r>
-        <w:rPr>
-          <w:rStyle w:val="VerbatimChar"/>
-        </w:rPr>
-        <w:t xml:space="preserve">mysql.user</w:t>
-      </w:r>
-      <w:r>
-        <w:t xml:space="preserve"> </w:t>
-      </w:r>
-      <w:r>
-        <w:t xml:space="preserve">uopšte izabran. To nije tačno: pošto je</w:t>
-      </w:r>
-      <w:r>
-        <w:t xml:space="preserve"> </w:t>
-      </w:r>
-      <w:r>
-        <w:rPr>
-          <w:rStyle w:val="VerbatimChar"/>
-        </w:rPr>
-        <w:t xml:space="preserve">REQUIRE</w:t>
-      </w:r>
-      <w:r>
-        <w:t xml:space="preserve"> </w:t>
-      </w:r>
-      <w:r>
-        <w:t xml:space="preserve">svojstvo naloga, upisano u onom istom redu koji prvi korak bira, ne može se proveriti pre nego što je taj red izabran — TLS razmena</w:t>
-      </w:r>
-      <w:r>
-        <w:t xml:space="preserve"> </w:t>
-      </w:r>
-      <w:r>
-        <w:t xml:space="preserve">se dešava ranije, ali odluku „sme li baš ovaj nalog da se poveže bez šifrovanog kanala“ jezgro donosi</w:t>
-      </w:r>
-      <w:r>
-        <w:t xml:space="preserve"> </w:t>
-      </w:r>
-      <w:r>
-        <w:t xml:space="preserve">tek pošto je red već poznat, u okviru istog prvog koraka u kome se proverava i stanje zaključavanja</w:t>
+        <w:t xml:space="preserve">svojstvo je samog naloga, upisano u onom istom redu koji prvi korak bira, pa se ne može proveriti pre</w:t>
+      </w:r>
+      <w:r>
+        <w:t xml:space="preserve"> </w:t>
+      </w:r>
+      <w:r>
+        <w:t xml:space="preserve">nego što je taj red izabran. TLS razmena se dešava ranije, ali odluku „sme li baš ovaj nalog da se</w:t>
+      </w:r>
+      <w:r>
+        <w:t xml:space="preserve"> </w:t>
+      </w:r>
+      <w:r>
+        <w:t xml:space="preserve">poveže bez šifrovanog kanala“ jezgro donosi tek pošto je red već poznat, u okviru istog prvog koraka</w:t>
+      </w:r>
+      <w:r>
+        <w:t xml:space="preserve"> </w:t>
+      </w:r>
+      <w:r>
+        <w:t xml:space="preserve">u kome se proverava i stanje zaključavanja</w:t>
       </w:r>
       <w:r>
         <w:t xml:space="preserve"> </w:t>
@@ -6489,19 +6471,19 @@
         <w:t xml:space="preserve">[2]</w:t>
       </w:r>
       <w:r>
-        <w:t xml:space="preserve">. Poređenje hostova, kojim se, kod naloga sa istim imenom a različitim hostom, bira</w:t>
-      </w:r>
-      <w:r>
-        <w:t xml:space="preserve"> </w:t>
-      </w:r>
-      <w:r>
-        <w:t xml:space="preserve">najuže poklapanje, radi po istom redosledu prioriteta: doslovan host ili IP adresa, zatim CIDR zapis,</w:t>
-      </w:r>
-      <w:r>
-        <w:t xml:space="preserve"> </w:t>
-      </w:r>
-      <w:r>
-        <w:t xml:space="preserve">zatim mrežna maska, zatim džoker</w:t>
+        <w:t xml:space="preserve">. Poređenje hostova, kojim se, kod naloga</w:t>
+      </w:r>
+      <w:r>
+        <w:t xml:space="preserve"> </w:t>
+      </w:r>
+      <w:r>
+        <w:t xml:space="preserve">sa istim imenom a različitim hostom, bira najuže poklapanje, sledi isti redosled prioriteta: doslovan</w:t>
+      </w:r>
+      <w:r>
+        <w:t xml:space="preserve"> </w:t>
+      </w:r>
+      <w:r>
+        <w:t xml:space="preserve">host ili IP adresa, zatim CIDR zapis, zatim mrežna maska, zatim džoker</w:t>
       </w:r>
       <w:r>
         <w:t xml:space="preserve"> </w:t>
@@ -6513,13 +6495,13 @@
         <w:t xml:space="preserve">%</w:t>
       </w:r>
       <w:r>
-        <w:t xml:space="preserve">, zatim prazan niz, uz neanonimne naloge ispred anonimnih na istom</w:t>
-      </w:r>
-      <w:r>
-        <w:t xml:space="preserve"> </w:t>
-      </w:r>
-      <w:r>
-        <w:t xml:space="preserve">nivou</w:t>
+        <w:t xml:space="preserve">, zatim prazan niz, uz</w:t>
+      </w:r>
+      <w:r>
+        <w:t xml:space="preserve"> </w:t>
+      </w:r>
+      <w:r>
+        <w:t xml:space="preserve">neanonimne naloge ispred anonimnih na istom nivou</w:t>
       </w:r>
       <w:r>
         <w:t xml:space="preserve"> </w:t>
@@ -6725,10 +6707,7 @@
         <w:t xml:space="preserve">probni@localhost</w:t>
       </w:r>
       <w:r>
-        <w:t xml:space="preserve"> </w:t>
-      </w:r>
-      <w:r>
-        <w:t xml:space="preserve">— a</w:t>
+        <w:t xml:space="preserve">;</w:t>
       </w:r>
       <w:r>
         <w:t xml:space="preserve"> </w:t>
@@ -6863,13 +6842,7 @@
         <w:t xml:space="preserve">% | poliklinika | probni | Y</w:t>
       </w:r>
       <w:r>
-        <w:t xml:space="preserve">) je pregledan neposredno. Posledica za rad je</w:t>
-      </w:r>
-      <w:r>
-        <w:t xml:space="preserve"> </w:t>
-      </w:r>
-      <w:r>
-        <w:t xml:space="preserve">načelna:</w:t>
+        <w:t xml:space="preserve">) je pregledan neposredno. Posledica za rad je načelna:</w:t>
       </w:r>
       <w:r>
         <w:t xml:space="preserve"> </w:t>
@@ -6884,13 +6857,13 @@
         <w:t xml:space="preserve"> </w:t>
       </w:r>
       <w:r>
-        <w:t xml:space="preserve">imenuje red izabran u prvom koraku, ali ne ograničava domet same sesije, isti</w:t>
-      </w:r>
-      <w:r>
-        <w:t xml:space="preserve"> </w:t>
-      </w:r>
-      <w:r>
-        <w:t xml:space="preserve">oblik zaključka do kog je treće poglavlje došlo za</w:t>
+        <w:t xml:space="preserve">imenuje red izabran u prvom koraku, ali ne ograničava domet same sesije, isti oblik</w:t>
+      </w:r>
+      <w:r>
+        <w:t xml:space="preserve"> </w:t>
+      </w:r>
+      <w:r>
+        <w:t xml:space="preserve">zaključka do kog je treće poglavlje došlo za</w:t>
       </w:r>
       <w:r>
         <w:t xml:space="preserve"> </w:t>
@@ -6916,7 +6889,7 @@
         <w:pStyle w:val="BodyText"/>
       </w:pPr>
       <w:r>
-        <w:t xml:space="preserve">Svih trinaest mehanizama opisanih u ovom poglavlju sprovodi se na besplatnom MySQL Community izdanju</w:t>
+        <w:t xml:space="preserve">Trinaest od četrnaest mehanizama opisanih u ovom poglavlju radi na besplatnom MySQL Community izdanju</w:t>
       </w:r>
       <w:r>
         <w:t xml:space="preserve"> </w:t>
@@ -6925,55 +6898,70 @@
         <w:t xml:space="preserve">[2]</w:t>
       </w:r>
       <w:r>
-        <w:t xml:space="preserve">. Jedini izuzetak, MySQL Enterprise Firewall, radi po drugačijem kriterijumu od</w:t>
-      </w:r>
-      <w:r>
-        <w:t xml:space="preserve"> </w:t>
-      </w:r>
-      <w:r>
-        <w:t xml:space="preserve">celog ostatka poglavlja: ne proverava ni identitet naloga ni imenovani objekat, nego oblik same SQL</w:t>
-      </w:r>
-      <w:r>
-        <w:t xml:space="preserve"> </w:t>
-      </w:r>
-      <w:r>
-        <w:t xml:space="preserve">naredbe, upoređujući ga sa naučenim, dozvoljenim obrascem upita za dati nalog. Baš zato je ovaj</w:t>
-      </w:r>
-      <w:r>
-        <w:t xml:space="preserve"> </w:t>
-      </w:r>
-      <w:r>
-        <w:t xml:space="preserve">mehanizam, iako komercijalan i u ovom radu pokriven samo u teoriji, najbolji argument za granicu</w:t>
-      </w:r>
-      <w:r>
-        <w:t xml:space="preserve"> </w:t>
-      </w:r>
-      <w:r>
-        <w:t xml:space="preserve">diskrecionog modela iz drugog poglavlja: SQL injekcija ne krši nijednu privilegiju, subjekat i</w:t>
-      </w:r>
-      <w:r>
-        <w:t xml:space="preserve"> </w:t>
-      </w:r>
-      <w:r>
-        <w:t xml:space="preserve">objekat upita su oba legitimna, menja se isključivo oblik naredbe, pa je model zasnovan isključivo na</w:t>
-      </w:r>
-      <w:r>
-        <w:t xml:space="preserve"> </w:t>
-      </w:r>
-      <w:r>
-        <w:t xml:space="preserve">podatku (subjekat, objekat) strukturno slep za nju. Sprovođenje bezbednosnih politika opisanih u ovom</w:t>
-      </w:r>
-      <w:r>
-        <w:t xml:space="preserve"> </w:t>
-      </w:r>
-      <w:r>
-        <w:t xml:space="preserve">poglavlju uopšte ne pripada sistemu privilegija iz drugog i trećeg poglavlja: ono ne dodeljuje pravo</w:t>
-      </w:r>
-      <w:r>
-        <w:t xml:space="preserve"> </w:t>
-      </w:r>
-      <w:r>
-        <w:t xml:space="preserve">nad objektom, nego ograničava samo pravo naloga da se poveže i da vezu održi. Autentifikacija je u</w:t>
+        <w:t xml:space="preserve">. Četrnaesti, MySQL Enterprise Firewall, dostupan je samo u komercijalnom izdanju i</w:t>
+      </w:r>
+      <w:r>
+        <w:t xml:space="preserve"> </w:t>
+      </w:r>
+      <w:r>
+        <w:t xml:space="preserve">radi po drugačijem kriterijumu od celog ostatka poglavlja: ne proverava ni identitet naloga ni</w:t>
+      </w:r>
+      <w:r>
+        <w:t xml:space="preserve"> </w:t>
+      </w:r>
+      <w:r>
+        <w:t xml:space="preserve">imenovani objekat, nego oblik same SQL naredbe, upoređujući ga sa naučenim, dozvoljenim obrascem</w:t>
+      </w:r>
+      <w:r>
+        <w:t xml:space="preserve"> </w:t>
+      </w:r>
+      <w:r>
+        <w:t xml:space="preserve">upita za dati nalog</w:t>
+      </w:r>
+      <w:r>
+        <w:t xml:space="preserve"> </w:t>
+      </w:r>
+      <w:r>
+        <w:t xml:space="preserve">[2]</w:t>
+      </w:r>
+      <w:r>
+        <w:t xml:space="preserve">. Baš zato je ovaj mehanizam, iako u ovom radu pokriven samo u</w:t>
+      </w:r>
+      <w:r>
+        <w:t xml:space="preserve"> </w:t>
+      </w:r>
+      <w:r>
+        <w:t xml:space="preserve">teoriji, najbolji argument za granicu diskrecionog modela iz drugog poglavlja: SQL injekcija ne krši</w:t>
+      </w:r>
+      <w:r>
+        <w:t xml:space="preserve"> </w:t>
+      </w:r>
+      <w:r>
+        <w:t xml:space="preserve">nijednu privilegiju, subjekat i objekat upita su oba legitimna, menja se isključivo oblik naredbe, pa</w:t>
+      </w:r>
+      <w:r>
+        <w:t xml:space="preserve"> </w:t>
+      </w:r>
+      <w:r>
+        <w:t xml:space="preserve">je model zasnovan isključivo na podatku (subjekat, objekat) strukturno slep za nju. Sprovođenje</w:t>
+      </w:r>
+      <w:r>
+        <w:t xml:space="preserve"> </w:t>
+      </w:r>
+      <w:r>
+        <w:t xml:space="preserve">bezbednosnih politika opisanih u ovom poglavlju uopšte ne pripada sistemu privilegija iz trećeg</w:t>
+      </w:r>
+      <w:r>
+        <w:t xml:space="preserve"> </w:t>
+      </w:r>
+      <w:r>
+        <w:t xml:space="preserve">poglavlja: ono ne dodeljuje pravo nad objektom, nego ograničava samo pravo naloga da se poveže i da</w:t>
+      </w:r>
+      <w:r>
+        <w:t xml:space="preserve"> </w:t>
+      </w:r>
+      <w:r>
+        <w:t xml:space="preserve">vezu održi. Autentifikacija je u</w:t>
       </w:r>
       <w:r>
         <w:t xml:space="preserve"> </w:t>

</xml_diff>

<commit_message>
Tema 2, ch. 7: write Multi-tenant bezbednosni modeli into rad.md (ticket 20)
- rad.md §7 (~1440 words): pattern taxonomy derived from the (subject, object, operation)
  triple, silo vs. pool, schema = database correction, connection-pooling collision,
  isolation and attribution as one defect, least privilege landed as reach
- examples/07-multi-tenant/: two read-only scripts (reach measurement, SET @tenant_id patch)
  + README; captures in .scratch/.../measurements/0008-multi-tenant.md
- references.bib: awssaaslens, azuretenancy (both fetched and read before citing)
- Figure 7.1 re-rendered to strip an em dash (WRITING.md rule 8 covers figure text)
- lesson artifacts from the prior session (lessons/0006, reference/06, record 0008)
- rad.docx re-exported: 15 citations resolve, 22 rendered pages
</commit_message>
<xml_diff>
--- a/Tema 2. - Kontrola pristupa i sigurnosni modeli u MySQL bazi podataka/rad.docx
+++ b/Tema 2. - Kontrola pristupa i sigurnosni modeli u MySQL bazi podataka/rad.docx
@@ -6971,7 +6971,7 @@
       </w:r>
     </w:p>
     <w:bookmarkEnd w:id="33"/>
-    <w:bookmarkStart w:id="60" w:name="audit-logging"/>
+    <w:bookmarkStart w:id="37" w:name="audit-logging"/>
     <w:p>
       <w:pPr>
         <w:pStyle w:val="Heading1"/>
@@ -7902,23 +7902,338 @@
         <w:t xml:space="preserve">Slika 6.1: Isečak opšteg dnevnika upita - obe veze beleže samo nalog koji se povezao, nikada nalog čijim je pravima upit stvarno izvršen</w:t>
       </w:r>
     </w:p>
-    <w:bookmarkStart w:id="59" w:name="refs"/>
-    <w:bookmarkStart w:id="37" w:name="ref-ramakrishnan2003"/>
+    <w:bookmarkEnd w:id="37"/>
+    <w:bookmarkStart w:id="68" w:name="multi-tenant-bezbednosni-modeli"/>
     <w:p>
       <w:pPr>
-        <w:pStyle w:val="Bibliography"/>
-      </w:pPr>
+        <w:pStyle w:val="Heading1"/>
+      </w:pPr>
+      <w:r>
+        <w:t xml:space="preserve">7. Multi-tenant bezbednosni modeli</w:t>
+      </w:r>
+    </w:p>
+    <w:p>
+      <w:pPr>
+        <w:pStyle w:val="FirstParagraph"/>
+      </w:pPr>
+      <w:r>
+        <w:t xml:space="preserve">Pod multi-tenant okruženjem podrazumeva se postavka u kojoj jedna instanca sistema opslužuje više</w:t>
+      </w:r>
+      <w:r>
+        <w:t xml:space="preserve"> </w:t>
+      </w:r>
+      <w:r>
+        <w:t xml:space="preserve">međusobno nepoverljivih zakupaca (tenanta), pri čemu svaki od njih sme da vidi isključivo sopstvene</w:t>
+      </w:r>
+      <w:r>
+        <w:t xml:space="preserve"> </w:t>
+      </w:r>
+      <w:r>
+        <w:t xml:space="preserve">podatke. U primeru na kome je ovaj rad građen, tenant je podružnica klinike, a instanca je jedan</w:t>
+      </w:r>
+      <w:r>
+        <w:t xml:space="preserve"> </w:t>
+      </w:r>
+      <w:r>
+        <w:t xml:space="preserve">MySQL server sa jednom šemom</w:t>
+      </w:r>
+      <w:r>
+        <w:t xml:space="preserve"> </w:t>
+      </w:r>
+      <w:r>
+        <w:rPr>
+          <w:rStyle w:val="VerbatimChar"/>
+        </w:rPr>
+        <w:t xml:space="preserve">poliklinika</w:t>
+      </w:r>
+      <w:r>
+        <w:t xml:space="preserve">. Ovo poglavlje ne uvodi četvrti model kontrole pristupa</w:t>
+      </w:r>
+      <w:r>
+        <w:t xml:space="preserve"> </w:t>
+      </w:r>
+      <w:r>
+        <w:t xml:space="preserve">pored DAC-a, MAC-a i RBAC-a iz drugog poglavlja, nego proverava sve prethodne na jednom</w:t>
+      </w:r>
+      <w:r>
+        <w:t xml:space="preserve"> </w:t>
+      </w:r>
+      <w:r>
+        <w:t xml:space="preserve">projektantskom zadatku: gde se granica između tenanta može postaviti tako da je sprovodi sama baza</w:t>
+      </w:r>
+      <w:r>
+        <w:t xml:space="preserve"> </w:t>
+      </w:r>
+      <w:r>
+        <w:t xml:space="preserve">podataka, a ne aplikacija iznad nje.</w:t>
+      </w:r>
+    </w:p>
+    <w:p>
+      <w:pPr>
+        <w:pStyle w:val="BodyText"/>
+      </w:pPr>
+      <w:r>
+        <w:t xml:space="preserve">Polazna tačka nije spisak obrazaca iz literature, nego rečnik kojim baza raspolaže. Drugo poglavlje</w:t>
+      </w:r>
+      <w:r>
+        <w:t xml:space="preserve"> </w:t>
+      </w:r>
+      <w:r>
+        <w:t xml:space="preserve">je odluku o pristupu definisalo kao trojku (subjekat, objekat, operacija)</w:t>
+      </w:r>
+      <w:r>
+        <w:t xml:space="preserve"> </w:t>
+      </w:r>
       <w:r>
         <w:t xml:space="preserve">[1]</w:t>
       </w:r>
       <w:r>
-        <w:t xml:space="preserve"> </w:t>
-      </w:r>
-      <w:r>
-        <w:t xml:space="preserve">	</w:t>
-      </w:r>
-      <w:r>
-        <w:t xml:space="preserve">R. Ramakrishnan and J. Gehrke,</w:t>
+        <w:t xml:space="preserve">, a</w:t>
+      </w:r>
+      <w:r>
+        <w:t xml:space="preserve"> </w:t>
+      </w:r>
+      <w:r>
+        <w:t xml:space="preserve">treće i četvrto su pokazali čime je svaka koordinata u MySQL-u konkretno popunjena: subjekat je red u</w:t>
+      </w:r>
+      <w:r>
+        <w:t xml:space="preserve"> </w:t>
+      </w:r>
+      <w:r>
+        <w:t xml:space="preserve">tabeli</w:t>
+      </w:r>
+      <w:r>
+        <w:t xml:space="preserve"> </w:t>
+      </w:r>
+      <w:r>
+        <w:rPr>
+          <w:rStyle w:val="VerbatimChar"/>
+        </w:rPr>
+        <w:t xml:space="preserve">mysql.user</w:t>
+      </w:r>
+      <w:r>
+        <w:t xml:space="preserve"> </w:t>
+      </w:r>
+      <w:r>
+        <w:t xml:space="preserve">koji je prvi korak provere izabrao i koji</w:t>
+      </w:r>
+      <w:r>
+        <w:t xml:space="preserve"> </w:t>
+      </w:r>
+      <w:r>
+        <w:rPr>
+          <w:rStyle w:val="VerbatimChar"/>
+        </w:rPr>
+        <w:t xml:space="preserve">CURRENT_USER()</w:t>
+      </w:r>
+      <w:r>
+        <w:t xml:space="preserve"> </w:t>
+      </w:r>
+      <w:r>
+        <w:t xml:space="preserve">imenuje, objekat je</w:t>
+      </w:r>
+      <w:r>
+        <w:t xml:space="preserve"> </w:t>
+      </w:r>
+      <w:r>
+        <w:t xml:space="preserve">ono što</w:t>
+      </w:r>
+      <w:r>
+        <w:t xml:space="preserve"> </w:t>
+      </w:r>
+      <w:r>
+        <w:rPr>
+          <w:rStyle w:val="VerbatimChar"/>
+        </w:rPr>
+        <w:t xml:space="preserve">GRANT</w:t>
+      </w:r>
+      <w:r>
+        <w:t xml:space="preserve"> </w:t>
+      </w:r>
+      <w:r>
+        <w:t xml:space="preserve">imenuje (baza, tabela, kolona ili rutina), a operacija je sama privilegija</w:t>
+      </w:r>
+      <w:r>
+        <w:t xml:space="preserve"> </w:t>
+      </w:r>
+      <w:r>
+        <w:t xml:space="preserve">[2]</w:t>
+      </w:r>
+      <w:r>
+        <w:t xml:space="preserve">. U toj trojci nigde ne stoji pojam tenanta. Podružnica nije ni subjekat, ni objekat,</w:t>
+      </w:r>
+      <w:r>
+        <w:t xml:space="preserve"> </w:t>
+      </w:r>
+      <w:r>
+        <w:t xml:space="preserve">ni operacija, nego pojam poslovnog domena, pa server o njoj ne zna ništa osim onoga što mu je</w:t>
+      </w:r>
+      <w:r>
+        <w:t xml:space="preserve"> </w:t>
+      </w:r>
+      <w:r>
+        <w:t xml:space="preserve">prethodno prevedeno u jednu od tri koordinate.</w:t>
+      </w:r>
+    </w:p>
+    <w:p>
+      <w:pPr>
+        <w:pStyle w:val="BodyText"/>
+      </w:pPr>
+      <w:r>
+        <w:t xml:space="preserve">Otuda sledi pitanje koje čini okosnicu poglavlja: da bi baza uopšte mogla da sprovede granicu između</w:t>
+      </w:r>
+      <w:r>
+        <w:t xml:space="preserve"> </w:t>
+      </w:r>
+      <w:r>
+        <w:t xml:space="preserve">tenanta, ta granica mora biti izrečena na njenom jeziku. Operacija pritom otpada, jer je</w:t>
+      </w:r>
+      <w:r>
+        <w:t xml:space="preserve"> </w:t>
+      </w:r>
+      <w:r>
+        <w:rPr>
+          <w:rStyle w:val="VerbatimChar"/>
+        </w:rPr>
+        <w:t xml:space="preserve">SELECT</w:t>
+      </w:r>
+      <w:r>
+        <w:t xml:space="preserve"> </w:t>
+      </w:r>
+      <w:r>
+        <w:t xml:space="preserve">ista operacija za svakoga, pa ostaju tačno dve koordinate koje se po tenantu mogu razlikovati,</w:t>
+      </w:r>
+      <w:r>
+        <w:t xml:space="preserve"> </w:t>
+      </w:r>
+      <w:r>
+        <w:t xml:space="preserve">objekat i subjekat. Kombinacije te dve mogućnosti nisu stvar izbora nego iscrpno nabrajanje, i upravo</w:t>
+      </w:r>
+      <w:r>
+        <w:t xml:space="preserve"> </w:t>
+      </w:r>
+      <w:r>
+        <w:t xml:space="preserve">to nabrajanje daje obrasce prikazane na Slici 7.1, gde svaki list nosi tri podatka: domašaj jednog</w:t>
+      </w:r>
+      <w:r>
+        <w:t xml:space="preserve"> </w:t>
+      </w:r>
+      <w:r>
+        <w:t xml:space="preserve">naloga, tačku sprovođenja i cenu.</w:t>
+      </w:r>
+    </w:p>
+    <w:p>
+      <w:pPr>
+        <w:pStyle w:val="CaptionedFigure"/>
+      </w:pPr>
+      <w:r>
+        <w:drawing>
+          <wp:inline>
+            <wp:extent cx="5292852" cy="5164581"/>
+            <wp:effectExtent b="0" l="0" r="0" t="0"/>
+            <wp:docPr descr="Slika 7.1: Izbor multi-tenant obrasca kao stablo odluke. Dva pitanja, razlikuju li se objekti i razlikuju li se nalozi, iscrpljuju sve mogućnosti, pa četiri obrasca nisu spisak nego posledica." title="" id="39" name="Picture"/>
+            <a:graphic>
+              <a:graphicData uri="http://schemas.openxmlformats.org/drawingml/2006/picture">
+                <pic:pic>
+                  <pic:nvPicPr>
+                    <pic:cNvPr descr="figures/07-multi-tenant-01-obrasci-stablo-odluke.png" id="40" name="Picture"/>
+                    <pic:cNvPicPr>
+                      <a:picLocks noChangeArrowheads="1" noChangeAspect="1"/>
+                    </pic:cNvPicPr>
+                  </pic:nvPicPr>
+                  <pic:blipFill>
+                    <a:blip r:embed="rId38"/>
+                    <a:stretch>
+                      <a:fillRect/>
+                    </a:stretch>
+                  </pic:blipFill>
+                  <pic:spPr bwMode="auto">
+                    <a:xfrm>
+                      <a:off x="0" y="0"/>
+                      <a:ext cx="5292852" cy="5164581"/>
+                    </a:xfrm>
+                    <a:prstGeom prst="rect">
+                      <a:avLst/>
+                    </a:prstGeom>
+                    <a:noFill/>
+                    <a:ln w="9525">
+                      <a:noFill/>
+                      <a:headEnd/>
+                      <a:tailEnd/>
+                    </a:ln>
+                  </pic:spPr>
+                </pic:pic>
+              </a:graphicData>
+            </a:graphic>
+          </wp:inline>
+        </w:drawing>
+      </w:r>
+    </w:p>
+    <w:p>
+      <w:pPr>
+        <w:pStyle w:val="ImageCaption"/>
+      </w:pPr>
+      <w:r>
+        <w:t xml:space="preserve">Slika 7.1: Izbor multi-tenant obrasca kao stablo odluke. Dva pitanja, razlikuju li se objekti i razlikuju li se nalozi, iscrpljuju sve mogućnosti, pa četiri obrasca nisu spisak nego posledica.</w:t>
+      </w:r>
+    </w:p>
+    <w:p>
+      <w:pPr>
+        <w:pStyle w:val="BodyText"/>
+      </w:pPr>
+      <w:r>
+        <w:t xml:space="preserve">Kada se razlikuju obe koordinate, svaki tenant dobija sopstvenu bazu i sopstveni nalog, pa grant</w:t>
+      </w:r>
+      <w:r>
+        <w:t xml:space="preserve"> </w:t>
+      </w:r>
+      <w:r>
+        <w:t xml:space="preserve">glasi, na primer,</w:t>
+      </w:r>
+      <w:r>
+        <w:t xml:space="preserve"> </w:t>
+      </w:r>
+      <w:r>
+        <w:rPr>
+          <w:rStyle w:val="VerbatimChar"/>
+        </w:rPr>
+        <w:t xml:space="preserve">GRANT SELECT, INSERT ON pod_bar.* TO 'app_bar'@'10.0.0.%'</w:t>
+      </w:r>
+      <w:r>
+        <w:t xml:space="preserve">. Granica je tada</w:t>
+      </w:r>
+      <w:r>
+        <w:t xml:space="preserve"> </w:t>
+      </w:r>
+      <w:r>
+        <w:t xml:space="preserve">zapisana u oba imena koja provera pristupa ionako čita, i sprovodi je jezgro servera u drugom koraku</w:t>
+      </w:r>
+      <w:r>
+        <w:t xml:space="preserve"> </w:t>
+      </w:r>
+      <w:r>
+        <w:t xml:space="preserve">provere, nezavisno od ispravnosti aplikacije: nalog jedne podružnice ne može da dohvati podatke druge</w:t>
+      </w:r>
+      <w:r>
+        <w:t xml:space="preserve"> </w:t>
+      </w:r>
+      <w:r>
+        <w:t xml:space="preserve">ni onda kada upit koji to pokušava zaista stigne do servera, jer odgovarajućeg reda u tabeli dodele</w:t>
+      </w:r>
+      <w:r>
+        <w:t xml:space="preserve"> </w:t>
+      </w:r>
+      <w:r>
+        <w:t xml:space="preserve">prava nema</w:t>
+      </w:r>
+      <w:r>
+        <w:t xml:space="preserve"> </w:t>
+      </w:r>
+      <w:r>
+        <w:t xml:space="preserve">[2]</w:t>
+      </w:r>
+      <w:r>
+        <w:t xml:space="preserve">. Ovaj obrazac se u dokumentaciji vodećih dobavljača naziva</w:t>
       </w:r>
       <w:r>
         <w:t xml:space="preserve"> </w:t>
@@ -7928,14 +8243,936 @@
           <w:i/>
           <w:iCs/>
         </w:rPr>
+        <w:t xml:space="preserve">silo</w:t>
+      </w:r>
+      <w:r>
+        <w:t xml:space="preserve"> </w:t>
+      </w:r>
+      <w:r>
+        <w:t xml:space="preserve">[14]</w:t>
+      </w:r>
+      <w:r>
+        <w:t xml:space="preserve">, odnosno</w:t>
+      </w:r>
+      <w:r>
+        <w:t xml:space="preserve"> </w:t>
+      </w:r>
+      <w:r>
+        <w:rPr>
+          <w:i/>
+          <w:iCs/>
+        </w:rPr>
+        <w:t xml:space="preserve">database-per-tenant</w:t>
+      </w:r>
+      <w:r>
+        <w:t xml:space="preserve"> </w:t>
+      </w:r>
+      <w:r>
+        <w:t xml:space="preserve">[15]</w:t>
+      </w:r>
+      <w:r>
+        <w:t xml:space="preserve">, i oba izvora mu pripisuju visok</w:t>
+      </w:r>
+      <w:r>
+        <w:t xml:space="preserve"> </w:t>
+      </w:r>
+      <w:r>
+        <w:t xml:space="preserve">stepen izolacije uz visoku cenu: broj baza i naloga raste linearno sa brojem tenanta, a svaka izmena</w:t>
+      </w:r>
+      <w:r>
+        <w:t xml:space="preserve"> </w:t>
+      </w:r>
+      <w:r>
+        <w:t xml:space="preserve">šeme mora da se izvrši nad svakom bazom posebno</w:t>
+      </w:r>
+      <w:r>
+        <w:t xml:space="preserve"> </w:t>
+      </w:r>
+      <w:r>
+        <w:t xml:space="preserve">[15]</w:t>
+      </w:r>
+      <w:r>
+        <w:t xml:space="preserve">.</w:t>
+      </w:r>
+    </w:p>
+    <w:p>
+      <w:pPr>
+        <w:pStyle w:val="BodyText"/>
+      </w:pPr>
+      <w:r>
+        <w:t xml:space="preserve">Srednji slučaj, u kome se objekti razlikuju ali se ne razdvajaju u zasebne baze, zahteva jednu</w:t>
+      </w:r>
+      <w:r>
+        <w:t xml:space="preserve"> </w:t>
+      </w:r>
+      <w:r>
+        <w:t xml:space="preserve">terminološku ispravku. Tekstovi nastali oko sistema u kojima je šema imenovani prostor unutar baze,</w:t>
+      </w:r>
+      <w:r>
+        <w:t xml:space="preserve"> </w:t>
+      </w:r>
+      <w:r>
+        <w:t xml:space="preserve">kao što su PostgreSQL i Oracle, ovaj obrazac zovu</w:t>
+      </w:r>
+      <w:r>
+        <w:t xml:space="preserve"> </w:t>
+      </w:r>
+      <w:r>
+        <w:rPr>
+          <w:i/>
+          <w:iCs/>
+        </w:rPr>
+        <w:t xml:space="preserve">schema-per-tenant</w:t>
+      </w:r>
+      <w:r>
+        <w:t xml:space="preserve">, ali u MySQL-u takvog nivoa</w:t>
+      </w:r>
+      <w:r>
+        <w:t xml:space="preserve"> </w:t>
+      </w:r>
+      <w:r>
+        <w:t xml:space="preserve">nema: naredba</w:t>
+      </w:r>
+      <w:r>
+        <w:t xml:space="preserve"> </w:t>
+      </w:r>
+      <w:r>
+        <w:rPr>
+          <w:rStyle w:val="VerbatimChar"/>
+        </w:rPr>
+        <w:t xml:space="preserve">CREATE SCHEMA</w:t>
+      </w:r>
+      <w:r>
+        <w:t xml:space="preserve"> </w:t>
+      </w:r>
+      <w:r>
+        <w:t xml:space="preserve">je sinonim za</w:t>
+      </w:r>
+      <w:r>
+        <w:t xml:space="preserve"> </w:t>
+      </w:r>
+      <w:r>
+        <w:rPr>
+          <w:rStyle w:val="VerbatimChar"/>
+        </w:rPr>
+        <w:t xml:space="preserve">CREATE DATABASE</w:t>
+      </w:r>
+      <w:r>
+        <w:t xml:space="preserve"> </w:t>
+      </w:r>
+      <w:r>
+        <w:t xml:space="preserve">[2]</w:t>
+      </w:r>
+      <w:r>
+        <w:t xml:space="preserve">, pa je šema po tenantu</w:t>
+      </w:r>
+      <w:r>
+        <w:t xml:space="preserve"> </w:t>
+      </w:r>
+      <w:r>
+        <w:t xml:space="preserve">u MySQL-u doslovno isto što i baza po tenantu. Ono što na MySQL-u stvarno postoji kao srednji slučaj</w:t>
+      </w:r>
+      <w:r>
+        <w:t xml:space="preserve"> </w:t>
+      </w:r>
+      <w:r>
+        <w:t xml:space="preserve">jeste zaseban skup tabela po tenantu unutar jedne baze, ali on ne uvodi nijedan novi nivo dodele</w:t>
+      </w:r>
+      <w:r>
+        <w:t xml:space="preserve"> </w:t>
+      </w:r>
+      <w:r>
+        <w:t xml:space="preserve">prava: ne postoji ime koje obuhvata sve objekte jednog tenanta, pa se umesto jednog granta nad bazom</w:t>
+      </w:r>
+      <w:r>
+        <w:t xml:space="preserve"> </w:t>
+      </w:r>
+      <w:r>
+        <w:t xml:space="preserve">dodeljuje grant po tabeli i po tenantu, uz isti stepen izolacije. Na MySQL-u je taj obrazac, dakle,</w:t>
+      </w:r>
+      <w:r>
+        <w:t xml:space="preserve"> </w:t>
+      </w:r>
+      <w:r>
+        <w:t xml:space="preserve">samo skuplja varijanta silo obrasca, a ne kompromis između dva krajnja slučaja; i sami dobavljači ga</w:t>
+      </w:r>
+      <w:r>
+        <w:t xml:space="preserve"> </w:t>
+      </w:r>
+      <w:r>
+        <w:t xml:space="preserve">ne imenuju po šemi, nego kao</w:t>
+      </w:r>
+      <w:r>
+        <w:t xml:space="preserve"> </w:t>
+      </w:r>
+      <w:r>
+        <w:rPr>
+          <w:i/>
+          <w:iCs/>
+        </w:rPr>
+        <w:t xml:space="preserve">bridge</w:t>
+      </w:r>
+      <w:r>
+        <w:t xml:space="preserve">, mešovitu postavku u kojoj je jedan deo sistema izveden kao</w:t>
+      </w:r>
+      <w:r>
+        <w:t xml:space="preserve"> </w:t>
+      </w:r>
+      <w:r>
+        <w:t xml:space="preserve">silo a drugi kao deljeni resurs</w:t>
+      </w:r>
+      <w:r>
+        <w:t xml:space="preserve"> </w:t>
+      </w:r>
+      <w:r>
+        <w:t xml:space="preserve">[14]</w:t>
+      </w:r>
+      <w:r>
+        <w:t xml:space="preserve">, odnosno kao</w:t>
+      </w:r>
+      <w:r>
+        <w:t xml:space="preserve"> </w:t>
+      </w:r>
+      <w:r>
+        <w:rPr>
+          <w:i/>
+          <w:iCs/>
+        </w:rPr>
+        <w:t xml:space="preserve">sharded multitenant</w:t>
+      </w:r>
+      <w:r>
+        <w:t xml:space="preserve"> </w:t>
+      </w:r>
+      <w:r>
+        <w:t xml:space="preserve">model kome se</w:t>
+      </w:r>
+      <w:r>
+        <w:t xml:space="preserve"> </w:t>
+      </w:r>
+      <w:r>
+        <w:t xml:space="preserve">izričito pripisuje niska izolacija</w:t>
+      </w:r>
+      <w:r>
+        <w:t xml:space="preserve"> </w:t>
+      </w:r>
+      <w:r>
+        <w:t xml:space="preserve">[15]</w:t>
+      </w:r>
+      <w:r>
+        <w:t xml:space="preserve">.</w:t>
+      </w:r>
+    </w:p>
+    <w:p>
+      <w:pPr>
+        <w:pStyle w:val="BodyText"/>
+      </w:pPr>
+      <w:r>
+        <w:t xml:space="preserve">Kada se ne razlikuje nijedna koordinata, svi tenanti dele istu tabelu, a pripadnost reda se čita iz</w:t>
+      </w:r>
+      <w:r>
+        <w:t xml:space="preserve"> </w:t>
+      </w:r>
+      <w:r>
+        <w:t xml:space="preserve">kolone kakva je</w:t>
+      </w:r>
+      <w:r>
+        <w:t xml:space="preserve"> </w:t>
+      </w:r>
+      <w:r>
+        <w:rPr>
+          <w:rStyle w:val="VerbatimChar"/>
+        </w:rPr>
+        <w:t xml:space="preserve">tenant_id</w:t>
+      </w:r>
+      <w:r>
+        <w:t xml:space="preserve"> </w:t>
+      </w:r>
+      <w:r>
+        <w:t xml:space="preserve">u tabeli</w:t>
+      </w:r>
+      <w:r>
+        <w:t xml:space="preserve"> </w:t>
+      </w:r>
+      <w:r>
+        <w:rPr>
+          <w:rStyle w:val="VerbatimChar"/>
+        </w:rPr>
+        <w:t xml:space="preserve">diagnoses</w:t>
+      </w:r>
+      <w:r>
+        <w:t xml:space="preserve">. To je</w:t>
+      </w:r>
+      <w:r>
+        <w:t xml:space="preserve"> </w:t>
+      </w:r>
+      <w:r>
+        <w:rPr>
+          <w:i/>
+          <w:iCs/>
+        </w:rPr>
+        <w:t xml:space="preserve">pool</w:t>
+      </w:r>
+      <w:r>
+        <w:t xml:space="preserve"> </w:t>
+      </w:r>
+      <w:r>
+        <w:t xml:space="preserve">obrazac</w:t>
+      </w:r>
+      <w:r>
+        <w:t xml:space="preserve"> </w:t>
+      </w:r>
+      <w:r>
+        <w:t xml:space="preserve">[14]</w:t>
+      </w:r>
+      <w:r>
+        <w:t xml:space="preserve">, i u njemu</w:t>
+      </w:r>
+      <w:r>
+        <w:t xml:space="preserve"> </w:t>
+      </w:r>
+      <w:r>
+        <w:t xml:space="preserve">granica pada na red. Četvrto poglavlje je već pokazalo zašto je to kraj puta za sistem privilegija:</w:t>
+      </w:r>
+      <w:r>
+        <w:t xml:space="preserve"> </w:t>
+      </w:r>
+      <w:r>
+        <w:t xml:space="preserve">kolona je plafon granularnosti, red nema ime, pa nema šta da stoji u tabeli dodele prava</w:t>
+      </w:r>
+      <w:r>
+        <w:t xml:space="preserve"> </w:t>
+      </w:r>
+      <w:r>
+        <w:t xml:space="preserve">[2]</w:t>
+      </w:r>
+      <w:r>
+        <w:t xml:space="preserve">. Merenje na opisanom okruženju to i potvrđuje: nalog</w:t>
+      </w:r>
+      <w:r>
+        <w:t xml:space="preserve"> </w:t>
+      </w:r>
+      <w:r>
+        <w:rPr>
+          <w:rStyle w:val="VerbatimChar"/>
+        </w:rPr>
+        <w:t xml:space="preserve">doc_bar</w:t>
+      </w:r>
+      <w:r>
+        <w:t xml:space="preserve">, vezan za podružnicu</w:t>
+      </w:r>
+      <w:r>
+        <w:t xml:space="preserve"> </w:t>
+      </w:r>
+      <w:r>
+        <w:t xml:space="preserve">Bar, kroz osnovnu tabelu</w:t>
+      </w:r>
+      <w:r>
+        <w:t xml:space="preserve"> </w:t>
+      </w:r>
+      <w:r>
+        <w:rPr>
+          <w:rStyle w:val="VerbatimChar"/>
+        </w:rPr>
+        <w:t xml:space="preserve">diagnoses</w:t>
+      </w:r>
+      <w:r>
+        <w:t xml:space="preserve"> </w:t>
+      </w:r>
+      <w:r>
+        <w:t xml:space="preserve">uredno čita redove sve tri podružnice, dok kroz pogled</w:t>
+      </w:r>
+      <w:r>
+        <w:t xml:space="preserve"> </w:t>
+      </w:r>
+      <w:r>
+        <w:rPr>
+          <w:rStyle w:val="VerbatimChar"/>
+        </w:rPr>
+        <w:t xml:space="preserve">v_my_branch_diagnoses</w:t>
+      </w:r>
+      <w:r>
+        <w:t xml:space="preserve"> </w:t>
+      </w:r>
+      <w:r>
+        <w:t xml:space="preserve">vidi samo redove sopstvene, pri čemu njegov</w:t>
+      </w:r>
+      <w:r>
+        <w:t xml:space="preserve"> </w:t>
+      </w:r>
+      <w:r>
+        <w:rPr>
+          <w:rStyle w:val="VerbatimChar"/>
+        </w:rPr>
+        <w:t xml:space="preserve">SHOW GRANTS</w:t>
+      </w:r>
+      <w:r>
+        <w:t xml:space="preserve"> </w:t>
+      </w:r>
+      <w:r>
+        <w:t xml:space="preserve">ne sadrži nijednu</w:t>
+      </w:r>
+      <w:r>
+        <w:t xml:space="preserve"> </w:t>
+      </w:r>
+      <w:r>
+        <w:t xml:space="preserve">odredbu koja podružnicu uopšte pominje, jer je jedino što grant imenuje tabela kao celina.</w:t>
+      </w:r>
+      <w:r>
+        <w:t xml:space="preserve"> </w:t>
+      </w:r>
+      <w:r>
+        <w:t xml:space="preserve">Formulacija koja tačno opisuje ishod nije da je baza u ovom obrascu slabija, nego da je isključena iz</w:t>
+      </w:r>
+      <w:r>
+        <w:t xml:space="preserve"> </w:t>
+      </w:r>
+      <w:r>
+        <w:t xml:space="preserve">odluke: DAC provera se izvršava u punom obimu, samo nad koordinatama među kojima tenanta nema.</w:t>
+      </w:r>
+    </w:p>
+    <w:p>
+      <w:pPr>
+        <w:pStyle w:val="BodyText"/>
+      </w:pPr>
+      <w:r>
+        <w:t xml:space="preserve">Na taj izbor se nadovezuje ograničenje koje ne postavlja projektant baze nego arhitektura aplikacije.</w:t>
+      </w:r>
+      <w:r>
+        <w:t xml:space="preserve"> </w:t>
+      </w:r>
+      <w:r>
+        <w:t xml:space="preserve">Otvaranje konekcije je skupa operacija, pa aplikacije održavaju zajednički skup konekcija</w:t>
+      </w:r>
+      <w:r>
+        <w:t xml:space="preserve"> </w:t>
+      </w:r>
+      <w:r>
+        <w:t xml:space="preserve">(connection pooling), a da bi jedna konekcija mogla da se dodeli bilo kom zahtevu, mora biti otvorena</w:t>
+      </w:r>
+      <w:r>
+        <w:t xml:space="preserve"> </w:t>
+      </w:r>
+      <w:r>
+        <w:t xml:space="preserve">kao jedan te isti nalog za sve korisnike. Posledica je neposredna: jedan nalog znači jedan red u</w:t>
+      </w:r>
+      <w:r>
+        <w:t xml:space="preserve"> </w:t>
+      </w:r>
+      <w:r>
+        <w:t xml:space="preserve">tabeli</w:t>
+      </w:r>
+      <w:r>
+        <w:t xml:space="preserve"> </w:t>
+      </w:r>
+      <w:r>
+        <w:rPr>
+          <w:rStyle w:val="VerbatimChar"/>
+        </w:rPr>
+        <w:t xml:space="preserve">mysql.user</w:t>
+      </w:r>
+      <w:r>
+        <w:t xml:space="preserve">, a to znači jednu jedinu vrednost funkcije</w:t>
+      </w:r>
+      <w:r>
+        <w:t xml:space="preserve"> </w:t>
+      </w:r>
+      <w:r>
+        <w:rPr>
+          <w:rStyle w:val="VerbatimChar"/>
+        </w:rPr>
+        <w:t xml:space="preserve">CURRENT_USER()</w:t>
+      </w:r>
+      <w:r>
+        <w:t xml:space="preserve"> </w:t>
+      </w:r>
+      <w:r>
+        <w:t xml:space="preserve">u svim sesijama, bez</w:t>
+      </w:r>
+      <w:r>
+        <w:t xml:space="preserve"> </w:t>
+      </w:r>
+      <w:r>
+        <w:t xml:space="preserve">obzira na broj krajnjih korisnika iza njih. Broj identiteta koje baza ume da razlikuje jednak je</w:t>
+      </w:r>
+      <w:r>
+        <w:t xml:space="preserve"> </w:t>
+      </w:r>
+      <w:r>
+        <w:t xml:space="preserve">broju redova u</w:t>
+      </w:r>
+      <w:r>
+        <w:t xml:space="preserve"> </w:t>
+      </w:r>
+      <w:r>
+        <w:rPr>
+          <w:rStyle w:val="VerbatimChar"/>
+        </w:rPr>
+        <w:t xml:space="preserve">mysql.user</w:t>
+      </w:r>
+      <w:r>
+        <w:t xml:space="preserve">, a ne broju ljudi koji kroz aplikaciju rade. Druga identitetska funkcija</w:t>
+      </w:r>
+      <w:r>
+        <w:t xml:space="preserve"> </w:t>
+      </w:r>
+      <w:r>
+        <w:t xml:space="preserve">tu ne pomaže, jer meri drugu stvar:</w:t>
+      </w:r>
+      <w:r>
+        <w:t xml:space="preserve"> </w:t>
+      </w:r>
+      <w:r>
+        <w:rPr>
+          <w:rStyle w:val="VerbatimChar"/>
+        </w:rPr>
+        <w:t xml:space="preserve">USER()</w:t>
+      </w:r>
+      <w:r>
+        <w:t xml:space="preserve"> </w:t>
+      </w:r>
+      <w:r>
+        <w:t xml:space="preserve">beleži ono što je klijent naveo pri povezivanju i</w:t>
+      </w:r>
+      <w:r>
+        <w:t xml:space="preserve"> </w:t>
+      </w:r>
+      <w:r>
+        <w:t xml:space="preserve">stvarni host sa koga je došao, dok</w:t>
+      </w:r>
+      <w:r>
+        <w:t xml:space="preserve"> </w:t>
+      </w:r>
+      <w:r>
+        <w:rPr>
+          <w:rStyle w:val="VerbatimChar"/>
+        </w:rPr>
+        <w:t xml:space="preserve">CURRENT_USER()</w:t>
+      </w:r>
+      <w:r>
+        <w:t xml:space="preserve"> </w:t>
+      </w:r>
+      <w:r>
+        <w:t xml:space="preserve">imenuje red koji je server izabrao i koji jedini</w:t>
+      </w:r>
+      <w:r>
+        <w:t xml:space="preserve"> </w:t>
+      </w:r>
+      <w:r>
+        <w:t xml:space="preserve">određuje prava pristupa; priručnik tu razliku ilustruje slučajem u kome se te dve vrednosti razlikuju</w:t>
+      </w:r>
+      <w:r>
+        <w:t xml:space="preserve"> </w:t>
+      </w:r>
+      <w:r>
+        <w:t xml:space="preserve">čak i u korisničkom imenu, jer je zahtev klijenta</w:t>
+      </w:r>
+      <w:r>
+        <w:t xml:space="preserve"> </w:t>
+      </w:r>
+      <w:r>
+        <w:rPr>
+          <w:rStyle w:val="VerbatimChar"/>
+        </w:rPr>
+        <w:t xml:space="preserve">davida</w:t>
+      </w:r>
+      <w:r>
+        <w:t xml:space="preserve"> </w:t>
+      </w:r>
+      <w:r>
+        <w:t xml:space="preserve">pripao anonimnom nalogu</w:t>
+      </w:r>
+      <w:r>
+        <w:t xml:space="preserve"> </w:t>
+      </w:r>
+      <w:r>
+        <w:t xml:space="preserve">[2]</w:t>
+      </w:r>
+      <w:r>
+        <w:t xml:space="preserve">.</w:t>
+      </w:r>
+      <w:r>
+        <w:t xml:space="preserve"> </w:t>
+      </w:r>
+      <w:r>
+        <w:t xml:space="preserve">Ni u jednoj od te dve vrednosti nema podatka o podružnici.</w:t>
+      </w:r>
+    </w:p>
+    <w:p>
+      <w:pPr>
+        <w:pStyle w:val="BodyText"/>
+      </w:pPr>
+      <w:r>
+        <w:t xml:space="preserve">Uobičajena zakrpa za taj gubitak jeste da aplikacija, čim preuzme konekciju iz skupa, prijavi tenanta</w:t>
+      </w:r>
+      <w:r>
+        <w:t xml:space="preserve"> </w:t>
+      </w:r>
+      <w:r>
+        <w:t xml:space="preserve">naredbom oblika</w:t>
+      </w:r>
+      <w:r>
+        <w:t xml:space="preserve"> </w:t>
+      </w:r>
+      <w:r>
+        <w:rPr>
+          <w:rStyle w:val="VerbatimChar"/>
+        </w:rPr>
+        <w:t xml:space="preserve">SET @tenant_id = 3</w:t>
+      </w:r>
+      <w:r>
+        <w:t xml:space="preserve">, a da pogledi filtriraju po toj promenljivoj. Reč je o drugom</w:t>
+      </w:r>
+      <w:r>
+        <w:t xml:space="preserve"> </w:t>
+      </w:r>
+      <w:r>
+        <w:t xml:space="preserve">obrascu emulacije iz četvrtog poglavlja, i merenje pokazuje zašto on u pogledu izolacije ne menja</w:t>
+      </w:r>
+      <w:r>
+        <w:t xml:space="preserve"> </w:t>
+      </w:r>
+      <w:r>
+        <w:t xml:space="preserve">ništa: isti nalog, u istoj sesiji, jednom dodelom vrednosti prelazi sa sopstvene podružnice na tuđu i</w:t>
+      </w:r>
+      <w:r>
+        <w:t xml:space="preserve"> </w:t>
+      </w:r>
+      <w:r>
+        <w:t xml:space="preserve">uredno dobija njene redove, bez ijedne nove privilegije i bez ijedne greške. Korisnička promenljiva</w:t>
+      </w:r>
+      <w:r>
+        <w:t xml:space="preserve"> </w:t>
+      </w:r>
+      <w:r>
+        <w:t xml:space="preserve">je vrednost koju postavlja upravo onaj nalog koji bi njome trebalo da bude ograničen, a mera koju</w:t>
+      </w:r>
+      <w:r>
+        <w:t xml:space="preserve"> </w:t>
+      </w:r>
+      <w:r>
+        <w:t xml:space="preserve">ograničavani sam sebi dodeljuje nije kontrola pristupa</w:t>
+      </w:r>
+      <w:r>
+        <w:t xml:space="preserve"> </w:t>
+      </w:r>
+      <w:r>
+        <w:t xml:space="preserve">[2]</w:t>
+      </w:r>
+      <w:r>
+        <w:t xml:space="preserve">.</w:t>
+      </w:r>
+    </w:p>
+    <w:p>
+      <w:pPr>
+        <w:pStyle w:val="BodyText"/>
+      </w:pPr>
+      <w:r>
+        <w:t xml:space="preserve">Time postaje vidljivo da zajednički nalog proizvodi dva otkaza koja imaju isti uzrok. Izolacija</w:t>
+      </w:r>
+      <w:r>
+        <w:t xml:space="preserve"> </w:t>
+      </w:r>
+      <w:r>
+        <w:t xml:space="preserve">otkazuje unapred, jer server nema po čemu da razlikuje zahteve, a pripisivost otkazuje unazad, jer u</w:t>
+      </w:r>
+      <w:r>
+        <w:t xml:space="preserve"> </w:t>
+      </w:r>
+      <w:r>
+        <w:t xml:space="preserve">zapis odlazi isključivo ime zajedničkog naloga. Šesto poglavlje je pokazalo da su trajnost i</w:t>
+      </w:r>
+      <w:r>
+        <w:t xml:space="preserve"> </w:t>
+      </w:r>
+      <w:r>
+        <w:t xml:space="preserve">otpornost zapisa na izmenu svojstva koja se mogu obezbediti nizvodno, slanjem zapisa na zaseban i</w:t>
+      </w:r>
+      <w:r>
+        <w:t xml:space="preserve"> </w:t>
+      </w:r>
+      <w:r>
+        <w:t xml:space="preserve">zaključan sistem</w:t>
+      </w:r>
+      <w:r>
+        <w:t xml:space="preserve"> </w:t>
+      </w:r>
+      <w:r>
+        <w:t xml:space="preserve">[11]</w:t>
+      </w:r>
+      <w:r>
+        <w:t xml:space="preserve">, ali pripisivost se tako ne popravlja: identitet tenanta nikada nije</w:t>
+      </w:r>
+      <w:r>
+        <w:t xml:space="preserve"> </w:t>
+      </w:r>
+      <w:r>
+        <w:t xml:space="preserve">ni ušao u server, a informacija koja nije stigla ne može se naknadno rekonstruisati. Jedan isti</w:t>
+      </w:r>
+      <w:r>
+        <w:t xml:space="preserve"> </w:t>
+      </w:r>
+      <w:r>
+        <w:t xml:space="preserve">propust, dakle, ima dva lica, i nijedno od njih se ne leči merama koje se primenjuju pošto je odluka</w:t>
+      </w:r>
+      <w:r>
+        <w:t xml:space="preserve"> </w:t>
+      </w:r>
+      <w:r>
+        <w:t xml:space="preserve">o obrascu već doneta.</w:t>
+      </w:r>
+    </w:p>
+    <w:p>
+      <w:pPr>
+        <w:pStyle w:val="BodyText"/>
+      </w:pPr>
+      <w:r>
+        <w:t xml:space="preserve">Na tom mestu se sklapa i nit koja kroz rad traje od drugog poglavlja. Princip najmanjih privilegija</w:t>
+      </w:r>
+      <w:r>
+        <w:t xml:space="preserve"> </w:t>
+      </w:r>
+      <w:r>
+        <w:t xml:space="preserve">je u Saltzer-Schroederovoj formulaciji načelo o najmanjem skupu prava potrebnom za obavljanje posla</w:t>
+      </w:r>
+      <w:r>
+        <w:t xml:space="preserve"> </w:t>
+      </w:r>
+      <w:r>
+        <w:t xml:space="preserve">[7]</w:t>
+      </w:r>
+      <w:r>
+        <w:t xml:space="preserve">; u izboru multi-tenant obrasca on postaje merljiva veličina, i to ona koja</w:t>
+      </w:r>
+      <w:r>
+        <w:t xml:space="preserve"> </w:t>
+      </w:r>
+      <w:r>
+        <w:t xml:space="preserve">glasi koliko tenanta jedan nalog</w:t>
+      </w:r>
+      <w:r>
+        <w:t xml:space="preserve"> </w:t>
+      </w:r>
+      <w:r>
+        <w:rPr>
+          <w:i/>
+          <w:iCs/>
+        </w:rPr>
+        <w:t xml:space="preserve">sme</w:t>
+      </w:r>
+      <w:r>
+        <w:t xml:space="preserve"> </w:t>
+      </w:r>
+      <w:r>
+        <w:t xml:space="preserve">da dohvati, a ne koliko ih stvarno dohvata upitima koje</w:t>
+      </w:r>
+      <w:r>
+        <w:t xml:space="preserve"> </w:t>
+      </w:r>
+      <w:r>
+        <w:t xml:space="preserve">aplikacija trenutno šalje. Merenje iz ovog poglavlja daje obe vrednosti za isti nalog: kroz pogled</w:t>
+      </w:r>
+      <w:r>
+        <w:t xml:space="preserve"> </w:t>
+      </w:r>
+      <w:r>
+        <w:t xml:space="preserve">jednu podružnicu, kroz osnovnu tabelu sve tri, pri čemu je samo druga vrednost mera u smislu ovog</w:t>
+      </w:r>
+      <w:r>
+        <w:t xml:space="preserve"> </w:t>
+      </w:r>
+      <w:r>
+        <w:t xml:space="preserve">principa. Treće poglavlje je uz to utvrdilo da se nivoi dodele prava sastavljaju logičkim</w:t>
+      </w:r>
+      <w:r>
+        <w:t xml:space="preserve"> </w:t>
+      </w:r>
+      <w:r>
+        <w:rPr>
+          <w:rStyle w:val="VerbatimChar"/>
+        </w:rPr>
+        <w:t xml:space="preserve">OR</w:t>
+      </w:r>
+      <w:r>
+        <w:t xml:space="preserve"> </w:t>
+      </w:r>
+      <w:r>
+        <w:t xml:space="preserve">operatorom, pa uža dodela nikada ne sužava širu</w:t>
+      </w:r>
+      <w:r>
+        <w:t xml:space="preserve"> </w:t>
+      </w:r>
+      <w:r>
+        <w:t xml:space="preserve">[2]</w:t>
+      </w:r>
+      <w:r>
+        <w:t xml:space="preserve">: ne postoji naredba</w:t>
+      </w:r>
+      <w:r>
+        <w:t xml:space="preserve"> </w:t>
+      </w:r>
+      <w:r>
+        <w:rPr>
+          <w:rStyle w:val="VerbatimChar"/>
+        </w:rPr>
+        <w:t xml:space="preserve">GRANT</w:t>
+      </w:r>
+      <w:r>
+        <w:t xml:space="preserve"> </w:t>
+      </w:r>
+      <w:r>
+        <w:t xml:space="preserve">kojom se</w:t>
+      </w:r>
+      <w:r>
+        <w:t xml:space="preserve"> </w:t>
+      </w:r>
+      <w:r>
+        <w:t xml:space="preserve">domašaj zajedničkog naloga naknadno smanjuje. Iz oba nalaza sledi zaključna tvrdnja poglavlja: izbor</w:t>
+      </w:r>
+      <w:r>
+        <w:t xml:space="preserve"> </w:t>
+      </w:r>
+      <w:r>
+        <w:t xml:space="preserve">obrasca jeste odluka o najmanjim privilegijama, donosi se jednom, pri projektovanju, i kasnijim</w:t>
+      </w:r>
+      <w:r>
+        <w:t xml:space="preserve"> </w:t>
+      </w:r>
+      <w:r>
+        <w:t xml:space="preserve">dodelama prava se ne ispravlja.</w:t>
+      </w:r>
+    </w:p>
+    <w:p>
+      <w:pPr>
+        <w:pStyle w:val="BodyText"/>
+      </w:pPr>
+      <w:r>
+        <w:t xml:space="preserve">Za tezu ovog rada multi-tenant postavka je zato poslednja i najoštrija provera. Silo obrazac je u</w:t>
+      </w:r>
+      <w:r>
+        <w:t xml:space="preserve"> </w:t>
+      </w:r>
+      <w:r>
+        <w:t xml:space="preserve">celini sastavljen iz diskrecionih elemenata drugog poglavlja, imenovanog objekta i imenovanog</w:t>
+      </w:r>
+      <w:r>
+        <w:t xml:space="preserve"> </w:t>
+      </w:r>
+      <w:r>
+        <w:t xml:space="preserve">subjekta, i MySQL ga sprovodi bez ijednog dodatnog mehanizma. Pool obrazac traži granicu koju</w:t>
+      </w:r>
+      <w:r>
+        <w:t xml:space="preserve"> </w:t>
+      </w:r>
+      <w:r>
+        <w:t xml:space="preserve">diskreciona, na objektima zasnovana kontrola pristupa ne ume da zapiše, pa MySQL u njemu izolaciju</w:t>
+      </w:r>
+      <w:r>
+        <w:t xml:space="preserve"> </w:t>
+      </w:r>
+      <w:r>
+        <w:t xml:space="preserve">tenanta ne sprovodi uopšte, nego je prepušta aplikaciji, zajedno sa pripisivošću koja iz istog</w:t>
+      </w:r>
+      <w:r>
+        <w:t xml:space="preserve"> </w:t>
+      </w:r>
+      <w:r>
+        <w:t xml:space="preserve">razloga otpada. Okruženje na kome je ovaj rad građen namerno stoji na prvoj strani te odluke:</w:t>
+      </w:r>
+      <w:r>
+        <w:t xml:space="preserve"> </w:t>
+      </w:r>
+      <w:r>
+        <w:t xml:space="preserve">dvanaest naloga oblika</w:t>
+      </w:r>
+      <w:r>
+        <w:t xml:space="preserve"> </w:t>
+      </w:r>
+      <w:r>
+        <w:rPr>
+          <w:rStyle w:val="VerbatimChar"/>
+        </w:rPr>
+        <w:t xml:space="preserve">&lt;uloga&gt;_&lt;podružnica&gt;</w:t>
+      </w:r>
+      <w:r>
+        <w:t xml:space="preserve">, svaki sa sopstvenim redom u</w:t>
+      </w:r>
+      <w:r>
+        <w:t xml:space="preserve"> </w:t>
+      </w:r>
+      <w:r>
+        <w:rPr>
+          <w:rStyle w:val="VerbatimChar"/>
+        </w:rPr>
+        <w:t xml:space="preserve">mysql.user</w:t>
+      </w:r>
+      <w:r>
+        <w:t xml:space="preserve">, čini da</w:t>
+      </w:r>
+      <w:r>
+        <w:t xml:space="preserve"> </w:t>
+      </w:r>
+      <w:r>
+        <w:rPr>
+          <w:rStyle w:val="VerbatimChar"/>
+        </w:rPr>
+        <w:t xml:space="preserve">CURRENT_USER()</w:t>
+      </w:r>
+      <w:r>
+        <w:t xml:space="preserve"> </w:t>
+      </w:r>
+      <w:r>
+        <w:t xml:space="preserve">nosi podružnicu, i to je jedini razlog zbog koga pogled</w:t>
+      </w:r>
+      <w:r>
+        <w:t xml:space="preserve"> </w:t>
+      </w:r>
+      <w:r>
+        <w:rPr>
+          <w:rStyle w:val="VerbatimChar"/>
+        </w:rPr>
+        <w:t xml:space="preserve">v_my_branch_diagnoses</w:t>
+      </w:r>
+      <w:r>
+        <w:t xml:space="preserve"> </w:t>
+      </w:r>
+      <w:r>
+        <w:t xml:space="preserve">uopšte može da radi.</w:t>
+      </w:r>
+    </w:p>
+    <w:bookmarkStart w:id="67" w:name="refs"/>
+    <w:bookmarkStart w:id="41" w:name="ref-ramakrishnan2003"/>
+    <w:p>
+      <w:pPr>
+        <w:pStyle w:val="Bibliography"/>
+      </w:pPr>
+      <w:r>
+        <w:t xml:space="preserve">[1]</w:t>
+      </w:r>
+      <w:r>
+        <w:t xml:space="preserve"> </w:t>
+      </w:r>
+      <w:r>
+        <w:t xml:space="preserve">	</w:t>
+      </w:r>
+      <w:r>
+        <w:t xml:space="preserve">R. Ramakrishnan and J. Gehrke,</w:t>
+      </w:r>
+      <w:r>
+        <w:t xml:space="preserve"> </w:t>
+      </w:r>
+      <w:r>
+        <w:rPr>
+          <w:i/>
+          <w:iCs/>
+        </w:rPr>
         <w:t xml:space="preserve">Database management systems</w:t>
       </w:r>
       <w:r>
         <w:t xml:space="preserve">, 3rd ed. New York, NY, USA: McGraw-Hill, 2003.</w:t>
       </w:r>
     </w:p>
-    <w:bookmarkEnd w:id="37"/>
-    <w:bookmarkStart w:id="39" w:name="ref-mysql84refman"/>
+    <w:bookmarkEnd w:id="41"/>
+    <w:bookmarkStart w:id="43" w:name="ref-mysql84refman"/>
     <w:p>
       <w:pPr>
         <w:pStyle w:val="Bibliography"/>
@@ -7970,7 +9207,7 @@
       <w:r>
         <w:t xml:space="preserve"> </w:t>
       </w:r>
-      <w:hyperlink r:id="rId38">
+      <w:hyperlink r:id="rId42">
         <w:r>
           <w:rPr>
             <w:rStyle w:val="Hyperlink"/>
@@ -7982,8 +9219,8 @@
         <w:t xml:space="preserve">, 2024.</w:t>
       </w:r>
     </w:p>
-    <w:bookmarkEnd w:id="39"/>
-    <w:bookmarkStart w:id="41" w:name="ref-sandhu1996"/>
+    <w:bookmarkEnd w:id="43"/>
+    <w:bookmarkStart w:id="45" w:name="ref-sandhu1996"/>
     <w:p>
       <w:pPr>
         <w:pStyle w:val="Bibliography"/>
@@ -8022,7 +9259,7 @@
       <w:r>
         <w:t xml:space="preserve"> </w:t>
       </w:r>
-      <w:hyperlink r:id="rId40">
+      <w:hyperlink r:id="rId44">
         <w:r>
           <w:rPr>
             <w:rStyle w:val="Hyperlink"/>
@@ -8034,8 +9271,8 @@
         <w:t xml:space="preserve">.</w:t>
       </w:r>
     </w:p>
-    <w:bookmarkEnd w:id="41"/>
-    <w:bookmarkStart w:id="42" w:name="ref-bell1973"/>
+    <w:bookmarkEnd w:id="45"/>
+    <w:bookmarkStart w:id="46" w:name="ref-bell1973"/>
     <w:p>
       <w:pPr>
         <w:pStyle w:val="Bibliography"/>
@@ -8065,8 +9302,8 @@
         <w:t xml:space="preserve">The MITRE Corporation, Bedford, MA, USA, MTR-2547, Vol. I, 1973.</w:t>
       </w:r>
     </w:p>
-    <w:bookmarkEnd w:id="42"/>
-    <w:bookmarkStart w:id="43" w:name="ref-ferraiolokuhn1992"/>
+    <w:bookmarkEnd w:id="46"/>
+    <w:bookmarkStart w:id="47" w:name="ref-ferraiolokuhn1992"/>
     <w:p>
       <w:pPr>
         <w:pStyle w:val="Bibliography"/>
@@ -8109,8 +9346,8 @@
         <w:t xml:space="preserve">, Baltimore, MD, USA, 1992, pp. 554–563.</w:t>
       </w:r>
     </w:p>
-    <w:bookmarkEnd w:id="43"/>
-    <w:bookmarkStart w:id="44" w:name="ref-incits2004"/>
+    <w:bookmarkEnd w:id="47"/>
+    <w:bookmarkStart w:id="48" w:name="ref-incits2004"/>
     <w:p>
       <w:pPr>
         <w:pStyle w:val="Bibliography"/>
@@ -8149,8 +9386,8 @@
         <w:t xml:space="preserve">ANSI/INCITS Standard, 2004.</w:t>
       </w:r>
     </w:p>
-    <w:bookmarkEnd w:id="44"/>
-    <w:bookmarkStart w:id="46" w:name="ref-saltzerschroeder1975"/>
+    <w:bookmarkEnd w:id="48"/>
+    <w:bookmarkStart w:id="50" w:name="ref-saltzerschroeder1975"/>
     <w:p>
       <w:pPr>
         <w:pStyle w:val="Bibliography"/>
@@ -8189,7 +9426,7 @@
       <w:r>
         <w:t xml:space="preserve"> </w:t>
       </w:r>
-      <w:hyperlink r:id="rId45">
+      <w:hyperlink r:id="rId49">
         <w:r>
           <w:rPr>
             <w:rStyle w:val="Hyperlink"/>
@@ -8201,8 +9438,8 @@
         <w:t xml:space="preserve">.</w:t>
       </w:r>
     </w:p>
-    <w:bookmarkEnd w:id="46"/>
-    <w:bookmarkStart w:id="48" w:name="ref-mysqlbug41354"/>
+    <w:bookmarkEnd w:id="50"/>
+    <w:bookmarkStart w:id="52" w:name="ref-mysqlbug41354"/>
     <w:p>
       <w:pPr>
         <w:pStyle w:val="Bibliography"/>
@@ -8249,7 +9486,7 @@
       <w:r>
         <w:t xml:space="preserve"> </w:t>
       </w:r>
-      <w:hyperlink r:id="rId47">
+      <w:hyperlink r:id="rId51">
         <w:r>
           <w:rPr>
             <w:rStyle w:val="Hyperlink"/>
@@ -8261,8 +9498,8 @@
         <w:t xml:space="preserve">, 2009.</w:t>
       </w:r>
     </w:p>
-    <w:bookmarkEnd w:id="48"/>
-    <w:bookmarkStart w:id="50" w:name="ref-postgresrls2024"/>
+    <w:bookmarkEnd w:id="52"/>
+    <w:bookmarkStart w:id="54" w:name="ref-postgresrls2024"/>
     <w:p>
       <w:pPr>
         <w:pStyle w:val="Bibliography"/>
@@ -8297,7 +9534,7 @@
       <w:r>
         <w:t xml:space="preserve"> </w:t>
       </w:r>
-      <w:hyperlink r:id="rId49">
+      <w:hyperlink r:id="rId53">
         <w:r>
           <w:rPr>
             <w:rStyle w:val="Hyperlink"/>
@@ -8309,8 +9546,8 @@
         <w:t xml:space="preserve">, 2024.</w:t>
       </w:r>
     </w:p>
-    <w:bookmarkEnd w:id="50"/>
-    <w:bookmarkStart w:id="52" w:name="ref-oraclevpd2024"/>
+    <w:bookmarkEnd w:id="54"/>
+    <w:bookmarkStart w:id="56" w:name="ref-oraclevpd2024"/>
     <w:p>
       <w:pPr>
         <w:pStyle w:val="Bibliography"/>
@@ -8363,7 +9600,7 @@
       <w:r>
         <w:t xml:space="preserve"> </w:t>
       </w:r>
-      <w:hyperlink r:id="rId51">
+      <w:hyperlink r:id="rId55">
         <w:r>
           <w:rPr>
             <w:rStyle w:val="Hyperlink"/>
@@ -8375,8 +9612,8 @@
         <w:t xml:space="preserve">, 2024.</w:t>
       </w:r>
     </w:p>
-    <w:bookmarkEnd w:id="52"/>
-    <w:bookmarkStart w:id="54" w:name="ref-nistsp80092"/>
+    <w:bookmarkEnd w:id="56"/>
+    <w:bookmarkStart w:id="58" w:name="ref-nistsp80092"/>
     <w:p>
       <w:pPr>
         <w:pStyle w:val="Bibliography"/>
@@ -8408,7 +9645,7 @@
       <w:r>
         <w:t xml:space="preserve"> </w:t>
       </w:r>
-      <w:hyperlink r:id="rId53">
+      <w:hyperlink r:id="rId57">
         <w:r>
           <w:rPr>
             <w:rStyle w:val="Hyperlink"/>
@@ -8420,8 +9657,8 @@
         <w:t xml:space="preserve">.</w:t>
       </w:r>
     </w:p>
-    <w:bookmarkEnd w:id="54"/>
-    <w:bookmarkStart w:id="56" w:name="ref-nistsp80053r5"/>
+    <w:bookmarkEnd w:id="58"/>
+    <w:bookmarkStart w:id="60" w:name="ref-nistsp80053r5"/>
     <w:p>
       <w:pPr>
         <w:pStyle w:val="Bibliography"/>
@@ -8453,7 +9690,7 @@
       <w:r>
         <w:t xml:space="preserve"> </w:t>
       </w:r>
-      <w:hyperlink r:id="rId55">
+      <w:hyperlink r:id="rId59">
         <w:r>
           <w:rPr>
             <w:rStyle w:val="Hyperlink"/>
@@ -8465,8 +9702,8 @@
         <w:t xml:space="preserve">.</w:t>
       </w:r>
     </w:p>
-    <w:bookmarkEnd w:id="56"/>
-    <w:bookmarkStart w:id="58" w:name="ref-pcidss2022"/>
+    <w:bookmarkEnd w:id="60"/>
+    <w:bookmarkStart w:id="62" w:name="ref-pcidss2022"/>
     <w:p>
       <w:pPr>
         <w:pStyle w:val="Bibliography"/>
@@ -8492,7 +9729,7 @@
       <w:r>
         <w:t xml:space="preserve"> </w:t>
       </w:r>
-      <w:hyperlink r:id="rId57">
+      <w:hyperlink r:id="rId61">
         <w:r>
           <w:rPr>
             <w:rStyle w:val="Hyperlink"/>
@@ -8504,9 +9741,117 @@
         <w:t xml:space="preserve">, 2022.</w:t>
       </w:r>
     </w:p>
-    <w:bookmarkEnd w:id="58"/>
-    <w:bookmarkEnd w:id="59"/>
-    <w:bookmarkEnd w:id="60"/>
+    <w:bookmarkEnd w:id="62"/>
+    <w:bookmarkStart w:id="64" w:name="ref-awssaaslens"/>
+    <w:p>
+      <w:pPr>
+        <w:pStyle w:val="Bibliography"/>
+      </w:pPr>
+      <w:r>
+        <w:t xml:space="preserve">[14]</w:t>
+      </w:r>
+      <w:r>
+        <w:t xml:space="preserve"> </w:t>
+      </w:r>
+      <w:r>
+        <w:t xml:space="preserve">	</w:t>
+      </w:r>
+      <w:r>
+        <w:t xml:space="preserve">Amazon Web Services,</w:t>
+      </w:r>
+      <w:r>
+        <w:t xml:space="preserve"> </w:t>
+      </w:r>
+      <w:r>
+        <w:t xml:space="preserve">“Silo, pool, and bridge models. AWS well-architected SaaS lens.”</w:t>
+      </w:r>
+      <w:r>
+        <w:t xml:space="preserve"> </w:t>
+      </w:r>
+      <w:hyperlink r:id="rId63">
+        <w:r>
+          <w:rPr>
+            <w:rStyle w:val="Hyperlink"/>
+          </w:rPr>
+          <w:t xml:space="preserve">https://docs.aws.amazon.com/wellarchitected/latest/saas-lens/silo-pool-and-bridge-models.html</w:t>
+        </w:r>
+      </w:hyperlink>
+      <w:r>
+        <w:t xml:space="preserve">, 2024.</w:t>
+      </w:r>
+    </w:p>
+    <w:bookmarkEnd w:id="64"/>
+    <w:bookmarkStart w:id="66" w:name="ref-azuretenancy"/>
+    <w:p>
+      <w:pPr>
+        <w:pStyle w:val="Bibliography"/>
+      </w:pPr>
+      <w:r>
+        <w:t xml:space="preserve">[15]</w:t>
+      </w:r>
+      <w:r>
+        <w:t xml:space="preserve"> </w:t>
+      </w:r>
+      <w:r>
+        <w:t xml:space="preserve">	</w:t>
+      </w:r>
+      <w:r>
+        <w:t xml:space="preserve">Microsoft,</w:t>
+      </w:r>
+      <w:r>
+        <w:t xml:space="preserve"> </w:t>
+      </w:r>
+      <w:r>
+        <w:t xml:space="preserve">“Multitenant</w:t>
+      </w:r>
+      <w:r>
+        <w:t xml:space="preserve"> </w:t>
+      </w:r>
+      <w:r>
+        <w:t xml:space="preserve">SaaS</w:t>
+      </w:r>
+      <w:r>
+        <w:t xml:space="preserve"> </w:t>
+      </w:r>
+      <w:r>
+        <w:t xml:space="preserve">patterns.</w:t>
+      </w:r>
+      <w:r>
+        <w:t xml:space="preserve"> </w:t>
+      </w:r>
+      <w:r>
+        <w:t xml:space="preserve">Azure</w:t>
+      </w:r>
+      <w:r>
+        <w:t xml:space="preserve"> </w:t>
+      </w:r>
+      <w:r>
+        <w:t xml:space="preserve">SQL</w:t>
+      </w:r>
+      <w:r>
+        <w:t xml:space="preserve"> </w:t>
+      </w:r>
+      <w:r>
+        <w:t xml:space="preserve">database.”</w:t>
+      </w:r>
+      <w:r>
+        <w:t xml:space="preserve"> </w:t>
+      </w:r>
+      <w:hyperlink r:id="rId65">
+        <w:r>
+          <w:rPr>
+            <w:rStyle w:val="Hyperlink"/>
+          </w:rPr>
+          <w:t xml:space="preserve">https://learn.microsoft.com/en-us/azure/azure-sql/database/saas-tenancy-app-design-patterns</w:t>
+        </w:r>
+      </w:hyperlink>
+      <w:r>
+        <w:t xml:space="preserve">, 2024.</w:t>
+      </w:r>
+    </w:p>
+    <w:bookmarkEnd w:id="66"/>
+    <w:bookmarkEnd w:id="67"/>
+    <w:bookmarkEnd w:id="68"/>
     <w:sectPr>
       <w:pgSz w:h="16838" w:w="11906"/>
       <w:pgMar w:bottom="1417" w:footer="708" w:gutter="0" w:header="708" w:left="1417" w:right="1417" w:top="1417"/>

</xml_diff>

<commit_message>
Tema 2: chapter 8 (Zakljucak) written; ticket 21 closed
Conclusion synthesizes chapters 2-7 into one finding: every MySQL absence
is a rule unwritable in the (subject, object, operation) vocabulary, and
where the model cannot express a rule MySQL writes it outside the grant
schema. Ch. 1 reconciled, no edit needed. Learning record 0009 added.
Paper prose complete; only the final export pass (ticket 13) remains.
</commit_message>
<xml_diff>
--- a/Tema 2. - Kontrola pristupa i sigurnosni modeli u MySQL bazi podataka/rad.docx
+++ b/Tema 2. - Kontrola pristupa i sigurnosni modeli u MySQL bazi podataka/rad.docx
@@ -7903,7 +7903,7 @@
       </w:r>
     </w:p>
     <w:bookmarkEnd w:id="37"/>
-    <w:bookmarkStart w:id="68" w:name="multi-tenant-bezbednosni-modeli"/>
+    <w:bookmarkStart w:id="41" w:name="multi-tenant-bezbednosni-modeli"/>
     <w:p>
       <w:pPr>
         <w:pStyle w:val="Heading1"/>
@@ -9139,8 +9139,484 @@
         <w:t xml:space="preserve">uopšte može da radi.</w:t>
       </w:r>
     </w:p>
-    <w:bookmarkStart w:id="67" w:name="refs"/>
-    <w:bookmarkStart w:id="41" w:name="ref-ramakrishnan2003"/>
+    <w:bookmarkEnd w:id="41"/>
+    <w:bookmarkStart w:id="69" w:name="zaključak"/>
+    <w:p>
+      <w:pPr>
+        <w:pStyle w:val="Heading1"/>
+      </w:pPr>
+      <w:r>
+        <w:t xml:space="preserve">8. Zaključak</w:t>
+      </w:r>
+    </w:p>
+    <w:p>
+      <w:pPr>
+        <w:pStyle w:val="FirstParagraph"/>
+      </w:pPr>
+      <w:r>
+        <w:t xml:space="preserve">Rad je pošao od teze da MySQL sprovodi isključivo diskrecionu, na objektima zasnovanu kontrolu</w:t>
+      </w:r>
+      <w:r>
+        <w:t xml:space="preserve"> </w:t>
+      </w:r>
+      <w:r>
+        <w:t xml:space="preserve">pristupa, i da je svaki savremeniji bezbednosni zahtev nad takvim sistemom ili sastavljen iz te</w:t>
+      </w:r>
+      <w:r>
+        <w:t xml:space="preserve"> </w:t>
+      </w:r>
+      <w:r>
+        <w:t xml:space="preserve">osnove ili u potpunosti odsutan iz same baze podataka, pa se mora rešavati izvan nje. Šest poglavlja</w:t>
+      </w:r>
+      <w:r>
+        <w:t xml:space="preserve"> </w:t>
+      </w:r>
+      <w:r>
+        <w:t xml:space="preserve">koja slede uvod proverila su tu tvrdnju, svako na svom delu materije i, gde god je to bilo izvodljivo,</w:t>
+      </w:r>
+      <w:r>
+        <w:t xml:space="preserve"> </w:t>
+      </w:r>
+      <w:r>
+        <w:t xml:space="preserve">merenjem nad radnim okruženjem</w:t>
+      </w:r>
+      <w:r>
+        <w:t xml:space="preserve"> </w:t>
+      </w:r>
+      <w:r>
+        <w:rPr>
+          <w:rStyle w:val="VerbatimChar"/>
+        </w:rPr>
+        <w:t xml:space="preserve">poliklinika</w:t>
+      </w:r>
+      <w:r>
+        <w:t xml:space="preserve"> </w:t>
+      </w:r>
+      <w:r>
+        <w:t xml:space="preserve">na besplatnom MySQL 8.4 Community izdanju, a ne samo</w:t>
+      </w:r>
+      <w:r>
+        <w:t xml:space="preserve"> </w:t>
+      </w:r>
+      <w:r>
+        <w:t xml:space="preserve">čitanjem priručnika</w:t>
+      </w:r>
+      <w:r>
+        <w:t xml:space="preserve"> </w:t>
+      </w:r>
+      <w:r>
+        <w:t xml:space="preserve">[2]</w:t>
+      </w:r>
+      <w:r>
+        <w:t xml:space="preserve">. Nalazi se razvrstavaju tačno prema dvema stranama te teze.</w:t>
+      </w:r>
+    </w:p>
+    <w:p>
+      <w:pPr>
+        <w:pStyle w:val="BodyText"/>
+      </w:pPr>
+      <w:r>
+        <w:t xml:space="preserve">Na strani sastavljanja stoji veći deo onoga što MySQL stvarno radi. Sistem privilegija je skup redova</w:t>
+      </w:r>
+      <w:r>
+        <w:t xml:space="preserve"> </w:t>
+      </w:r>
+      <w:r>
+        <w:t xml:space="preserve">u tabelama dodele prava, a dvostepena provera pristupa, izbor jednog reda u tabeli</w:t>
+      </w:r>
+      <w:r>
+        <w:t xml:space="preserve"> </w:t>
+      </w:r>
+      <w:r>
+        <w:rPr>
+          <w:rStyle w:val="VerbatimChar"/>
+        </w:rPr>
+        <w:t xml:space="preserve">mysql.user</w:t>
+      </w:r>
+      <w:r>
+        <w:t xml:space="preserve"> </w:t>
+      </w:r>
+      <w:r>
+        <w:t xml:space="preserve">pri</w:t>
+      </w:r>
+      <w:r>
+        <w:t xml:space="preserve"> </w:t>
+      </w:r>
+      <w:r>
+        <w:t xml:space="preserve">povezivanju i potom provera prava za svaku naredbu, ostaje jedini put kojim se odluka o pristupu</w:t>
+      </w:r>
+      <w:r>
+        <w:t xml:space="preserve"> </w:t>
+      </w:r>
+      <w:r>
+        <w:t xml:space="preserve">donosi</w:t>
+      </w:r>
+      <w:r>
+        <w:t xml:space="preserve"> </w:t>
+      </w:r>
+      <w:r>
+        <w:t xml:space="preserve">[2]</w:t>
+      </w:r>
+      <w:r>
+        <w:t xml:space="preserve">. Uloge ne uvode novi mehanizam, nego graf nad istim, diskrecionim redovima, pa</w:t>
+      </w:r>
+      <w:r>
+        <w:t xml:space="preserve"> </w:t>
+      </w:r>
+      <w:r>
+        <w:t xml:space="preserve">je RBAC0 ostvaren u potpunosti, dok je RBAC1 ostvaren delimično, jer graf u tabeli</w:t>
+      </w:r>
+      <w:r>
+        <w:t xml:space="preserve"> </w:t>
+      </w:r>
+      <w:r>
+        <w:rPr>
+          <w:rStyle w:val="VerbatimChar"/>
+        </w:rPr>
+        <w:t xml:space="preserve">mysql.role_edges</w:t>
+      </w:r>
+      <w:r>
+        <w:t xml:space="preserve"> </w:t>
+      </w:r>
+      <w:r>
+        <w:t xml:space="preserve">nije formalno parcijalno uređenje</w:t>
+      </w:r>
+      <w:r>
+        <w:t xml:space="preserve"> </w:t>
+      </w:r>
+      <w:r>
+        <w:t xml:space="preserve">[3], [6]</w:t>
+      </w:r>
+      <w:r>
+        <w:t xml:space="preserve">. Fino-granularna kontrola pristupa</w:t>
+      </w:r>
+      <w:r>
+        <w:t xml:space="preserve"> </w:t>
+      </w:r>
+      <w:r>
+        <w:t xml:space="preserve">sastavlja se iz privilegija nad kolonama i iz pogleda sa definer semantikom, a silo obrazac</w:t>
+      </w:r>
+      <w:r>
+        <w:t xml:space="preserve"> </w:t>
+      </w:r>
+      <w:r>
+        <w:t xml:space="preserve">multi-tenant izolacije, u kome svaki tenant dobija sopstvenu bazu, sprovodi samo jezgro servera, bez</w:t>
+      </w:r>
+      <w:r>
+        <w:t xml:space="preserve"> </w:t>
+      </w:r>
+      <w:r>
+        <w:t xml:space="preserve">ijednog dodatnog mehanizma</w:t>
+      </w:r>
+      <w:r>
+        <w:t xml:space="preserve"> </w:t>
+      </w:r>
+      <w:r>
+        <w:t xml:space="preserve">[2]</w:t>
+      </w:r>
+      <w:r>
+        <w:t xml:space="preserve">.</w:t>
+      </w:r>
+    </w:p>
+    <w:p>
+      <w:pPr>
+        <w:pStyle w:val="BodyText"/>
+      </w:pPr>
+      <w:r>
+        <w:t xml:space="preserve">Na strani odsustva stoji ono što je za tezu rada značajnije. Obavezne kontrole pristupa i</w:t>
+      </w:r>
+      <w:r>
+        <w:t xml:space="preserve"> </w:t>
+      </w:r>
+      <w:r>
+        <w:t xml:space="preserve">Bell-LaPadula modela u MySQL-u nema ni u tragovima, pa argument o trojanskom konju, kojim se u teoriji</w:t>
+      </w:r>
+      <w:r>
+        <w:t xml:space="preserve"> </w:t>
+      </w:r>
+      <w:r>
+        <w:t xml:space="preserve">motiviše prelazak sa DAC na MAC, nad ovim sistemom ostaje neodgovoren</w:t>
+      </w:r>
+      <w:r>
+        <w:t xml:space="preserve"> </w:t>
+      </w:r>
+      <w:r>
+        <w:t xml:space="preserve">[1]</w:t>
+      </w:r>
+      <w:r>
+        <w:t xml:space="preserve">. Razdvajanje</w:t>
+      </w:r>
+      <w:r>
+        <w:t xml:space="preserve"> </w:t>
+      </w:r>
+      <w:r>
+        <w:t xml:space="preserve">dužnosti, odnosno RBAC2, ne postoji, i to odsustvo je strukturno, jer uloga i nalog dele isti tip</w:t>
+      </w:r>
+      <w:r>
+        <w:t xml:space="preserve"> </w:t>
+      </w:r>
+      <w:r>
+        <w:t xml:space="preserve">objekta, pa ograničenje nema na šta da se veže</w:t>
+      </w:r>
+      <w:r>
+        <w:t xml:space="preserve"> </w:t>
+      </w:r>
+      <w:r>
+        <w:t xml:space="preserve">[3]</w:t>
+      </w:r>
+      <w:r>
+        <w:t xml:space="preserve">. Bezbednosti na nivou reda, kakvu</w:t>
+      </w:r>
+      <w:r>
+        <w:t xml:space="preserve"> </w:t>
+      </w:r>
+      <w:r>
+        <w:t xml:space="preserve">PostgreSQL sprovodi naredbom</w:t>
+      </w:r>
+      <w:r>
+        <w:t xml:space="preserve"> </w:t>
+      </w:r>
+      <w:r>
+        <w:rPr>
+          <w:rStyle w:val="VerbatimChar"/>
+        </w:rPr>
+        <w:t xml:space="preserve">CREATE POLICY</w:t>
+      </w:r>
+      <w:r>
+        <w:t xml:space="preserve">, a Oracle mehanizmom Virtual Private Database, nema kao</w:t>
+      </w:r>
+      <w:r>
+        <w:t xml:space="preserve"> </w:t>
+      </w:r>
+      <w:r>
+        <w:t xml:space="preserve">tačke sprovođenja unutar obrade upita, nego samo kao obrasca koji se dopisuje spolja</w:t>
+      </w:r>
+      <w:r>
+        <w:t xml:space="preserve"> </w:t>
+      </w:r>
+      <w:r>
+        <w:t xml:space="preserve">[9], [10]</w:t>
+      </w:r>
+      <w:r>
+        <w:t xml:space="preserve">. Pripisivost u evidentiranju pristupa izostaje jer efektivni</w:t>
+      </w:r>
+      <w:r>
+        <w:t xml:space="preserve"> </w:t>
+      </w:r>
+      <w:r>
+        <w:t xml:space="preserve">identitet, pod kojim je naredba stvarno izvršena, nikada ne napušta server kao zasebna vrednost</w:t>
+      </w:r>
+      <w:r>
+        <w:t xml:space="preserve"> </w:t>
+      </w:r>
+      <w:r>
+        <w:t xml:space="preserve">zapisa, pa slobodno dostupni instrumenti ne zadovoljavaju kriterijume evidencionog traga</w:t>
+      </w:r>
+      <w:r>
+        <w:t xml:space="preserve"> </w:t>
+      </w:r>
+      <w:r>
+        <w:t xml:space="preserve">[11]</w:t>
+      </w:r>
+      <w:r>
+        <w:t xml:space="preserve">. Izolacija tenanta u pool obrascu, najzad, ne slabi, nego potpuno izlazi iz nadležnosti</w:t>
+      </w:r>
+      <w:r>
+        <w:t xml:space="preserve"> </w:t>
+      </w:r>
+      <w:r>
+        <w:t xml:space="preserve">baze podataka.</w:t>
+      </w:r>
+    </w:p>
+    <w:p>
+      <w:pPr>
+        <w:pStyle w:val="BodyText"/>
+      </w:pPr>
+      <w:r>
+        <w:t xml:space="preserve">Poređenje tih odsustava daje im zajednički uzrok, i to je glavni nalaz ovog rada. Rečnik MySQL-ovog</w:t>
+      </w:r>
+      <w:r>
+        <w:t xml:space="preserve"> </w:t>
+      </w:r>
+      <w:r>
+        <w:t xml:space="preserve">modela ima samo tri koordinate: subjekat je imenovani red u tabeli</w:t>
+      </w:r>
+      <w:r>
+        <w:t xml:space="preserve"> </w:t>
+      </w:r>
+      <w:r>
+        <w:rPr>
+          <w:rStyle w:val="VerbatimChar"/>
+        </w:rPr>
+        <w:t xml:space="preserve">mysql.user</w:t>
+      </w:r>
+      <w:r>
+        <w:t xml:space="preserve">, objekat je imenovani</w:t>
+      </w:r>
+      <w:r>
+        <w:t xml:space="preserve"> </w:t>
+      </w:r>
+      <w:r>
+        <w:t xml:space="preserve">objekat koji se navodi u naredbi</w:t>
+      </w:r>
+      <w:r>
+        <w:t xml:space="preserve"> </w:t>
+      </w:r>
+      <w:r>
+        <w:rPr>
+          <w:rStyle w:val="VerbatimChar"/>
+        </w:rPr>
+        <w:t xml:space="preserve">GRANT</w:t>
+      </w:r>
+      <w:r>
+        <w:t xml:space="preserve">, a operacija je privilegija iz unapred određenog skupa</w:t>
+      </w:r>
+      <w:r>
+        <w:t xml:space="preserve"> </w:t>
+      </w:r>
+      <w:r>
+        <w:t xml:space="preserve">[2]</w:t>
+      </w:r>
+      <w:r>
+        <w:t xml:space="preserve">. Svako pojedinačno odsustvo utvrđeno u ovom radu jeste pravilo koje se u tom rečniku</w:t>
+      </w:r>
+      <w:r>
+        <w:t xml:space="preserve"> </w:t>
+      </w:r>
+      <w:r>
+        <w:t xml:space="preserve">ne može zapisati: klasa sigurnosti subjekta i objekta u drugom poglavlju, ograničenje nad parom uloga</w:t>
+      </w:r>
+      <w:r>
+        <w:t xml:space="preserve"> </w:t>
+      </w:r>
+      <w:r>
+        <w:t xml:space="preserve">u trećem, predikat nad pojedinačnim redom u četvrtom, oblik same naredbe u petom, efektivni identitet</w:t>
+      </w:r>
+      <w:r>
+        <w:t xml:space="preserve"> </w:t>
+      </w:r>
+      <w:r>
+        <w:t xml:space="preserve">u zapisu u šestom i tenant kao koordinata u sedmom. Odatle sledi i drugi obrazac, ponovljen u više</w:t>
+      </w:r>
+      <w:r>
+        <w:t xml:space="preserve"> </w:t>
+      </w:r>
+      <w:r>
+        <w:t xml:space="preserve">poglavlja: kada model ne ume da izrazi pravilo, MySQL ne proširuje šemu dodele prava, nego pravilo</w:t>
+      </w:r>
+      <w:r>
+        <w:t xml:space="preserve"> </w:t>
+      </w:r>
+      <w:r>
+        <w:t xml:space="preserve">dopisuje van nje, u telo pogleda, u proceduru ili u aplikaciju, čime tačka sprovođenja prelazi sa</w:t>
+      </w:r>
+      <w:r>
+        <w:t xml:space="preserve"> </w:t>
+      </w:r>
+      <w:r>
+        <w:t xml:space="preserve">jezgra servera na disciplinu onoga ko je to telo napisao.</w:t>
+      </w:r>
+    </w:p>
+    <w:p>
+      <w:pPr>
+        <w:pStyle w:val="BodyText"/>
+      </w:pPr>
+      <w:r>
+        <w:t xml:space="preserve">Praktična posledica formuliše se kroz princip najmanjih privilegija, nit koja povezuje čitav rad</w:t>
+      </w:r>
+      <w:r>
+        <w:t xml:space="preserve"> </w:t>
+      </w:r>
+      <w:r>
+        <w:t xml:space="preserve">[7]</w:t>
+      </w:r>
+      <w:r>
+        <w:t xml:space="preserve">. Pošto se nivoi dodele prava sastavljaju logičkim</w:t>
+      </w:r>
+      <w:r>
+        <w:t xml:space="preserve"> </w:t>
+      </w:r>
+      <w:r>
+        <w:rPr>
+          <w:rStyle w:val="VerbatimChar"/>
+        </w:rPr>
+        <w:t xml:space="preserve">OR</w:t>
+      </w:r>
+      <w:r>
+        <w:t xml:space="preserve"> </w:t>
+      </w:r>
+      <w:r>
+        <w:t xml:space="preserve">operatorom, uža dodela</w:t>
+      </w:r>
+      <w:r>
+        <w:t xml:space="preserve"> </w:t>
+      </w:r>
+      <w:r>
+        <w:t xml:space="preserve">nikada ne sužava širu, pa se domašaj naloga određuje pri projektovanju, izborom toga koliko objekata</w:t>
+      </w:r>
+      <w:r>
+        <w:t xml:space="preserve"> </w:t>
+      </w:r>
+      <w:r>
+        <w:t xml:space="preserve">jedno ime uopšte sme da dohvati, i naknadnim dodelama se ne ispravlja</w:t>
+      </w:r>
+      <w:r>
+        <w:t xml:space="preserve"> </w:t>
+      </w:r>
+      <w:r>
+        <w:t xml:space="preserve">[2]</w:t>
+      </w:r>
+      <w:r>
+        <w:t xml:space="preserve">. Za onoga ko</w:t>
+      </w:r>
+      <w:r>
+        <w:t xml:space="preserve"> </w:t>
+      </w:r>
+      <w:r>
+        <w:t xml:space="preserve">projektuje bezbednost nad MySQL bazom zaključak nije da je sistem slab, nego da je precizno ograničen:</w:t>
+      </w:r>
+      <w:r>
+        <w:t xml:space="preserve"> </w:t>
+      </w:r>
+      <w:r>
+        <w:t xml:space="preserve">sve što se izražava kao par imenovanog subjekta i imenovanog objekta server sprovodi pouzdano i sam,</w:t>
+      </w:r>
+      <w:r>
+        <w:t xml:space="preserve"> </w:t>
+      </w:r>
+      <w:r>
+        <w:t xml:space="preserve">dok se sve ostalo mora svesno prepustiti sloju izvan baze, uz puno znanje o tome šta se time gubi.</w:t>
+      </w:r>
+      <w:r>
+        <w:t xml:space="preserve"> </w:t>
+      </w:r>
+      <w:r>
+        <w:t xml:space="preserve">Mehanizmi dostupni isključivo u komercijalnom izdanju, pre svih MySQL Enterprise Audit i Enterprise</w:t>
+      </w:r>
+      <w:r>
+        <w:t xml:space="preserve"> </w:t>
+      </w:r>
+      <w:r>
+        <w:t xml:space="preserve">Firewall, u ovom radu su obrađeni samo teorijski i predstavljaju prirodan pravac daljeg rada, kao i</w:t>
+      </w:r>
+      <w:r>
+        <w:t xml:space="preserve"> </w:t>
+      </w:r>
+      <w:r>
+        <w:t xml:space="preserve">poređenje sa sistemima koji navedene tačke sprovođenja imaju ugrađene</w:t>
+      </w:r>
+      <w:r>
+        <w:t xml:space="preserve"> </w:t>
+      </w:r>
+      <w:r>
+        <w:t xml:space="preserve">[2]</w:t>
+      </w:r>
+      <w:r>
+        <w:t xml:space="preserve">.</w:t>
+      </w:r>
+    </w:p>
+    <w:bookmarkStart w:id="68" w:name="refs"/>
+    <w:bookmarkStart w:id="42" w:name="ref-ramakrishnan2003"/>
     <w:p>
       <w:pPr>
         <w:pStyle w:val="Bibliography"/>
@@ -9171,8 +9647,8 @@
         <w:t xml:space="preserve">, 3rd ed. New York, NY, USA: McGraw-Hill, 2003.</w:t>
       </w:r>
     </w:p>
-    <w:bookmarkEnd w:id="41"/>
-    <w:bookmarkStart w:id="43" w:name="ref-mysql84refman"/>
+    <w:bookmarkEnd w:id="42"/>
+    <w:bookmarkStart w:id="44" w:name="ref-mysql84refman"/>
     <w:p>
       <w:pPr>
         <w:pStyle w:val="Bibliography"/>
@@ -9207,7 +9683,7 @@
       <w:r>
         <w:t xml:space="preserve"> </w:t>
       </w:r>
-      <w:hyperlink r:id="rId42">
+      <w:hyperlink r:id="rId43">
         <w:r>
           <w:rPr>
             <w:rStyle w:val="Hyperlink"/>
@@ -9219,8 +9695,8 @@
         <w:t xml:space="preserve">, 2024.</w:t>
       </w:r>
     </w:p>
-    <w:bookmarkEnd w:id="43"/>
-    <w:bookmarkStart w:id="45" w:name="ref-sandhu1996"/>
+    <w:bookmarkEnd w:id="44"/>
+    <w:bookmarkStart w:id="46" w:name="ref-sandhu1996"/>
     <w:p>
       <w:pPr>
         <w:pStyle w:val="Bibliography"/>
@@ -9259,7 +9735,7 @@
       <w:r>
         <w:t xml:space="preserve"> </w:t>
       </w:r>
-      <w:hyperlink r:id="rId44">
+      <w:hyperlink r:id="rId45">
         <w:r>
           <w:rPr>
             <w:rStyle w:val="Hyperlink"/>
@@ -9271,8 +9747,8 @@
         <w:t xml:space="preserve">.</w:t>
       </w:r>
     </w:p>
-    <w:bookmarkEnd w:id="45"/>
-    <w:bookmarkStart w:id="46" w:name="ref-bell1973"/>
+    <w:bookmarkEnd w:id="46"/>
+    <w:bookmarkStart w:id="47" w:name="ref-bell1973"/>
     <w:p>
       <w:pPr>
         <w:pStyle w:val="Bibliography"/>
@@ -9302,8 +9778,8 @@
         <w:t xml:space="preserve">The MITRE Corporation, Bedford, MA, USA, MTR-2547, Vol. I, 1973.</w:t>
       </w:r>
     </w:p>
-    <w:bookmarkEnd w:id="46"/>
-    <w:bookmarkStart w:id="47" w:name="ref-ferraiolokuhn1992"/>
+    <w:bookmarkEnd w:id="47"/>
+    <w:bookmarkStart w:id="48" w:name="ref-ferraiolokuhn1992"/>
     <w:p>
       <w:pPr>
         <w:pStyle w:val="Bibliography"/>
@@ -9346,8 +9822,8 @@
         <w:t xml:space="preserve">, Baltimore, MD, USA, 1992, pp. 554–563.</w:t>
       </w:r>
     </w:p>
-    <w:bookmarkEnd w:id="47"/>
-    <w:bookmarkStart w:id="48" w:name="ref-incits2004"/>
+    <w:bookmarkEnd w:id="48"/>
+    <w:bookmarkStart w:id="49" w:name="ref-incits2004"/>
     <w:p>
       <w:pPr>
         <w:pStyle w:val="Bibliography"/>
@@ -9386,8 +9862,8 @@
         <w:t xml:space="preserve">ANSI/INCITS Standard, 2004.</w:t>
       </w:r>
     </w:p>
-    <w:bookmarkEnd w:id="48"/>
-    <w:bookmarkStart w:id="50" w:name="ref-saltzerschroeder1975"/>
+    <w:bookmarkEnd w:id="49"/>
+    <w:bookmarkStart w:id="51" w:name="ref-saltzerschroeder1975"/>
     <w:p>
       <w:pPr>
         <w:pStyle w:val="Bibliography"/>
@@ -9426,7 +9902,7 @@
       <w:r>
         <w:t xml:space="preserve"> </w:t>
       </w:r>
-      <w:hyperlink r:id="rId49">
+      <w:hyperlink r:id="rId50">
         <w:r>
           <w:rPr>
             <w:rStyle w:val="Hyperlink"/>
@@ -9438,8 +9914,8 @@
         <w:t xml:space="preserve">.</w:t>
       </w:r>
     </w:p>
-    <w:bookmarkEnd w:id="50"/>
-    <w:bookmarkStart w:id="52" w:name="ref-mysqlbug41354"/>
+    <w:bookmarkEnd w:id="51"/>
+    <w:bookmarkStart w:id="53" w:name="ref-mysqlbug41354"/>
     <w:p>
       <w:pPr>
         <w:pStyle w:val="Bibliography"/>
@@ -9486,7 +9962,7 @@
       <w:r>
         <w:t xml:space="preserve"> </w:t>
       </w:r>
-      <w:hyperlink r:id="rId51">
+      <w:hyperlink r:id="rId52">
         <w:r>
           <w:rPr>
             <w:rStyle w:val="Hyperlink"/>
@@ -9498,8 +9974,8 @@
         <w:t xml:space="preserve">, 2009.</w:t>
       </w:r>
     </w:p>
-    <w:bookmarkEnd w:id="52"/>
-    <w:bookmarkStart w:id="54" w:name="ref-postgresrls2024"/>
+    <w:bookmarkEnd w:id="53"/>
+    <w:bookmarkStart w:id="55" w:name="ref-postgresrls2024"/>
     <w:p>
       <w:pPr>
         <w:pStyle w:val="Bibliography"/>
@@ -9534,7 +10010,7 @@
       <w:r>
         <w:t xml:space="preserve"> </w:t>
       </w:r>
-      <w:hyperlink r:id="rId53">
+      <w:hyperlink r:id="rId54">
         <w:r>
           <w:rPr>
             <w:rStyle w:val="Hyperlink"/>
@@ -9546,8 +10022,8 @@
         <w:t xml:space="preserve">, 2024.</w:t>
       </w:r>
     </w:p>
-    <w:bookmarkEnd w:id="54"/>
-    <w:bookmarkStart w:id="56" w:name="ref-oraclevpd2024"/>
+    <w:bookmarkEnd w:id="55"/>
+    <w:bookmarkStart w:id="57" w:name="ref-oraclevpd2024"/>
     <w:p>
       <w:pPr>
         <w:pStyle w:val="Bibliography"/>
@@ -9600,7 +10076,7 @@
       <w:r>
         <w:t xml:space="preserve"> </w:t>
       </w:r>
-      <w:hyperlink r:id="rId55">
+      <w:hyperlink r:id="rId56">
         <w:r>
           <w:rPr>
             <w:rStyle w:val="Hyperlink"/>
@@ -9612,8 +10088,8 @@
         <w:t xml:space="preserve">, 2024.</w:t>
       </w:r>
     </w:p>
-    <w:bookmarkEnd w:id="56"/>
-    <w:bookmarkStart w:id="58" w:name="ref-nistsp80092"/>
+    <w:bookmarkEnd w:id="57"/>
+    <w:bookmarkStart w:id="59" w:name="ref-nistsp80092"/>
     <w:p>
       <w:pPr>
         <w:pStyle w:val="Bibliography"/>
@@ -9645,7 +10121,7 @@
       <w:r>
         <w:t xml:space="preserve"> </w:t>
       </w:r>
-      <w:hyperlink r:id="rId57">
+      <w:hyperlink r:id="rId58">
         <w:r>
           <w:rPr>
             <w:rStyle w:val="Hyperlink"/>
@@ -9657,8 +10133,8 @@
         <w:t xml:space="preserve">.</w:t>
       </w:r>
     </w:p>
-    <w:bookmarkEnd w:id="58"/>
-    <w:bookmarkStart w:id="60" w:name="ref-nistsp80053r5"/>
+    <w:bookmarkEnd w:id="59"/>
+    <w:bookmarkStart w:id="61" w:name="ref-nistsp80053r5"/>
     <w:p>
       <w:pPr>
         <w:pStyle w:val="Bibliography"/>
@@ -9690,7 +10166,7 @@
       <w:r>
         <w:t xml:space="preserve"> </w:t>
       </w:r>
-      <w:hyperlink r:id="rId59">
+      <w:hyperlink r:id="rId60">
         <w:r>
           <w:rPr>
             <w:rStyle w:val="Hyperlink"/>
@@ -9702,8 +10178,8 @@
         <w:t xml:space="preserve">.</w:t>
       </w:r>
     </w:p>
-    <w:bookmarkEnd w:id="60"/>
-    <w:bookmarkStart w:id="62" w:name="ref-pcidss2022"/>
+    <w:bookmarkEnd w:id="61"/>
+    <w:bookmarkStart w:id="63" w:name="ref-pcidss2022"/>
     <w:p>
       <w:pPr>
         <w:pStyle w:val="Bibliography"/>
@@ -9729,7 +10205,7 @@
       <w:r>
         <w:t xml:space="preserve"> </w:t>
       </w:r>
-      <w:hyperlink r:id="rId61">
+      <w:hyperlink r:id="rId62">
         <w:r>
           <w:rPr>
             <w:rStyle w:val="Hyperlink"/>
@@ -9741,8 +10217,8 @@
         <w:t xml:space="preserve">, 2022.</w:t>
       </w:r>
     </w:p>
-    <w:bookmarkEnd w:id="62"/>
-    <w:bookmarkStart w:id="64" w:name="ref-awssaaslens"/>
+    <w:bookmarkEnd w:id="63"/>
+    <w:bookmarkStart w:id="65" w:name="ref-awssaaslens"/>
     <w:p>
       <w:pPr>
         <w:pStyle w:val="Bibliography"/>
@@ -9768,7 +10244,7 @@
       <w:r>
         <w:t xml:space="preserve"> </w:t>
       </w:r>
-      <w:hyperlink r:id="rId63">
+      <w:hyperlink r:id="rId64">
         <w:r>
           <w:rPr>
             <w:rStyle w:val="Hyperlink"/>
@@ -9780,8 +10256,8 @@
         <w:t xml:space="preserve">, 2024.</w:t>
       </w:r>
     </w:p>
-    <w:bookmarkEnd w:id="64"/>
-    <w:bookmarkStart w:id="66" w:name="ref-azuretenancy"/>
+    <w:bookmarkEnd w:id="65"/>
+    <w:bookmarkStart w:id="67" w:name="ref-azuretenancy"/>
     <w:p>
       <w:pPr>
         <w:pStyle w:val="Bibliography"/>
@@ -9837,7 +10313,7 @@
       <w:r>
         <w:t xml:space="preserve"> </w:t>
       </w:r>
-      <w:hyperlink r:id="rId65">
+      <w:hyperlink r:id="rId66">
         <w:r>
           <w:rPr>
             <w:rStyle w:val="Hyperlink"/>
@@ -9849,9 +10325,9 @@
         <w:t xml:space="preserve">, 2024.</w:t>
       </w:r>
     </w:p>
-    <w:bookmarkEnd w:id="66"/>
     <w:bookmarkEnd w:id="67"/>
     <w:bookmarkEnd w:id="68"/>
+    <w:bookmarkEnd w:id="69"/>
     <w:sectPr>
       <w:pgSz w:h="16838" w:w="11906"/>
       <w:pgMar w:bottom="1417" w:footer="708" w:gutter="0" w:header="708" w:left="1417" w:right="1417" w:top="1417"/>

</xml_diff>